<commit_message>
Nuevas modificaciones en el TPI
</commit_message>
<xml_diff>
--- a/TP1 Matemáticas y Programacion.docx
+++ b/TP1 Matemáticas y Programacion.docx
@@ -305,7 +305,31 @@
       </w:r>
       <w:proofErr w:type="spellStart"/>
       <w:r>
-        <w:t>vector_A,vector_B,largo_vector_A,largo_vector_B</w:t>
+        <w:t>vector_</w:t>
+      </w:r>
+      <w:proofErr w:type="gramStart"/>
+      <w:r>
+        <w:t>A,vector</w:t>
+      </w:r>
+      <w:proofErr w:type="gramEnd"/>
+      <w:r>
+        <w:t>_</w:t>
+      </w:r>
+      <w:proofErr w:type="gramStart"/>
+      <w:r>
+        <w:t>B,largo</w:t>
+      </w:r>
+      <w:proofErr w:type="gramEnd"/>
+      <w:r>
+        <w:t>_vector_</w:t>
+      </w:r>
+      <w:proofErr w:type="gramStart"/>
+      <w:r>
+        <w:t>A,largo</w:t>
+      </w:r>
+      <w:proofErr w:type="gramEnd"/>
+      <w:r>
+        <w:t>_vector_B</w:t>
       </w:r>
       <w:proofErr w:type="spellEnd"/>
       <w:r>
@@ -322,9 +346,14 @@
       </w:r>
       <w:proofErr w:type="spellEnd"/>
       <w:r>
-        <w:t xml:space="preserve"> = []*</w:t>
+        <w:t xml:space="preserve"> = </w:t>
+      </w:r>
+      <w:proofErr w:type="gramStart"/>
+      <w:r>
+        <w:t>[]*</w:t>
       </w:r>
       <w:proofErr w:type="spellStart"/>
+      <w:proofErr w:type="gramEnd"/>
       <w:r>
         <w:t>largo_vector_A+largo_vector_B</w:t>
       </w:r>
@@ -345,13 +374,18 @@
     </w:p>
     <w:p>
       <w:r>
-        <w:t xml:space="preserve">    for  </w:t>
+        <w:t xml:space="preserve">    </w:t>
+      </w:r>
+      <w:proofErr w:type="gramStart"/>
+      <w:r>
+        <w:t xml:space="preserve">for  </w:t>
       </w:r>
       <w:proofErr w:type="spellStart"/>
       <w:r>
         <w:t>i</w:t>
       </w:r>
       <w:proofErr w:type="spellEnd"/>
+      <w:proofErr w:type="gramEnd"/>
       <w:r>
         <w:t xml:space="preserve"> in range(</w:t>
       </w:r>
@@ -498,7 +532,23 @@
     <w:p/>
     <w:p>
       <w:r>
-        <w:t>def usuario_en_vector(vector_objetivo,usuario_objetivo,largo_vector):</w:t>
+        <w:t>def usuario_en_vector(vector_</w:t>
+      </w:r>
+      <w:proofErr w:type="gramStart"/>
+      <w:r>
+        <w:t>objetivo,usuario</w:t>
+      </w:r>
+      <w:proofErr w:type="gramEnd"/>
+      <w:r>
+        <w:t>_</w:t>
+      </w:r>
+      <w:proofErr w:type="gramStart"/>
+      <w:r>
+        <w:t>objetivo,largo</w:t>
+      </w:r>
+      <w:proofErr w:type="gramEnd"/>
+      <w:r>
+        <w:t>_vector):</w:t>
       </w:r>
     </w:p>
     <w:p>
@@ -548,13 +598,34 @@
       </w:r>
     </w:p>
     <w:p>
-      <w:r>
-        <w:t>print("A U B = " ,end= " ")</w:t>
-      </w:r>
-    </w:p>
-    <w:p>
-      <w:r>
-        <w:t>for usuario in range(LARGO_A):</w:t>
+      <w:proofErr w:type="gramStart"/>
+      <w:r>
+        <w:t>print(</w:t>
+      </w:r>
+      <w:proofErr w:type="gramEnd"/>
+      <w:r>
+        <w:t xml:space="preserve">"A U B = </w:t>
+      </w:r>
+      <w:proofErr w:type="gramStart"/>
+      <w:r>
+        <w:t>" ,end</w:t>
+      </w:r>
+      <w:proofErr w:type="gramEnd"/>
+      <w:r>
+        <w:t>= " ")</w:t>
+      </w:r>
+    </w:p>
+    <w:p>
+      <w:r>
+        <w:t xml:space="preserve">for usuario in </w:t>
+      </w:r>
+      <w:proofErr w:type="gramStart"/>
+      <w:r>
+        <w:t>range(</w:t>
+      </w:r>
+      <w:proofErr w:type="gramEnd"/>
+      <w:r>
+        <w:t>LARGO_A):</w:t>
       </w:r>
     </w:p>
     <w:p>
@@ -567,7 +638,23 @@
       </w:r>
       <w:proofErr w:type="spellEnd"/>
       <w:r>
-        <w:t>(B,A[usuario],LARGO_B):</w:t>
+        <w:t>(</w:t>
+      </w:r>
+      <w:proofErr w:type="gramStart"/>
+      <w:r>
+        <w:t>B,A</w:t>
+      </w:r>
+      <w:proofErr w:type="gramEnd"/>
+      <w:r>
+        <w:t>[usuario</w:t>
+      </w:r>
+      <w:proofErr w:type="gramStart"/>
+      <w:r>
+        <w:t>],LARGO</w:t>
+      </w:r>
+      <w:proofErr w:type="gramEnd"/>
+      <w:r>
+        <w:t>_B):</w:t>
       </w:r>
     </w:p>
     <w:p>
@@ -582,8 +669,13 @@
       </w:r>
     </w:p>
     <w:p>
-      <w:r>
-        <w:t xml:space="preserve">print("\n x </w:t>
+      <w:proofErr w:type="gramStart"/>
+      <w:r>
+        <w:t>print(</w:t>
+      </w:r>
+      <w:proofErr w:type="gramEnd"/>
+      <w:r>
+        <w:t xml:space="preserve">"\n x </w:t>
       </w:r>
       <w:r>
         <w:rPr>
@@ -610,12 +702,28 @@
         <w:t>∈</w:t>
       </w:r>
       <w:r>
-        <w:t xml:space="preserve"> B = " ,end = " ")</w:t>
-      </w:r>
-    </w:p>
-    <w:p>
-      <w:r>
-        <w:t>for usuario in range(LARGO_A):</w:t>
+        <w:t xml:space="preserve"> B = </w:t>
+      </w:r>
+      <w:proofErr w:type="gramStart"/>
+      <w:r>
+        <w:t>" ,end</w:t>
+      </w:r>
+      <w:proofErr w:type="gramEnd"/>
+      <w:r>
+        <w:t xml:space="preserve"> = " ")</w:t>
+      </w:r>
+    </w:p>
+    <w:p>
+      <w:r>
+        <w:t xml:space="preserve">for usuario in </w:t>
+      </w:r>
+      <w:proofErr w:type="gramStart"/>
+      <w:r>
+        <w:t>range(</w:t>
+      </w:r>
+      <w:proofErr w:type="gramEnd"/>
+      <w:r>
+        <w:t>LARGO_A):</w:t>
       </w:r>
     </w:p>
     <w:p>
@@ -625,13 +733,26 @@
     </w:p>
     <w:p>
       <w:r>
-        <w:t>for usuario in range(LARGO_B):</w:t>
-      </w:r>
-    </w:p>
-    <w:p>
-      <w:r>
-        <w:t xml:space="preserve">  print (B[usuario], end=" " )</w:t>
-      </w:r>
+        <w:t xml:space="preserve">for usuario in </w:t>
+      </w:r>
+      <w:proofErr w:type="gramStart"/>
+      <w:r>
+        <w:t>range(</w:t>
+      </w:r>
+      <w:proofErr w:type="gramEnd"/>
+      <w:r>
+        <w:t>LARGO_B):</w:t>
+      </w:r>
+    </w:p>
+    <w:p>
+      <w:r>
+        <w:t xml:space="preserve">  print (B[usuario], end=" </w:t>
+      </w:r>
+      <w:proofErr w:type="gramStart"/>
+      <w:r>
+        <w:t>" )</w:t>
+      </w:r>
+      <w:proofErr w:type="gramEnd"/>
     </w:p>
     <w:p/>
     <w:p>
@@ -640,8 +761,13 @@
       </w:r>
     </w:p>
     <w:p>
-      <w:r>
-        <w:t>print("\</w:t>
+      <w:proofErr w:type="gramStart"/>
+      <w:r>
+        <w:t>print(</w:t>
+      </w:r>
+      <w:proofErr w:type="gramEnd"/>
+      <w:r>
+        <w:t>"\</w:t>
       </w:r>
       <w:proofErr w:type="spellStart"/>
       <w:r>
@@ -654,7 +780,15 @@
     </w:p>
     <w:p>
       <w:r>
-        <w:t>for usuario in range(LARGO_C):</w:t>
+        <w:t xml:space="preserve">for usuario in </w:t>
+      </w:r>
+      <w:proofErr w:type="gramStart"/>
+      <w:r>
+        <w:t>range(</w:t>
+      </w:r>
+      <w:proofErr w:type="gramEnd"/>
+      <w:r>
+        <w:t>LARGO_C):</w:t>
       </w:r>
     </w:p>
     <w:p>
@@ -667,7 +801,23 @@
       </w:r>
       <w:proofErr w:type="spellEnd"/>
       <w:r>
-        <w:t>(A,C[usuario],LARGO_A):</w:t>
+        <w:t>(</w:t>
+      </w:r>
+      <w:proofErr w:type="gramStart"/>
+      <w:r>
+        <w:t>A,C</w:t>
+      </w:r>
+      <w:proofErr w:type="gramEnd"/>
+      <w:r>
+        <w:t>[usuario</w:t>
+      </w:r>
+      <w:proofErr w:type="gramStart"/>
+      <w:r>
+        <w:t>],LARGO</w:t>
+      </w:r>
+      <w:proofErr w:type="gramEnd"/>
+      <w:r>
+        <w:t>_A):</w:t>
       </w:r>
     </w:p>
     <w:p>
@@ -677,7 +827,15 @@
     </w:p>
     <w:p>
       <w:r>
-        <w:t>for usuario in range(LARGO_B):</w:t>
+        <w:t xml:space="preserve">for usuario in </w:t>
+      </w:r>
+      <w:proofErr w:type="gramStart"/>
+      <w:r>
+        <w:t>range(</w:t>
+      </w:r>
+      <w:proofErr w:type="gramEnd"/>
+      <w:r>
+        <w:t>LARGO_B):</w:t>
       </w:r>
     </w:p>
     <w:p>
@@ -690,7 +848,23 @@
       </w:r>
       <w:proofErr w:type="spellEnd"/>
       <w:r>
-        <w:t>(B,B[usuario],LARGO_B):</w:t>
+        <w:t>(</w:t>
+      </w:r>
+      <w:proofErr w:type="gramStart"/>
+      <w:r>
+        <w:t>B,B</w:t>
+      </w:r>
+      <w:proofErr w:type="gramEnd"/>
+      <w:r>
+        <w:t>[usuario</w:t>
+      </w:r>
+      <w:proofErr w:type="gramStart"/>
+      <w:r>
+        <w:t>],LARGO</w:t>
+      </w:r>
+      <w:proofErr w:type="gramEnd"/>
+      <w:r>
+        <w:t>_B):</w:t>
       </w:r>
     </w:p>
     <w:p>
@@ -711,7 +885,15 @@
     </w:p>
     <w:p>
       <w:r>
-        <w:t>for usuario in range(LARGO_A):</w:t>
+        <w:t xml:space="preserve">for usuario in </w:t>
+      </w:r>
+      <w:proofErr w:type="gramStart"/>
+      <w:r>
+        <w:t>range(</w:t>
+      </w:r>
+      <w:proofErr w:type="gramEnd"/>
+      <w:r>
+        <w:t>LARGO_A):</w:t>
       </w:r>
     </w:p>
     <w:p>
@@ -740,8 +922,21 @@
         <w:t>(</w:t>
       </w:r>
       <w:proofErr w:type="spellStart"/>
-      <w:r>
-        <w:t>B,usuario_objetivo,LARGO_B</w:t>
+      <w:proofErr w:type="gramStart"/>
+      <w:r>
+        <w:t>B,usuario</w:t>
+      </w:r>
+      <w:proofErr w:type="gramEnd"/>
+      <w:r>
+        <w:t>_</w:t>
+      </w:r>
+      <w:proofErr w:type="gramStart"/>
+      <w:r>
+        <w:t>objetivo,LARGO</w:t>
+      </w:r>
+      <w:proofErr w:type="gramEnd"/>
+      <w:r>
+        <w:t>_B</w:t>
       </w:r>
       <w:proofErr w:type="spellEnd"/>
       <w:r>
@@ -755,7 +950,15 @@
     </w:p>
     <w:p>
       <w:r>
-        <w:t>for usuario in range(LARGO_B):</w:t>
+        <w:t xml:space="preserve">for usuario in </w:t>
+      </w:r>
+      <w:proofErr w:type="gramStart"/>
+      <w:r>
+        <w:t>range(</w:t>
+      </w:r>
+      <w:proofErr w:type="gramEnd"/>
+      <w:r>
+        <w:t>LARGO_B):</w:t>
       </w:r>
     </w:p>
     <w:p>
@@ -785,8 +988,21 @@
         <w:t>(</w:t>
       </w:r>
       <w:proofErr w:type="spellStart"/>
-      <w:r>
-        <w:t>A,usuario_objetivo,LARGO_A</w:t>
+      <w:proofErr w:type="gramStart"/>
+      <w:r>
+        <w:t>A,usuario</w:t>
+      </w:r>
+      <w:proofErr w:type="gramEnd"/>
+      <w:r>
+        <w:t>_</w:t>
+      </w:r>
+      <w:proofErr w:type="gramStart"/>
+      <w:r>
+        <w:t>objetivo,LARGO</w:t>
+      </w:r>
+      <w:proofErr w:type="gramEnd"/>
+      <w:r>
+        <w:t>_A</w:t>
       </w:r>
       <w:proofErr w:type="spellEnd"/>
       <w:r>
@@ -811,9 +1027,6 @@
         <w:t>Expresar al menos dos resultados usando comprensión de conjuntos.</w:t>
       </w:r>
       <w:r>
-        <w:t xml:space="preserve"> (Respuesta señalada por flecha)</w:t>
-      </w:r>
-      <w:r>
         <w:t xml:space="preserve"> </w:t>
       </w:r>
     </w:p>
@@ -870,29 +1083,6 @@
       <w:r>
         <w:t xml:space="preserve">  </w:t>
       </w:r>
-      <w:r>
-        <w:t xml:space="preserve"> </w:t>
-      </w:r>
-      <w:r>
-        <w:rPr>
-          <w:highlight w:val="yellow"/>
-        </w:rPr>
-        <w:t>(</w:t>
-      </w:r>
-      <w:proofErr w:type="spellStart"/>
-      <w:r>
-        <w:rPr>
-          <w:highlight w:val="yellow"/>
-        </w:rPr>
-        <w:t>Correr</w:t>
-      </w:r>
-      <w:proofErr w:type="spellEnd"/>
-      <w:r>
-        <w:rPr>
-          <w:highlight w:val="yellow"/>
-        </w:rPr>
-        <w:t xml:space="preserve"> este punto donde se encuentro la respuesta)</w:t>
-      </w:r>
     </w:p>
     <w:p>
       <w:pPr>
@@ -1286,6 +1476,610 @@
           <w:sz w:val="24"/>
           <w:szCs w:val="24"/>
         </w:rPr>
+        <w:t xml:space="preserve"># </w:t>
+      </w:r>
+      <w:proofErr w:type="spellStart"/>
+      <w:r>
+        <w:rPr>
+          <w:sz w:val="24"/>
+          <w:szCs w:val="24"/>
+        </w:rPr>
+        <w:t>creo</w:t>
+      </w:r>
+      <w:proofErr w:type="spellEnd"/>
+      <w:r>
+        <w:rPr>
+          <w:sz w:val="24"/>
+          <w:szCs w:val="24"/>
+        </w:rPr>
+        <w:t xml:space="preserve"> tabla de verdad</w:t>
+      </w:r>
+      <w:r>
+        <w:rPr>
+          <w:sz w:val="24"/>
+          <w:szCs w:val="24"/>
+        </w:rPr>
+        <w:t>:</w:t>
+      </w:r>
+    </w:p>
+    <w:p>
+      <w:pPr>
+        <w:rPr>
+          <w:sz w:val="24"/>
+          <w:szCs w:val="24"/>
+        </w:rPr>
+      </w:pPr>
+      <w:r>
+        <w:rPr>
+          <w:sz w:val="24"/>
+          <w:szCs w:val="24"/>
+        </w:rPr>
+        <w:t>valores = [True, False]</w:t>
+      </w:r>
+    </w:p>
+    <w:p>
+      <w:pPr>
+        <w:rPr>
+          <w:sz w:val="24"/>
+          <w:szCs w:val="24"/>
+        </w:rPr>
+      </w:pPr>
+      <w:proofErr w:type="gramStart"/>
+      <w:r>
+        <w:rPr>
+          <w:sz w:val="24"/>
+          <w:szCs w:val="24"/>
+        </w:rPr>
+        <w:t>print(</w:t>
+      </w:r>
+      <w:proofErr w:type="gramEnd"/>
+      <w:r>
+        <w:rPr>
+          <w:sz w:val="24"/>
+          <w:szCs w:val="24"/>
+        </w:rPr>
+        <w:t>"p\</w:t>
+      </w:r>
+      <w:proofErr w:type="spellStart"/>
+      <w:r>
+        <w:rPr>
+          <w:sz w:val="24"/>
+          <w:szCs w:val="24"/>
+        </w:rPr>
+        <w:t>tq</w:t>
+      </w:r>
+      <w:proofErr w:type="spellEnd"/>
+      <w:r>
+        <w:rPr>
+          <w:sz w:val="24"/>
+          <w:szCs w:val="24"/>
+        </w:rPr>
+        <w:t>\tr\</w:t>
+      </w:r>
+      <w:proofErr w:type="spellStart"/>
+      <w:r>
+        <w:rPr>
+          <w:sz w:val="24"/>
+          <w:szCs w:val="24"/>
+        </w:rPr>
+        <w:t>tp</w:t>
+      </w:r>
+      <w:proofErr w:type="spellEnd"/>
+      <w:r>
+        <w:rPr>
+          <w:sz w:val="24"/>
+          <w:szCs w:val="24"/>
+        </w:rPr>
+        <w:t xml:space="preserve"> or q\</w:t>
+      </w:r>
+      <w:proofErr w:type="gramStart"/>
+      <w:r>
+        <w:rPr>
+          <w:sz w:val="24"/>
+          <w:szCs w:val="24"/>
+        </w:rPr>
+        <w:t>t(</w:t>
+      </w:r>
+      <w:proofErr w:type="gramEnd"/>
+      <w:r>
+        <w:rPr>
+          <w:sz w:val="24"/>
+          <w:szCs w:val="24"/>
+        </w:rPr>
+        <w:t>p or q) and r")</w:t>
+      </w:r>
+    </w:p>
+    <w:p>
+      <w:pPr>
+        <w:rPr>
+          <w:sz w:val="24"/>
+          <w:szCs w:val="24"/>
+        </w:rPr>
+      </w:pPr>
+      <w:r>
+        <w:rPr>
+          <w:sz w:val="24"/>
+          <w:szCs w:val="24"/>
+        </w:rPr>
+        <w:t>for p in valores:</w:t>
+      </w:r>
+    </w:p>
+    <w:p>
+      <w:pPr>
+        <w:rPr>
+          <w:sz w:val="24"/>
+          <w:szCs w:val="24"/>
+        </w:rPr>
+      </w:pPr>
+      <w:r>
+        <w:rPr>
+          <w:sz w:val="24"/>
+          <w:szCs w:val="24"/>
+        </w:rPr>
+        <w:t xml:space="preserve">    for q in valores:</w:t>
+      </w:r>
+    </w:p>
+    <w:p>
+      <w:pPr>
+        <w:rPr>
+          <w:sz w:val="24"/>
+          <w:szCs w:val="24"/>
+        </w:rPr>
+      </w:pPr>
+      <w:r>
+        <w:rPr>
+          <w:sz w:val="24"/>
+          <w:szCs w:val="24"/>
+        </w:rPr>
+        <w:t xml:space="preserve">        for r in valores:</w:t>
+      </w:r>
+    </w:p>
+    <w:p>
+      <w:pPr>
+        <w:rPr>
+          <w:sz w:val="24"/>
+          <w:szCs w:val="24"/>
+        </w:rPr>
+      </w:pPr>
+      <w:r>
+        <w:rPr>
+          <w:sz w:val="24"/>
+          <w:szCs w:val="24"/>
+        </w:rPr>
+        <w:t xml:space="preserve">            resultado1 = p or q</w:t>
+      </w:r>
+    </w:p>
+    <w:p>
+      <w:pPr>
+        <w:rPr>
+          <w:sz w:val="24"/>
+          <w:szCs w:val="24"/>
+        </w:rPr>
+      </w:pPr>
+      <w:r>
+        <w:rPr>
+          <w:sz w:val="24"/>
+          <w:szCs w:val="24"/>
+        </w:rPr>
+        <w:t xml:space="preserve">            resultado2 = resultado1 and r</w:t>
+      </w:r>
+    </w:p>
+    <w:p>
+      <w:pPr>
+        <w:rPr>
+          <w:sz w:val="24"/>
+          <w:szCs w:val="24"/>
+        </w:rPr>
+      </w:pPr>
+      <w:r>
+        <w:rPr>
+          <w:sz w:val="24"/>
+          <w:szCs w:val="24"/>
+        </w:rPr>
+        <w:lastRenderedPageBreak/>
+        <w:t xml:space="preserve">            </w:t>
+      </w:r>
+      <w:proofErr w:type="gramStart"/>
+      <w:r>
+        <w:rPr>
+          <w:sz w:val="24"/>
+          <w:szCs w:val="24"/>
+        </w:rPr>
+        <w:t>print(</w:t>
+      </w:r>
+      <w:proofErr w:type="gramEnd"/>
+      <w:r>
+        <w:rPr>
+          <w:sz w:val="24"/>
+          <w:szCs w:val="24"/>
+        </w:rPr>
+        <w:t>p, "\t", q, "\t", r, "\t", resultado1, "\t", resultado2)</w:t>
+      </w:r>
+    </w:p>
+    <w:p>
+      <w:pPr>
+        <w:rPr>
+          <w:sz w:val="24"/>
+          <w:szCs w:val="24"/>
+        </w:rPr>
+      </w:pPr>
+      <w:r>
+        <w:rPr>
+          <w:sz w:val="24"/>
+          <w:szCs w:val="24"/>
+        </w:rPr>
+        <w:t xml:space="preserve"># usuarios criticos y no criticos </w:t>
+      </w:r>
+    </w:p>
+    <w:p>
+      <w:pPr>
+        <w:rPr>
+          <w:sz w:val="24"/>
+          <w:szCs w:val="24"/>
+        </w:rPr>
+      </w:pPr>
+      <w:r>
+        <w:rPr>
+          <w:sz w:val="24"/>
+          <w:szCs w:val="24"/>
+        </w:rPr>
+        <w:t>A = ["a", "b"]</w:t>
+      </w:r>
+    </w:p>
+    <w:p>
+      <w:pPr>
+        <w:rPr>
+          <w:sz w:val="24"/>
+          <w:szCs w:val="24"/>
+        </w:rPr>
+      </w:pPr>
+      <w:r>
+        <w:rPr>
+          <w:sz w:val="24"/>
+          <w:szCs w:val="24"/>
+        </w:rPr>
+        <w:t>B = ["b", "c"]</w:t>
+      </w:r>
+    </w:p>
+    <w:p>
+      <w:pPr>
+        <w:rPr>
+          <w:sz w:val="24"/>
+          <w:szCs w:val="24"/>
+        </w:rPr>
+      </w:pPr>
+      <w:r>
+        <w:rPr>
+          <w:sz w:val="24"/>
+          <w:szCs w:val="24"/>
+        </w:rPr>
+        <w:t>C = ["a", "c"]</w:t>
+      </w:r>
+    </w:p>
+    <w:p>
+      <w:pPr>
+        <w:rPr>
+          <w:sz w:val="24"/>
+          <w:szCs w:val="24"/>
+        </w:rPr>
+      </w:pPr>
+      <w:r>
+        <w:rPr>
+          <w:sz w:val="24"/>
+          <w:szCs w:val="24"/>
+        </w:rPr>
+        <w:t>todos = ["a", "b", "c"]</w:t>
+      </w:r>
+    </w:p>
+    <w:p>
+      <w:pPr>
+        <w:rPr>
+          <w:sz w:val="24"/>
+          <w:szCs w:val="24"/>
+        </w:rPr>
+      </w:pPr>
+    </w:p>
+    <w:p>
+      <w:pPr>
+        <w:rPr>
+          <w:sz w:val="24"/>
+          <w:szCs w:val="24"/>
+        </w:rPr>
+      </w:pPr>
+      <w:r>
+        <w:rPr>
+          <w:sz w:val="24"/>
+          <w:szCs w:val="24"/>
+        </w:rPr>
+        <w:t>for usuario in (todos):</w:t>
+      </w:r>
+    </w:p>
+    <w:p>
+      <w:pPr>
+        <w:rPr>
+          <w:sz w:val="24"/>
+          <w:szCs w:val="24"/>
+        </w:rPr>
+      </w:pPr>
+    </w:p>
+    <w:p>
+      <w:pPr>
+        <w:rPr>
+          <w:sz w:val="24"/>
+          <w:szCs w:val="24"/>
+        </w:rPr>
+      </w:pPr>
+      <w:r>
+        <w:rPr>
+          <w:sz w:val="24"/>
+          <w:szCs w:val="24"/>
+        </w:rPr>
+        <w:t xml:space="preserve">                p = usuario in A</w:t>
+      </w:r>
+    </w:p>
+    <w:p>
+      <w:pPr>
+        <w:rPr>
+          <w:sz w:val="24"/>
+          <w:szCs w:val="24"/>
+        </w:rPr>
+      </w:pPr>
+      <w:r>
+        <w:rPr>
+          <w:sz w:val="24"/>
+          <w:szCs w:val="24"/>
+        </w:rPr>
+        <w:t xml:space="preserve">                q = usuario in B</w:t>
+      </w:r>
+    </w:p>
+    <w:p>
+      <w:pPr>
+        <w:rPr>
+          <w:sz w:val="24"/>
+          <w:szCs w:val="24"/>
+        </w:rPr>
+      </w:pPr>
+      <w:r>
+        <w:rPr>
+          <w:sz w:val="24"/>
+          <w:szCs w:val="24"/>
+        </w:rPr>
+        <w:t xml:space="preserve">                r = usuario in C</w:t>
+      </w:r>
+    </w:p>
+    <w:p>
+      <w:pPr>
+        <w:rPr>
+          <w:sz w:val="24"/>
+          <w:szCs w:val="24"/>
+        </w:rPr>
+      </w:pPr>
+    </w:p>
+    <w:p>
+      <w:pPr>
+        <w:rPr>
+          <w:sz w:val="24"/>
+          <w:szCs w:val="24"/>
+        </w:rPr>
+      </w:pPr>
+      <w:r>
+        <w:rPr>
+          <w:sz w:val="24"/>
+          <w:szCs w:val="24"/>
+        </w:rPr>
+        <w:t xml:space="preserve">                if (p or q) and r:</w:t>
+      </w:r>
+    </w:p>
+    <w:p>
+      <w:pPr>
+        <w:rPr>
+          <w:sz w:val="24"/>
+          <w:szCs w:val="24"/>
+        </w:rPr>
+      </w:pPr>
+      <w:r>
+        <w:rPr>
+          <w:sz w:val="24"/>
+          <w:szCs w:val="24"/>
+        </w:rPr>
+        <w:t xml:space="preserve">                    </w:t>
+      </w:r>
+      <w:proofErr w:type="gramStart"/>
+      <w:r>
+        <w:rPr>
+          <w:sz w:val="24"/>
+          <w:szCs w:val="24"/>
+        </w:rPr>
+        <w:t>print(</w:t>
+      </w:r>
+      <w:proofErr w:type="gramEnd"/>
+      <w:r>
+        <w:rPr>
+          <w:sz w:val="24"/>
+          <w:szCs w:val="24"/>
+        </w:rPr>
+        <w:t>"El usuario", usuario, "es un usuario Critico.")</w:t>
+      </w:r>
+    </w:p>
+    <w:p>
+      <w:pPr>
+        <w:rPr>
+          <w:sz w:val="24"/>
+          <w:szCs w:val="24"/>
+        </w:rPr>
+      </w:pPr>
+      <w:r>
+        <w:rPr>
+          <w:sz w:val="24"/>
+          <w:szCs w:val="24"/>
+        </w:rPr>
+        <w:t xml:space="preserve">                else:</w:t>
+      </w:r>
+    </w:p>
+    <w:p>
+      <w:pPr>
+        <w:rPr>
+          <w:sz w:val="24"/>
+          <w:szCs w:val="24"/>
+        </w:rPr>
+      </w:pPr>
+      <w:r>
+        <w:rPr>
+          <w:sz w:val="24"/>
+          <w:szCs w:val="24"/>
+        </w:rPr>
+        <w:t xml:space="preserve">                    </w:t>
+      </w:r>
+      <w:proofErr w:type="gramStart"/>
+      <w:r>
+        <w:rPr>
+          <w:sz w:val="24"/>
+          <w:szCs w:val="24"/>
+        </w:rPr>
+        <w:t>print(</w:t>
+      </w:r>
+      <w:proofErr w:type="gramEnd"/>
+      <w:r>
+        <w:rPr>
+          <w:sz w:val="24"/>
+          <w:szCs w:val="24"/>
+        </w:rPr>
+        <w:t>"El usuario", usuario, "es un usuario No Critico")</w:t>
+      </w:r>
+    </w:p>
+    <w:p>
+      <w:pPr>
+        <w:rPr>
+          <w:sz w:val="24"/>
+          <w:szCs w:val="24"/>
+        </w:rPr>
+      </w:pPr>
+      <w:r>
+        <w:rPr>
+          <w:sz w:val="24"/>
+          <w:szCs w:val="24"/>
+        </w:rPr>
+        <w:t xml:space="preserve">        # 2) ¿Qué significa que un usuario este en C pero no en A U B?</w:t>
+      </w:r>
+    </w:p>
+    <w:p>
+      <w:pPr>
+        <w:rPr>
+          <w:sz w:val="24"/>
+          <w:szCs w:val="24"/>
+        </w:rPr>
+      </w:pPr>
+      <w:r>
+        <w:rPr>
+          <w:sz w:val="24"/>
+          <w:szCs w:val="24"/>
+        </w:rPr>
+        <w:t xml:space="preserve"># union </w:t>
+      </w:r>
+    </w:p>
+    <w:p>
+      <w:pPr>
+        <w:rPr>
+          <w:sz w:val="24"/>
+          <w:szCs w:val="24"/>
+        </w:rPr>
+      </w:pPr>
+      <w:r>
+        <w:rPr>
+          <w:sz w:val="24"/>
+          <w:szCs w:val="24"/>
+        </w:rPr>
+        <w:t>print("\n2) Usuarios en C pero no en A U B:")</w:t>
+      </w:r>
+    </w:p>
+    <w:p>
+      <w:pPr>
+        <w:rPr>
+          <w:sz w:val="24"/>
+          <w:szCs w:val="24"/>
+        </w:rPr>
+      </w:pPr>
+      <w:r>
+        <w:rPr>
+          <w:sz w:val="24"/>
+          <w:szCs w:val="24"/>
+        </w:rPr>
+        <w:t>union = A + B</w:t>
+      </w:r>
+    </w:p>
+    <w:p>
+      <w:pPr>
+        <w:rPr>
+          <w:sz w:val="24"/>
+          <w:szCs w:val="24"/>
+        </w:rPr>
+      </w:pPr>
+      <w:r>
+        <w:rPr>
+          <w:sz w:val="24"/>
+          <w:szCs w:val="24"/>
+        </w:rPr>
+        <w:t>for usuario in C:</w:t>
+      </w:r>
+    </w:p>
+    <w:p>
+      <w:pPr>
+        <w:rPr>
+          <w:sz w:val="24"/>
+          <w:szCs w:val="24"/>
+        </w:rPr>
+      </w:pPr>
+      <w:r>
+        <w:rPr>
+          <w:sz w:val="24"/>
+          <w:szCs w:val="24"/>
+        </w:rPr>
+        <w:t xml:space="preserve">    if usuario not in union:</w:t>
+      </w:r>
+    </w:p>
+    <w:p>
+      <w:pPr>
+        <w:rPr>
+          <w:sz w:val="24"/>
+          <w:szCs w:val="24"/>
+        </w:rPr>
+      </w:pPr>
+      <w:r>
+        <w:rPr>
+          <w:sz w:val="24"/>
+          <w:szCs w:val="24"/>
+        </w:rPr>
+        <w:t xml:space="preserve">          </w:t>
+      </w:r>
+      <w:proofErr w:type="gramStart"/>
+      <w:r>
+        <w:rPr>
+          <w:sz w:val="24"/>
+          <w:szCs w:val="24"/>
+        </w:rPr>
+        <w:t>print(</w:t>
+      </w:r>
+      <w:proofErr w:type="gramEnd"/>
+      <w:r>
+        <w:rPr>
+          <w:sz w:val="24"/>
+          <w:szCs w:val="24"/>
+        </w:rPr>
+        <w:t>"El usuario", usuario,"genera errores pero no aparece registrado en API ni WEB, significando que esta accediendo al programa por metodos no aprobados, que puede indicar una falla de vulnerabilidad del sistema")</w:t>
+      </w:r>
+    </w:p>
+    <w:p>
+      <w:pPr>
+        <w:rPr>
+          <w:sz w:val="24"/>
+          <w:szCs w:val="24"/>
+        </w:rPr>
+      </w:pPr>
+      <w:r>
+        <w:rPr>
+          <w:sz w:val="24"/>
+          <w:szCs w:val="24"/>
+        </w:rPr>
         <w:t># Tabla de verdad de: (p or q) and r</w:t>
       </w:r>
     </w:p>
@@ -1311,12 +2105,22 @@
           <w:szCs w:val="24"/>
         </w:rPr>
       </w:pPr>
-      <w:r>
-        <w:rPr>
-          <w:sz w:val="24"/>
-          <w:szCs w:val="24"/>
-        </w:rPr>
-        <w:t>print("p\</w:t>
+      <w:proofErr w:type="gramStart"/>
+      <w:r>
+        <w:rPr>
+          <w:sz w:val="24"/>
+          <w:szCs w:val="24"/>
+        </w:rPr>
+        <w:lastRenderedPageBreak/>
+        <w:t>print(</w:t>
+      </w:r>
+      <w:proofErr w:type="gramEnd"/>
+      <w:r>
+        <w:rPr>
+          <w:sz w:val="24"/>
+          <w:szCs w:val="24"/>
+        </w:rPr>
+        <w:t>"p\</w:t>
       </w:r>
       <w:proofErr w:type="spellStart"/>
       <w:r>
@@ -1348,7 +2152,23 @@
           <w:sz w:val="24"/>
           <w:szCs w:val="24"/>
         </w:rPr>
-        <w:t xml:space="preserve"> or q\t(p or q) and r")</w:t>
+        <w:t xml:space="preserve"> or q\</w:t>
+      </w:r>
+      <w:proofErr w:type="gramStart"/>
+      <w:r>
+        <w:rPr>
+          <w:sz w:val="24"/>
+          <w:szCs w:val="24"/>
+        </w:rPr>
+        <w:t>t(</w:t>
+      </w:r>
+      <w:proofErr w:type="gramEnd"/>
+      <w:r>
+        <w:rPr>
+          <w:sz w:val="24"/>
+          <w:szCs w:val="24"/>
+        </w:rPr>
+        <w:t>p or q) and r")</w:t>
       </w:r>
     </w:p>
     <w:p>
@@ -1423,7 +2243,6 @@
           <w:sz w:val="24"/>
           <w:szCs w:val="24"/>
         </w:rPr>
-        <w:lastRenderedPageBreak/>
         <w:t xml:space="preserve">            resultado2 = resultado1 and r</w:t>
       </w:r>
     </w:p>
@@ -1439,7 +2258,23 @@
           <w:sz w:val="24"/>
           <w:szCs w:val="24"/>
         </w:rPr>
-        <w:t xml:space="preserve">            print(p, "\t", q, "\t", r, "\t", resultado1, "\t", resultado2)</w:t>
+        <w:t xml:space="preserve">            </w:t>
+      </w:r>
+      <w:proofErr w:type="gramStart"/>
+      <w:r>
+        <w:rPr>
+          <w:sz w:val="24"/>
+          <w:szCs w:val="24"/>
+        </w:rPr>
+        <w:t>print(</w:t>
+      </w:r>
+      <w:proofErr w:type="gramEnd"/>
+      <w:r>
+        <w:rPr>
+          <w:sz w:val="24"/>
+          <w:szCs w:val="24"/>
+        </w:rPr>
+        <w:t>p, "\t", q, "\t", r, "\t", resultado1, "\t", resultado2)</w:t>
       </w:r>
     </w:p>
     <w:p>
@@ -1470,14 +2305,6 @@
           <w:szCs w:val="24"/>
         </w:rPr>
         <w:t xml:space="preserve"> </w:t>
-      </w:r>
-      <w:r>
-        <w:rPr>
-          <w:sz w:val="24"/>
-          <w:szCs w:val="24"/>
-          <w:highlight w:val="yellow"/>
-        </w:rPr>
-        <w:t>Falta</w:t>
       </w:r>
     </w:p>
     <w:p>
@@ -1766,6 +2593,7 @@
           <w:sz w:val="24"/>
           <w:szCs w:val="24"/>
         </w:rPr>
+        <w:lastRenderedPageBreak/>
         <w:t xml:space="preserve">    r = usuario in C</w:t>
       </w:r>
     </w:p>
@@ -1812,22 +2640,37 @@
           <w:sz w:val="24"/>
           <w:szCs w:val="24"/>
         </w:rPr>
-        <w:t xml:space="preserve">        print("El usuario", usuario,"es un usuario Critico.")</w:t>
-      </w:r>
-    </w:p>
-    <w:p>
-      <w:pPr>
-        <w:rPr>
-          <w:sz w:val="24"/>
-          <w:szCs w:val="24"/>
-        </w:rPr>
-      </w:pPr>
-      <w:r>
-        <w:rPr>
-          <w:sz w:val="24"/>
-          <w:szCs w:val="24"/>
-        </w:rPr>
-        <w:lastRenderedPageBreak/>
+        <w:t xml:space="preserve">        </w:t>
+      </w:r>
+      <w:proofErr w:type="gramStart"/>
+      <w:r>
+        <w:rPr>
+          <w:sz w:val="24"/>
+          <w:szCs w:val="24"/>
+        </w:rPr>
+        <w:t>print(</w:t>
+      </w:r>
+      <w:proofErr w:type="gramEnd"/>
+      <w:r>
+        <w:rPr>
+          <w:sz w:val="24"/>
+          <w:szCs w:val="24"/>
+        </w:rPr>
+        <w:t>"El usuario", usuario,"es un usuario Critico.")</w:t>
+      </w:r>
+    </w:p>
+    <w:p>
+      <w:pPr>
+        <w:rPr>
+          <w:sz w:val="24"/>
+          <w:szCs w:val="24"/>
+        </w:rPr>
+      </w:pPr>
+      <w:r>
+        <w:rPr>
+          <w:sz w:val="24"/>
+          <w:szCs w:val="24"/>
+        </w:rPr>
         <w:t xml:space="preserve">    else:</w:t>
       </w:r>
     </w:p>
@@ -1843,7 +2686,23 @@
           <w:sz w:val="24"/>
           <w:szCs w:val="24"/>
         </w:rPr>
-        <w:t xml:space="preserve">        print("El usuario", usuario, "es un usuario No Critico")</w:t>
+        <w:t xml:space="preserve">        </w:t>
+      </w:r>
+      <w:proofErr w:type="gramStart"/>
+      <w:r>
+        <w:rPr>
+          <w:sz w:val="24"/>
+          <w:szCs w:val="24"/>
+        </w:rPr>
+        <w:t>print(</w:t>
+      </w:r>
+      <w:proofErr w:type="gramEnd"/>
+      <w:r>
+        <w:rPr>
+          <w:sz w:val="24"/>
+          <w:szCs w:val="24"/>
+        </w:rPr>
+        <w:t>"El usuario", usuario, "es un usuario No Critico")</w:t>
       </w:r>
     </w:p>
     <w:p>
@@ -2055,7 +2914,23 @@
           <w:sz w:val="24"/>
           <w:szCs w:val="24"/>
         </w:rPr>
-        <w:t xml:space="preserve">        print("El usuario", usuario,"genera errores pero no aparece registrado en API ni WEB, significando que esta accediendo al programa por metodos no aprobados, que puede indicar una falla de vulnerabilidad del sistema")</w:t>
+        <w:t xml:space="preserve">        </w:t>
+      </w:r>
+      <w:proofErr w:type="gramStart"/>
+      <w:r>
+        <w:rPr>
+          <w:sz w:val="24"/>
+          <w:szCs w:val="24"/>
+        </w:rPr>
+        <w:t>print(</w:t>
+      </w:r>
+      <w:proofErr w:type="gramEnd"/>
+      <w:r>
+        <w:rPr>
+          <w:sz w:val="24"/>
+          <w:szCs w:val="24"/>
+        </w:rPr>
+        <w:t>"El usuario", usuario,"genera errores pero no aparece registrado en API ni WEB, significando que esta accediendo al programa por metodos no aprobados, que puede indicar una falla de vulnerabilidad del sistema")</w:t>
       </w:r>
     </w:p>
     <w:p>
@@ -2185,73 +3060,117 @@
           <w:szCs w:val="24"/>
         </w:rPr>
       </w:pPr>
-      <w:r>
-        <w:rPr>
-          <w:sz w:val="24"/>
-          <w:szCs w:val="24"/>
-        </w:rPr>
-        <w:t>print("Como equipo programador tomariamos las siguientes decisiones:")</w:t>
-      </w:r>
-    </w:p>
-    <w:p>
-      <w:pPr>
-        <w:rPr>
-          <w:sz w:val="24"/>
-          <w:szCs w:val="24"/>
-        </w:rPr>
-      </w:pPr>
-      <w:r>
-        <w:rPr>
-          <w:sz w:val="24"/>
-          <w:szCs w:val="24"/>
-        </w:rPr>
-        <w:t>print("- Revisar los usuarios criticos y sus errores para poder ver los errores del sistema")</w:t>
-      </w:r>
-    </w:p>
-    <w:p>
-      <w:pPr>
-        <w:rPr>
-          <w:sz w:val="24"/>
-          <w:szCs w:val="24"/>
-        </w:rPr>
-      </w:pPr>
-      <w:r>
-        <w:rPr>
-          <w:sz w:val="24"/>
-          <w:szCs w:val="24"/>
-        </w:rPr>
-        <w:t>print("- Mejorar la seguridad del sistema")</w:t>
-      </w:r>
-    </w:p>
-    <w:p>
-      <w:pPr>
-        <w:rPr>
-          <w:sz w:val="24"/>
-          <w:szCs w:val="24"/>
-        </w:rPr>
-      </w:pPr>
-      <w:r>
-        <w:rPr>
-          <w:sz w:val="24"/>
-          <w:szCs w:val="24"/>
-        </w:rPr>
-        <w:t>print("- Corregir errores detectados")</w:t>
-      </w:r>
-    </w:p>
-    <w:p>
-      <w:pPr>
-        <w:rPr>
-          <w:sz w:val="24"/>
-          <w:szCs w:val="24"/>
-        </w:rPr>
-      </w:pPr>
-      <w:r>
-        <w:rPr>
-          <w:sz w:val="24"/>
-          <w:szCs w:val="24"/>
-        </w:rPr>
-        <w:lastRenderedPageBreak/>
-        <w:t>print("- Mejorar la validacion de accesos")</w:t>
+      <w:proofErr w:type="gramStart"/>
+      <w:r>
+        <w:rPr>
+          <w:sz w:val="24"/>
+          <w:szCs w:val="24"/>
+        </w:rPr>
+        <w:t>print(</w:t>
+      </w:r>
+      <w:proofErr w:type="gramEnd"/>
+      <w:r>
+        <w:rPr>
+          <w:sz w:val="24"/>
+          <w:szCs w:val="24"/>
+        </w:rPr>
+        <w:t>"Como equipo programador tomariamos las siguientes decisiones:")</w:t>
+      </w:r>
+    </w:p>
+    <w:p>
+      <w:pPr>
+        <w:rPr>
+          <w:sz w:val="24"/>
+          <w:szCs w:val="24"/>
+        </w:rPr>
+      </w:pPr>
+      <w:proofErr w:type="gramStart"/>
+      <w:r>
+        <w:rPr>
+          <w:sz w:val="24"/>
+          <w:szCs w:val="24"/>
+        </w:rPr>
+        <w:t>print(</w:t>
+      </w:r>
+      <w:proofErr w:type="gramEnd"/>
+      <w:r>
+        <w:rPr>
+          <w:sz w:val="24"/>
+          <w:szCs w:val="24"/>
+        </w:rPr>
+        <w:t>"- Revisar los usuarios criticos y sus errores para poder ver los errores del sistema")</w:t>
+      </w:r>
+    </w:p>
+    <w:p>
+      <w:pPr>
+        <w:rPr>
+          <w:sz w:val="24"/>
+          <w:szCs w:val="24"/>
+        </w:rPr>
+      </w:pPr>
+      <w:proofErr w:type="gramStart"/>
+      <w:r>
+        <w:rPr>
+          <w:sz w:val="24"/>
+          <w:szCs w:val="24"/>
+        </w:rPr>
+        <w:t>print(</w:t>
+      </w:r>
+      <w:proofErr w:type="gramEnd"/>
+      <w:r>
+        <w:rPr>
+          <w:sz w:val="24"/>
+          <w:szCs w:val="24"/>
+        </w:rPr>
+        <w:t>"- Mejorar la seguridad del sistema")</w:t>
+      </w:r>
+    </w:p>
+    <w:p>
+      <w:pPr>
+        <w:rPr>
+          <w:sz w:val="24"/>
+          <w:szCs w:val="24"/>
+        </w:rPr>
+      </w:pPr>
+      <w:proofErr w:type="gramStart"/>
+      <w:r>
+        <w:rPr>
+          <w:sz w:val="24"/>
+          <w:szCs w:val="24"/>
+        </w:rPr>
+        <w:t>print(</w:t>
+      </w:r>
+      <w:proofErr w:type="gramEnd"/>
+      <w:r>
+        <w:rPr>
+          <w:sz w:val="24"/>
+          <w:szCs w:val="24"/>
+        </w:rPr>
+        <w:t>"- Corregir errores detectados")</w:t>
+      </w:r>
+    </w:p>
+    <w:p>
+      <w:pPr>
+        <w:rPr>
+          <w:sz w:val="24"/>
+          <w:szCs w:val="24"/>
+        </w:rPr>
+      </w:pPr>
+      <w:proofErr w:type="gramStart"/>
+      <w:r>
+        <w:rPr>
+          <w:sz w:val="24"/>
+          <w:szCs w:val="24"/>
+        </w:rPr>
+        <w:t>print(</w:t>
+      </w:r>
+      <w:proofErr w:type="gramEnd"/>
+      <w:r>
+        <w:rPr>
+          <w:sz w:val="24"/>
+          <w:szCs w:val="24"/>
+        </w:rPr>
+        <w:t>"- Mejorar la validacion de accesos")</w:t>
       </w:r>
     </w:p>
     <w:p>
@@ -2709,6 +3628,7 @@
           <w:sz w:val="24"/>
           <w:szCs w:val="24"/>
         </w:rPr>
+        <w:lastRenderedPageBreak/>
         <w:t xml:space="preserve"> 2. Indicar si son paralelas. </w:t>
       </w:r>
     </w:p>
@@ -2802,7 +3722,6 @@
           <w:sz w:val="24"/>
           <w:szCs w:val="24"/>
         </w:rPr>
-        <w:lastRenderedPageBreak/>
         <w:t xml:space="preserve">Parte B — Implementación </w:t>
       </w:r>
     </w:p>
@@ -3044,7 +3963,23 @@
           <w:sz w:val="24"/>
           <w:szCs w:val="24"/>
         </w:rPr>
-        <w:t>Se dispone de la siguiente matriz de tiempos promedio de ejecución (en milisegundos):</w:t>
+        <w:t xml:space="preserve">Se </w:t>
+      </w:r>
+      <w:proofErr w:type="gramStart"/>
+      <w:r>
+        <w:rPr>
+          <w:sz w:val="24"/>
+          <w:szCs w:val="24"/>
+        </w:rPr>
+        <w:t>dispone</w:t>
+      </w:r>
+      <w:proofErr w:type="gramEnd"/>
+      <w:r>
+        <w:rPr>
+          <w:sz w:val="24"/>
+          <w:szCs w:val="24"/>
+        </w:rPr>
+        <w:t xml:space="preserve"> de la siguiente matriz de tiempos promedio de ejecución (en milisegundos):</w:t>
       </w:r>
     </w:p>
     <w:p>
@@ -3132,6 +4067,7 @@
           <w:sz w:val="24"/>
           <w:szCs w:val="24"/>
         </w:rPr>
+        <w:lastRenderedPageBreak/>
         <w:t xml:space="preserve">                                                                 </w:t>
       </w:r>
       <w:r>
@@ -3237,7 +4173,6 @@
           <w:sz w:val="24"/>
           <w:szCs w:val="24"/>
         </w:rPr>
-        <w:lastRenderedPageBreak/>
         <w:t>• Cada valor indica el tiempo promedio de ejecución de una función en un servidor determinado.</w:t>
       </w:r>
     </w:p>
@@ -3728,6 +4663,7 @@
           <w:sz w:val="24"/>
           <w:szCs w:val="24"/>
         </w:rPr>
+        <w:lastRenderedPageBreak/>
         <w:t xml:space="preserve"> o ¿Qué podría representar cada valor de la matriz T? o ¿Tiene sentido físico o práctico esta operación en el contexto planteado? </w:t>
       </w:r>
     </w:p>
@@ -3794,7 +4730,6 @@
           <w:sz w:val="24"/>
           <w:szCs w:val="24"/>
         </w:rPr>
-        <w:lastRenderedPageBreak/>
         <w:t>Parte E — Propiedades de la matriz</w:t>
       </w:r>
     </w:p>
@@ -4023,6 +4958,7 @@
           <w:sz w:val="24"/>
           <w:szCs w:val="24"/>
         </w:rPr>
+        <w:lastRenderedPageBreak/>
         <w:t xml:space="preserve">Uso de librerías externas: </w:t>
       </w:r>
     </w:p>
@@ -4085,296 +5021,312 @@
           <w:sz w:val="24"/>
           <w:szCs w:val="24"/>
         </w:rPr>
+        <w:t xml:space="preserve">• Qué ventajas presenta </w:t>
+      </w:r>
+    </w:p>
+    <w:p>
+      <w:pPr>
+        <w:ind w:firstLine="720"/>
+        <w:rPr>
+          <w:sz w:val="24"/>
+          <w:szCs w:val="24"/>
+        </w:rPr>
+      </w:pPr>
+      <w:r>
+        <w:rPr>
+          <w:sz w:val="24"/>
+          <w:szCs w:val="24"/>
+        </w:rPr>
+        <w:t xml:space="preserve">• Qué desventajas tiene </w:t>
+      </w:r>
+    </w:p>
+    <w:p>
+      <w:pPr>
+        <w:ind w:firstLine="720"/>
+        <w:rPr>
+          <w:sz w:val="24"/>
+          <w:szCs w:val="24"/>
+        </w:rPr>
+      </w:pPr>
+      <w:r>
+        <w:rPr>
+          <w:sz w:val="24"/>
+          <w:szCs w:val="24"/>
+        </w:rPr>
+        <w:t>• Qué otras alternativas existen</w:t>
+      </w:r>
+    </w:p>
+    <w:p>
+      <w:pPr>
+        <w:rPr>
+          <w:sz w:val="24"/>
+          <w:szCs w:val="24"/>
+        </w:rPr>
+      </w:pPr>
+      <w:r>
+        <w:rPr>
+          <w:sz w:val="24"/>
+          <w:szCs w:val="24"/>
+        </w:rPr>
+        <w:t xml:space="preserve"> La implementación principal del trabajo deberá igualmente respetar el uso de estructuras básicas de programación, siendo la librería utilizada únicamente como complemento para la visualización</w:t>
+      </w:r>
+      <w:r>
+        <w:rPr>
+          <w:sz w:val="24"/>
+          <w:szCs w:val="24"/>
+        </w:rPr>
+        <w:t>.</w:t>
+      </w:r>
+    </w:p>
+    <w:p>
+      <w:pPr>
+        <w:rPr>
+          <w:sz w:val="24"/>
+          <w:szCs w:val="24"/>
+        </w:rPr>
+      </w:pPr>
+    </w:p>
+    <w:p>
+      <w:pPr>
+        <w:rPr>
+          <w:sz w:val="24"/>
+          <w:szCs w:val="24"/>
+        </w:rPr>
+      </w:pPr>
+    </w:p>
+    <w:p>
+      <w:pPr>
+        <w:rPr>
+          <w:sz w:val="24"/>
+          <w:szCs w:val="24"/>
+        </w:rPr>
+      </w:pPr>
+      <w:r>
+        <w:rPr>
+          <w:sz w:val="24"/>
+          <w:szCs w:val="24"/>
+        </w:rPr>
+        <w:t># --- Definición de las matrices ---</w:t>
+      </w:r>
+    </w:p>
+    <w:p>
+      <w:pPr>
+        <w:rPr>
+          <w:sz w:val="24"/>
+          <w:szCs w:val="24"/>
+        </w:rPr>
+      </w:pPr>
+    </w:p>
+    <w:p>
+      <w:pPr>
+        <w:rPr>
+          <w:sz w:val="24"/>
+          <w:szCs w:val="24"/>
+        </w:rPr>
+      </w:pPr>
+      <w:r>
+        <w:rPr>
+          <w:sz w:val="24"/>
+          <w:szCs w:val="24"/>
+        </w:rPr>
+        <w:t>M = [</w:t>
+      </w:r>
+    </w:p>
+    <w:p>
+      <w:pPr>
+        <w:rPr>
+          <w:sz w:val="24"/>
+          <w:szCs w:val="24"/>
+        </w:rPr>
+      </w:pPr>
+      <w:r>
+        <w:rPr>
+          <w:sz w:val="24"/>
+          <w:szCs w:val="24"/>
+        </w:rPr>
+        <w:t xml:space="preserve">    [120, 150, 100],</w:t>
+      </w:r>
+    </w:p>
+    <w:p>
+      <w:pPr>
+        <w:rPr>
+          <w:sz w:val="24"/>
+          <w:szCs w:val="24"/>
+        </w:rPr>
+      </w:pPr>
+      <w:r>
+        <w:rPr>
+          <w:sz w:val="24"/>
+          <w:szCs w:val="24"/>
+        </w:rPr>
+        <w:t xml:space="preserve">    [200, 180, 220],</w:t>
+      </w:r>
+    </w:p>
+    <w:p>
+      <w:pPr>
+        <w:rPr>
+          <w:sz w:val="24"/>
+          <w:szCs w:val="24"/>
+        </w:rPr>
+      </w:pPr>
+      <w:r>
+        <w:rPr>
+          <w:sz w:val="24"/>
+          <w:szCs w:val="24"/>
+        </w:rPr>
+        <w:t xml:space="preserve">    [ 90, </w:t>
+      </w:r>
+      <w:proofErr w:type="gramStart"/>
+      <w:r>
+        <w:rPr>
+          <w:sz w:val="24"/>
+          <w:szCs w:val="24"/>
+        </w:rPr>
+        <w:t>110,  95</w:t>
+      </w:r>
+      <w:proofErr w:type="gramEnd"/>
+      <w:r>
+        <w:rPr>
+          <w:sz w:val="24"/>
+          <w:szCs w:val="24"/>
+        </w:rPr>
+        <w:t>]</w:t>
+      </w:r>
+    </w:p>
+    <w:p>
+      <w:pPr>
+        <w:rPr>
+          <w:sz w:val="24"/>
+          <w:szCs w:val="24"/>
+        </w:rPr>
+      </w:pPr>
+      <w:r>
+        <w:rPr>
+          <w:sz w:val="24"/>
+          <w:szCs w:val="24"/>
+        </w:rPr>
+        <w:t>]</w:t>
+      </w:r>
+    </w:p>
+    <w:p>
+      <w:pPr>
+        <w:rPr>
+          <w:sz w:val="24"/>
+          <w:szCs w:val="24"/>
+        </w:rPr>
+      </w:pPr>
+    </w:p>
+    <w:p>
+      <w:pPr>
+        <w:rPr>
+          <w:sz w:val="24"/>
+          <w:szCs w:val="24"/>
+        </w:rPr>
+      </w:pPr>
+      <w:r>
+        <w:rPr>
+          <w:sz w:val="24"/>
+          <w:szCs w:val="24"/>
+        </w:rPr>
+        <w:t>C = [</w:t>
+      </w:r>
+    </w:p>
+    <w:p>
+      <w:pPr>
+        <w:rPr>
+          <w:sz w:val="24"/>
+          <w:szCs w:val="24"/>
+        </w:rPr>
+      </w:pPr>
+      <w:r>
+        <w:rPr>
+          <w:sz w:val="24"/>
+          <w:szCs w:val="24"/>
+        </w:rPr>
+        <w:t xml:space="preserve">    [30, 20, 10],</w:t>
+      </w:r>
+    </w:p>
+    <w:p>
+      <w:pPr>
+        <w:rPr>
+          <w:sz w:val="24"/>
+          <w:szCs w:val="24"/>
+        </w:rPr>
+      </w:pPr>
+      <w:r>
+        <w:rPr>
+          <w:sz w:val="24"/>
+          <w:szCs w:val="24"/>
+        </w:rPr>
+        <w:t xml:space="preserve">    [15, 25, 20],</w:t>
+      </w:r>
+    </w:p>
+    <w:p>
+      <w:pPr>
+        <w:rPr>
+          <w:sz w:val="24"/>
+          <w:szCs w:val="24"/>
+        </w:rPr>
+      </w:pPr>
+      <w:r>
+        <w:rPr>
+          <w:sz w:val="24"/>
+          <w:szCs w:val="24"/>
+        </w:rPr>
+        <w:t xml:space="preserve">    [40, 10, 30]</w:t>
+      </w:r>
+    </w:p>
+    <w:p>
+      <w:pPr>
+        <w:rPr>
+          <w:sz w:val="24"/>
+          <w:szCs w:val="24"/>
+        </w:rPr>
+      </w:pPr>
+      <w:r>
+        <w:rPr>
+          <w:sz w:val="24"/>
+          <w:szCs w:val="24"/>
+        </w:rPr>
+        <w:t>]</w:t>
+      </w:r>
+    </w:p>
+    <w:p>
+      <w:pPr>
+        <w:rPr>
+          <w:sz w:val="24"/>
+          <w:szCs w:val="24"/>
+        </w:rPr>
+      </w:pPr>
+    </w:p>
+    <w:p>
+      <w:pPr>
+        <w:rPr>
+          <w:sz w:val="24"/>
+          <w:szCs w:val="24"/>
+        </w:rPr>
+      </w:pPr>
+      <w:r>
+        <w:rPr>
+          <w:sz w:val="24"/>
+          <w:szCs w:val="24"/>
+        </w:rPr>
+        <w:t>filas    = 3</w:t>
+      </w:r>
+    </w:p>
+    <w:p>
+      <w:pPr>
+        <w:rPr>
+          <w:sz w:val="24"/>
+          <w:szCs w:val="24"/>
+        </w:rPr>
+      </w:pPr>
+      <w:r>
+        <w:rPr>
+          <w:sz w:val="24"/>
+          <w:szCs w:val="24"/>
+        </w:rPr>
         <w:lastRenderedPageBreak/>
-        <w:t xml:space="preserve">• Qué ventajas presenta </w:t>
-      </w:r>
-    </w:p>
-    <w:p>
-      <w:pPr>
-        <w:ind w:firstLine="720"/>
-        <w:rPr>
-          <w:sz w:val="24"/>
-          <w:szCs w:val="24"/>
-        </w:rPr>
-      </w:pPr>
-      <w:r>
-        <w:rPr>
-          <w:sz w:val="24"/>
-          <w:szCs w:val="24"/>
-        </w:rPr>
-        <w:t xml:space="preserve">• Qué desventajas tiene </w:t>
-      </w:r>
-    </w:p>
-    <w:p>
-      <w:pPr>
-        <w:ind w:firstLine="720"/>
-        <w:rPr>
-          <w:sz w:val="24"/>
-          <w:szCs w:val="24"/>
-        </w:rPr>
-      </w:pPr>
-      <w:r>
-        <w:rPr>
-          <w:sz w:val="24"/>
-          <w:szCs w:val="24"/>
-        </w:rPr>
-        <w:t>• Qué otras alternativas existen</w:t>
-      </w:r>
-    </w:p>
-    <w:p>
-      <w:pPr>
-        <w:rPr>
-          <w:sz w:val="24"/>
-          <w:szCs w:val="24"/>
-        </w:rPr>
-      </w:pPr>
-      <w:r>
-        <w:rPr>
-          <w:sz w:val="24"/>
-          <w:szCs w:val="24"/>
-        </w:rPr>
-        <w:t xml:space="preserve"> La implementación principal del trabajo deberá igualmente respetar el uso de estructuras básicas de programación, siendo la librería utilizada únicamente como complemento para la visualización</w:t>
-      </w:r>
-      <w:r>
-        <w:rPr>
-          <w:sz w:val="24"/>
-          <w:szCs w:val="24"/>
-        </w:rPr>
-        <w:t>.</w:t>
-      </w:r>
-    </w:p>
-    <w:p>
-      <w:pPr>
-        <w:rPr>
-          <w:sz w:val="24"/>
-          <w:szCs w:val="24"/>
-        </w:rPr>
-      </w:pPr>
-    </w:p>
-    <w:p>
-      <w:pPr>
-        <w:rPr>
-          <w:sz w:val="24"/>
-          <w:szCs w:val="24"/>
-        </w:rPr>
-      </w:pPr>
-    </w:p>
-    <w:p>
-      <w:pPr>
-        <w:rPr>
-          <w:sz w:val="24"/>
-          <w:szCs w:val="24"/>
-        </w:rPr>
-      </w:pPr>
-      <w:r>
-        <w:rPr>
-          <w:sz w:val="24"/>
-          <w:szCs w:val="24"/>
-        </w:rPr>
-        <w:t># --- Definición de las matrices ---</w:t>
-      </w:r>
-    </w:p>
-    <w:p>
-      <w:pPr>
-        <w:rPr>
-          <w:sz w:val="24"/>
-          <w:szCs w:val="24"/>
-        </w:rPr>
-      </w:pPr>
-    </w:p>
-    <w:p>
-      <w:pPr>
-        <w:rPr>
-          <w:sz w:val="24"/>
-          <w:szCs w:val="24"/>
-        </w:rPr>
-      </w:pPr>
-      <w:r>
-        <w:rPr>
-          <w:sz w:val="24"/>
-          <w:szCs w:val="24"/>
-        </w:rPr>
-        <w:t>M = [</w:t>
-      </w:r>
-    </w:p>
-    <w:p>
-      <w:pPr>
-        <w:rPr>
-          <w:sz w:val="24"/>
-          <w:szCs w:val="24"/>
-        </w:rPr>
-      </w:pPr>
-      <w:r>
-        <w:rPr>
-          <w:sz w:val="24"/>
-          <w:szCs w:val="24"/>
-        </w:rPr>
-        <w:t xml:space="preserve">    [120, 150, 100],</w:t>
-      </w:r>
-    </w:p>
-    <w:p>
-      <w:pPr>
-        <w:rPr>
-          <w:sz w:val="24"/>
-          <w:szCs w:val="24"/>
-        </w:rPr>
-      </w:pPr>
-      <w:r>
-        <w:rPr>
-          <w:sz w:val="24"/>
-          <w:szCs w:val="24"/>
-        </w:rPr>
-        <w:t xml:space="preserve">    [200, 180, 220],</w:t>
-      </w:r>
-    </w:p>
-    <w:p>
-      <w:pPr>
-        <w:rPr>
-          <w:sz w:val="24"/>
-          <w:szCs w:val="24"/>
-        </w:rPr>
-      </w:pPr>
-      <w:r>
-        <w:rPr>
-          <w:sz w:val="24"/>
-          <w:szCs w:val="24"/>
-        </w:rPr>
-        <w:t xml:space="preserve">    [ 90, 110,  95]</w:t>
-      </w:r>
-    </w:p>
-    <w:p>
-      <w:pPr>
-        <w:rPr>
-          <w:sz w:val="24"/>
-          <w:szCs w:val="24"/>
-        </w:rPr>
-      </w:pPr>
-      <w:r>
-        <w:rPr>
-          <w:sz w:val="24"/>
-          <w:szCs w:val="24"/>
-        </w:rPr>
-        <w:t>]</w:t>
-      </w:r>
-    </w:p>
-    <w:p>
-      <w:pPr>
-        <w:rPr>
-          <w:sz w:val="24"/>
-          <w:szCs w:val="24"/>
-        </w:rPr>
-      </w:pPr>
-    </w:p>
-    <w:p>
-      <w:pPr>
-        <w:rPr>
-          <w:sz w:val="24"/>
-          <w:szCs w:val="24"/>
-        </w:rPr>
-      </w:pPr>
-      <w:r>
-        <w:rPr>
-          <w:sz w:val="24"/>
-          <w:szCs w:val="24"/>
-        </w:rPr>
-        <w:t>C = [</w:t>
-      </w:r>
-    </w:p>
-    <w:p>
-      <w:pPr>
-        <w:rPr>
-          <w:sz w:val="24"/>
-          <w:szCs w:val="24"/>
-        </w:rPr>
-      </w:pPr>
-      <w:r>
-        <w:rPr>
-          <w:sz w:val="24"/>
-          <w:szCs w:val="24"/>
-        </w:rPr>
-        <w:t xml:space="preserve">    [30, 20, 10],</w:t>
-      </w:r>
-    </w:p>
-    <w:p>
-      <w:pPr>
-        <w:rPr>
-          <w:sz w:val="24"/>
-          <w:szCs w:val="24"/>
-        </w:rPr>
-      </w:pPr>
-      <w:r>
-        <w:rPr>
-          <w:sz w:val="24"/>
-          <w:szCs w:val="24"/>
-        </w:rPr>
-        <w:t xml:space="preserve">    [15, 25, 20],</w:t>
-      </w:r>
-    </w:p>
-    <w:p>
-      <w:pPr>
-        <w:rPr>
-          <w:sz w:val="24"/>
-          <w:szCs w:val="24"/>
-        </w:rPr>
-      </w:pPr>
-      <w:r>
-        <w:rPr>
-          <w:sz w:val="24"/>
-          <w:szCs w:val="24"/>
-        </w:rPr>
-        <w:t xml:space="preserve">    [40, 10, 30]</w:t>
-      </w:r>
-    </w:p>
-    <w:p>
-      <w:pPr>
-        <w:rPr>
-          <w:sz w:val="24"/>
-          <w:szCs w:val="24"/>
-        </w:rPr>
-      </w:pPr>
-      <w:r>
-        <w:rPr>
-          <w:sz w:val="24"/>
-          <w:szCs w:val="24"/>
-        </w:rPr>
-        <w:t>]</w:t>
-      </w:r>
-    </w:p>
-    <w:p>
-      <w:pPr>
-        <w:rPr>
-          <w:sz w:val="24"/>
-          <w:szCs w:val="24"/>
-        </w:rPr>
-      </w:pPr>
-    </w:p>
-    <w:p>
-      <w:pPr>
-        <w:rPr>
-          <w:sz w:val="24"/>
-          <w:szCs w:val="24"/>
-        </w:rPr>
-      </w:pPr>
-      <w:r>
-        <w:rPr>
-          <w:sz w:val="24"/>
-          <w:szCs w:val="24"/>
-        </w:rPr>
-        <w:t>filas    = 3</w:t>
-      </w:r>
-    </w:p>
-    <w:p>
-      <w:pPr>
-        <w:rPr>
-          <w:sz w:val="24"/>
-          <w:szCs w:val="24"/>
-        </w:rPr>
-      </w:pPr>
-      <w:r>
-        <w:rPr>
-          <w:sz w:val="24"/>
-          <w:szCs w:val="24"/>
-        </w:rPr>
         <w:t>columnas = 3</w:t>
       </w:r>
     </w:p>
@@ -4446,42 +5398,69 @@
           <w:szCs w:val="24"/>
         </w:rPr>
       </w:pPr>
-      <w:r>
-        <w:rPr>
-          <w:sz w:val="24"/>
-          <w:szCs w:val="24"/>
-        </w:rPr>
-        <w:t>print("=" * 55)</w:t>
-      </w:r>
-    </w:p>
-    <w:p>
-      <w:pPr>
-        <w:rPr>
-          <w:sz w:val="24"/>
-          <w:szCs w:val="24"/>
-        </w:rPr>
-      </w:pPr>
-      <w:r>
-        <w:rPr>
-          <w:sz w:val="24"/>
-          <w:szCs w:val="24"/>
-        </w:rPr>
-        <w:t>print("  PARTE B — Tiempos promedio de ejecución")</w:t>
-      </w:r>
-    </w:p>
-    <w:p>
-      <w:pPr>
-        <w:rPr>
-          <w:sz w:val="24"/>
-          <w:szCs w:val="24"/>
-        </w:rPr>
-      </w:pPr>
-      <w:r>
-        <w:rPr>
-          <w:sz w:val="24"/>
-          <w:szCs w:val="24"/>
-        </w:rPr>
-        <w:t>print("=" * 55)</w:t>
+      <w:proofErr w:type="gramStart"/>
+      <w:r>
+        <w:rPr>
+          <w:sz w:val="24"/>
+          <w:szCs w:val="24"/>
+        </w:rPr>
+        <w:t>print(</w:t>
+      </w:r>
+      <w:proofErr w:type="gramEnd"/>
+      <w:r>
+        <w:rPr>
+          <w:sz w:val="24"/>
+          <w:szCs w:val="24"/>
+        </w:rPr>
+        <w:t>"=" * 55)</w:t>
+      </w:r>
+    </w:p>
+    <w:p>
+      <w:pPr>
+        <w:rPr>
+          <w:sz w:val="24"/>
+          <w:szCs w:val="24"/>
+        </w:rPr>
+      </w:pPr>
+      <w:proofErr w:type="gramStart"/>
+      <w:r>
+        <w:rPr>
+          <w:sz w:val="24"/>
+          <w:szCs w:val="24"/>
+        </w:rPr>
+        <w:t>print("  PARTE</w:t>
+      </w:r>
+      <w:proofErr w:type="gramEnd"/>
+      <w:r>
+        <w:rPr>
+          <w:sz w:val="24"/>
+          <w:szCs w:val="24"/>
+        </w:rPr>
+        <w:t xml:space="preserve"> B — Tiempos promedio de ejecución")</w:t>
+      </w:r>
+    </w:p>
+    <w:p>
+      <w:pPr>
+        <w:rPr>
+          <w:sz w:val="24"/>
+          <w:szCs w:val="24"/>
+        </w:rPr>
+      </w:pPr>
+      <w:proofErr w:type="gramStart"/>
+      <w:r>
+        <w:rPr>
+          <w:sz w:val="24"/>
+          <w:szCs w:val="24"/>
+        </w:rPr>
+        <w:t>print(</w:t>
+      </w:r>
+      <w:proofErr w:type="gramEnd"/>
+      <w:r>
+        <w:rPr>
+          <w:sz w:val="24"/>
+          <w:szCs w:val="24"/>
+        </w:rPr>
+        <w:t>"=" * 55)</w:t>
       </w:r>
     </w:p>
     <w:p>
@@ -4537,12 +5516,21 @@
           <w:szCs w:val="24"/>
         </w:rPr>
       </w:pPr>
-      <w:r>
-        <w:rPr>
-          <w:sz w:val="24"/>
-          <w:szCs w:val="24"/>
-        </w:rPr>
-        <w:t>print("\n</w:t>
+      <w:proofErr w:type="gramStart"/>
+      <w:r>
+        <w:rPr>
+          <w:sz w:val="24"/>
+          <w:szCs w:val="24"/>
+        </w:rPr>
+        <w:t>print(</w:t>
+      </w:r>
+      <w:proofErr w:type="gramEnd"/>
+      <w:r>
+        <w:rPr>
+          <w:sz w:val="24"/>
+          <w:szCs w:val="24"/>
+        </w:rPr>
+        <w:t>"\n</w:t>
       </w:r>
       <w:r>
         <w:rPr>
@@ -4679,7 +5667,39 @@
           <w:sz w:val="24"/>
           <w:szCs w:val="24"/>
         </w:rPr>
-        <w:t xml:space="preserve">    print(f"  {funciones[</w:t>
+        <w:t xml:space="preserve">    </w:t>
+      </w:r>
+      <w:proofErr w:type="gramStart"/>
+      <w:r>
+        <w:rPr>
+          <w:sz w:val="24"/>
+          <w:szCs w:val="24"/>
+        </w:rPr>
+        <w:t>print(</w:t>
+      </w:r>
+      <w:proofErr w:type="gramEnd"/>
+      <w:r>
+        <w:rPr>
+          <w:sz w:val="24"/>
+          <w:szCs w:val="24"/>
+        </w:rPr>
+        <w:t>f</w:t>
+      </w:r>
+      <w:proofErr w:type="gramStart"/>
+      <w:r>
+        <w:rPr>
+          <w:sz w:val="24"/>
+          <w:szCs w:val="24"/>
+        </w:rPr>
+        <w:t>"  {</w:t>
+      </w:r>
+      <w:proofErr w:type="gramEnd"/>
+      <w:r>
+        <w:rPr>
+          <w:sz w:val="24"/>
+          <w:szCs w:val="24"/>
+        </w:rPr>
+        <w:t>funciones[</w:t>
       </w:r>
       <w:proofErr w:type="spellStart"/>
       <w:r>
@@ -4767,12 +5787,21 @@
           <w:szCs w:val="24"/>
         </w:rPr>
       </w:pPr>
-      <w:r>
-        <w:rPr>
-          <w:sz w:val="24"/>
-          <w:szCs w:val="24"/>
-        </w:rPr>
-        <w:t>print("\n</w:t>
+      <w:proofErr w:type="gramStart"/>
+      <w:r>
+        <w:rPr>
+          <w:sz w:val="24"/>
+          <w:szCs w:val="24"/>
+        </w:rPr>
+        <w:t>print(</w:t>
+      </w:r>
+      <w:proofErr w:type="gramEnd"/>
+      <w:r>
+        <w:rPr>
+          <w:sz w:val="24"/>
+          <w:szCs w:val="24"/>
+        </w:rPr>
+        <w:t>"\n</w:t>
       </w:r>
       <w:r>
         <w:rPr>
@@ -4832,6 +5861,7 @@
           <w:sz w:val="24"/>
           <w:szCs w:val="24"/>
         </w:rPr>
+        <w:lastRenderedPageBreak/>
         <w:t xml:space="preserve">    for </w:t>
       </w:r>
       <w:proofErr w:type="spellStart"/>
@@ -4909,7 +5939,39 @@
           <w:sz w:val="24"/>
           <w:szCs w:val="24"/>
         </w:rPr>
-        <w:t xml:space="preserve">    print(f"  {servidores[j]}: {promedio:.2f} </w:t>
+        <w:t xml:space="preserve">    </w:t>
+      </w:r>
+      <w:proofErr w:type="gramStart"/>
+      <w:r>
+        <w:rPr>
+          <w:sz w:val="24"/>
+          <w:szCs w:val="24"/>
+        </w:rPr>
+        <w:t>print(</w:t>
+      </w:r>
+      <w:proofErr w:type="gramEnd"/>
+      <w:r>
+        <w:rPr>
+          <w:sz w:val="24"/>
+          <w:szCs w:val="24"/>
+        </w:rPr>
+        <w:t>f</w:t>
+      </w:r>
+      <w:proofErr w:type="gramStart"/>
+      <w:r>
+        <w:rPr>
+          <w:sz w:val="24"/>
+          <w:szCs w:val="24"/>
+        </w:rPr>
+        <w:t>"  {</w:t>
+      </w:r>
+      <w:proofErr w:type="gramEnd"/>
+      <w:r>
+        <w:rPr>
+          <w:sz w:val="24"/>
+          <w:szCs w:val="24"/>
+        </w:rPr>
+        <w:t xml:space="preserve">servidores[j]}: {promedio:.2f} </w:t>
       </w:r>
       <w:proofErr w:type="spellStart"/>
       <w:r>
@@ -4948,7 +6010,577 @@
           <w:sz w:val="24"/>
           <w:szCs w:val="24"/>
         </w:rPr>
+        <w:t># ============================================================</w:t>
+      </w:r>
+    </w:p>
+    <w:p>
+      <w:pPr>
+        <w:rPr>
+          <w:sz w:val="24"/>
+          <w:szCs w:val="24"/>
+        </w:rPr>
+      </w:pPr>
+      <w:r>
+        <w:rPr>
+          <w:sz w:val="24"/>
+          <w:szCs w:val="24"/>
+        </w:rPr>
+        <w:t># PARTE B - Punto 4: Transpuesta de M</w:t>
+      </w:r>
+    </w:p>
+    <w:p>
+      <w:pPr>
+        <w:rPr>
+          <w:sz w:val="24"/>
+          <w:szCs w:val="24"/>
+        </w:rPr>
+      </w:pPr>
+      <w:r>
+        <w:rPr>
+          <w:sz w:val="24"/>
+          <w:szCs w:val="24"/>
+        </w:rPr>
+        <w:t># ============================================================</w:t>
+      </w:r>
+    </w:p>
+    <w:p>
+      <w:pPr>
+        <w:rPr>
+          <w:sz w:val="24"/>
+          <w:szCs w:val="24"/>
+        </w:rPr>
+      </w:pPr>
+    </w:p>
+    <w:p>
+      <w:pPr>
+        <w:rPr>
+          <w:sz w:val="24"/>
+          <w:szCs w:val="24"/>
+        </w:rPr>
+      </w:pPr>
+      <w:proofErr w:type="gramStart"/>
+      <w:r>
+        <w:rPr>
+          <w:sz w:val="24"/>
+          <w:szCs w:val="24"/>
+        </w:rPr>
+        <w:t>print(</w:t>
+      </w:r>
+      <w:proofErr w:type="gramEnd"/>
+      <w:r>
+        <w:rPr>
+          <w:sz w:val="24"/>
+          <w:szCs w:val="24"/>
+        </w:rPr>
+        <w:t>"\n" + "=" * 55)</w:t>
+      </w:r>
+    </w:p>
+    <w:p>
+      <w:pPr>
+        <w:rPr>
+          <w:sz w:val="24"/>
+          <w:szCs w:val="24"/>
+        </w:rPr>
+      </w:pPr>
+      <w:proofErr w:type="gramStart"/>
+      <w:r>
+        <w:rPr>
+          <w:sz w:val="24"/>
+          <w:szCs w:val="24"/>
+        </w:rPr>
+        <w:t>print("  PARTE</w:t>
+      </w:r>
+      <w:proofErr w:type="gramEnd"/>
+      <w:r>
+        <w:rPr>
+          <w:sz w:val="24"/>
+          <w:szCs w:val="24"/>
+        </w:rPr>
+        <w:t xml:space="preserve"> B — Transpuesta de M")</w:t>
+      </w:r>
+    </w:p>
+    <w:p>
+      <w:pPr>
+        <w:rPr>
+          <w:sz w:val="24"/>
+          <w:szCs w:val="24"/>
+        </w:rPr>
+      </w:pPr>
+      <w:proofErr w:type="gramStart"/>
+      <w:r>
+        <w:rPr>
+          <w:sz w:val="24"/>
+          <w:szCs w:val="24"/>
+        </w:rPr>
+        <w:t>print(</w:t>
+      </w:r>
+      <w:proofErr w:type="gramEnd"/>
+      <w:r>
+        <w:rPr>
+          <w:sz w:val="24"/>
+          <w:szCs w:val="24"/>
+        </w:rPr>
+        <w:t>"=" * 55)</w:t>
+      </w:r>
+    </w:p>
+    <w:p>
+      <w:pPr>
+        <w:rPr>
+          <w:sz w:val="24"/>
+          <w:szCs w:val="24"/>
+        </w:rPr>
+      </w:pPr>
+    </w:p>
+    <w:p>
+      <w:pPr>
+        <w:rPr>
+          <w:sz w:val="24"/>
+          <w:szCs w:val="24"/>
+        </w:rPr>
+      </w:pPr>
+      <w:r>
+        <w:rPr>
+          <w:sz w:val="24"/>
+          <w:szCs w:val="24"/>
+        </w:rPr>
+        <w:t>MT = []</w:t>
+      </w:r>
+    </w:p>
+    <w:p>
+      <w:pPr>
+        <w:rPr>
+          <w:sz w:val="24"/>
+          <w:szCs w:val="24"/>
+        </w:rPr>
+      </w:pPr>
+      <w:r>
+        <w:rPr>
+          <w:sz w:val="24"/>
+          <w:szCs w:val="24"/>
+        </w:rPr>
+        <w:t>for j in range(columnas):</w:t>
+      </w:r>
+    </w:p>
+    <w:p>
+      <w:pPr>
+        <w:rPr>
+          <w:sz w:val="24"/>
+          <w:szCs w:val="24"/>
+        </w:rPr>
+      </w:pPr>
+      <w:r>
+        <w:rPr>
+          <w:sz w:val="24"/>
+          <w:szCs w:val="24"/>
+        </w:rPr>
+        <w:t xml:space="preserve">    fila = []</w:t>
+      </w:r>
+    </w:p>
+    <w:p>
+      <w:pPr>
+        <w:rPr>
+          <w:sz w:val="24"/>
+          <w:szCs w:val="24"/>
+        </w:rPr>
+      </w:pPr>
+      <w:r>
+        <w:rPr>
+          <w:sz w:val="24"/>
+          <w:szCs w:val="24"/>
+        </w:rPr>
+        <w:t xml:space="preserve">    for </w:t>
+      </w:r>
+      <w:proofErr w:type="spellStart"/>
+      <w:r>
+        <w:rPr>
+          <w:sz w:val="24"/>
+          <w:szCs w:val="24"/>
+        </w:rPr>
+        <w:t>i</w:t>
+      </w:r>
+      <w:proofErr w:type="spellEnd"/>
+      <w:r>
+        <w:rPr>
+          <w:sz w:val="24"/>
+          <w:szCs w:val="24"/>
+        </w:rPr>
+        <w:t xml:space="preserve"> in range(filas):</w:t>
+      </w:r>
+    </w:p>
+    <w:p>
+      <w:pPr>
+        <w:rPr>
+          <w:sz w:val="24"/>
+          <w:szCs w:val="24"/>
+        </w:rPr>
+      </w:pPr>
+      <w:r>
+        <w:rPr>
+          <w:sz w:val="24"/>
+          <w:szCs w:val="24"/>
+        </w:rPr>
+        <w:t xml:space="preserve">        </w:t>
+      </w:r>
+      <w:proofErr w:type="spellStart"/>
+      <w:proofErr w:type="gramStart"/>
+      <w:r>
+        <w:rPr>
+          <w:sz w:val="24"/>
+          <w:szCs w:val="24"/>
+        </w:rPr>
+        <w:t>fila.append</w:t>
+      </w:r>
+      <w:proofErr w:type="spellEnd"/>
+      <w:proofErr w:type="gramEnd"/>
+      <w:r>
+        <w:rPr>
+          <w:sz w:val="24"/>
+          <w:szCs w:val="24"/>
+        </w:rPr>
+        <w:t>(M[</w:t>
+      </w:r>
+      <w:proofErr w:type="spellStart"/>
+      <w:r>
+        <w:rPr>
+          <w:sz w:val="24"/>
+          <w:szCs w:val="24"/>
+        </w:rPr>
+        <w:t>i</w:t>
+      </w:r>
+      <w:proofErr w:type="spellEnd"/>
+      <w:r>
+        <w:rPr>
+          <w:sz w:val="24"/>
+          <w:szCs w:val="24"/>
+        </w:rPr>
+        <w:t>][j])</w:t>
+      </w:r>
+    </w:p>
+    <w:p>
+      <w:pPr>
+        <w:rPr>
+          <w:sz w:val="24"/>
+          <w:szCs w:val="24"/>
+        </w:rPr>
+      </w:pPr>
+      <w:r>
+        <w:rPr>
+          <w:sz w:val="24"/>
+          <w:szCs w:val="24"/>
+        </w:rPr>
+        <w:t xml:space="preserve">    </w:t>
+      </w:r>
+      <w:proofErr w:type="spellStart"/>
+      <w:proofErr w:type="gramStart"/>
+      <w:r>
+        <w:rPr>
+          <w:sz w:val="24"/>
+          <w:szCs w:val="24"/>
+        </w:rPr>
+        <w:t>MT.append</w:t>
+      </w:r>
+      <w:proofErr w:type="spellEnd"/>
+      <w:proofErr w:type="gramEnd"/>
+      <w:r>
+        <w:rPr>
+          <w:sz w:val="24"/>
+          <w:szCs w:val="24"/>
+        </w:rPr>
+        <w:t>(fila)</w:t>
+      </w:r>
+    </w:p>
+    <w:p>
+      <w:pPr>
+        <w:rPr>
+          <w:sz w:val="24"/>
+          <w:szCs w:val="24"/>
+        </w:rPr>
+      </w:pPr>
+    </w:p>
+    <w:p>
+      <w:pPr>
+        <w:rPr>
+          <w:sz w:val="24"/>
+          <w:szCs w:val="24"/>
+        </w:rPr>
+      </w:pPr>
+      <w:proofErr w:type="gramStart"/>
+      <w:r>
+        <w:rPr>
+          <w:sz w:val="24"/>
+          <w:szCs w:val="24"/>
+        </w:rPr>
+        <w:t>print(</w:t>
+      </w:r>
+      <w:proofErr w:type="gramEnd"/>
+      <w:r>
+        <w:rPr>
+          <w:sz w:val="24"/>
+          <w:szCs w:val="24"/>
+        </w:rPr>
+        <w:t>"\n</w:t>
+      </w:r>
+      <w:r>
+        <w:rPr>
+          <w:rFonts w:ascii="Segoe UI Emoji" w:hAnsi="Segoe UI Emoji" w:cs="Segoe UI Emoji"/>
+          <w:sz w:val="24"/>
+          <w:szCs w:val="24"/>
+        </w:rPr>
+        <w:t>📌</w:t>
+      </w:r>
+      <w:r>
+        <w:rPr>
+          <w:sz w:val="24"/>
+          <w:szCs w:val="24"/>
+        </w:rPr>
+        <w:t xml:space="preserve"> Matriz transpuesta M^T:")</w:t>
+      </w:r>
+    </w:p>
+    <w:p>
+      <w:pPr>
+        <w:rPr>
+          <w:sz w:val="24"/>
+          <w:szCs w:val="24"/>
+        </w:rPr>
+      </w:pPr>
+      <w:r>
+        <w:rPr>
+          <w:sz w:val="24"/>
+          <w:szCs w:val="24"/>
+        </w:rPr>
+        <w:t>for fila in MT:</w:t>
+      </w:r>
+    </w:p>
+    <w:p>
+      <w:pPr>
+        <w:rPr>
+          <w:sz w:val="24"/>
+          <w:szCs w:val="24"/>
+        </w:rPr>
+      </w:pPr>
+      <w:r>
+        <w:rPr>
+          <w:sz w:val="24"/>
+          <w:szCs w:val="24"/>
+        </w:rPr>
+        <w:t xml:space="preserve">    </w:t>
+      </w:r>
+      <w:proofErr w:type="gramStart"/>
+      <w:r>
+        <w:rPr>
+          <w:sz w:val="24"/>
+          <w:szCs w:val="24"/>
+        </w:rPr>
+        <w:t>print(</w:t>
+      </w:r>
+      <w:proofErr w:type="gramEnd"/>
+      <w:r>
+        <w:rPr>
+          <w:sz w:val="24"/>
+          <w:szCs w:val="24"/>
+        </w:rPr>
+        <w:t>" ", fila)</w:t>
+      </w:r>
+    </w:p>
+    <w:p>
+      <w:pPr>
+        <w:rPr>
+          <w:sz w:val="24"/>
+          <w:szCs w:val="24"/>
+        </w:rPr>
+      </w:pPr>
+    </w:p>
+    <w:p>
+      <w:pPr>
+        <w:rPr>
+          <w:sz w:val="24"/>
+          <w:szCs w:val="24"/>
+        </w:rPr>
+      </w:pPr>
+      <w:proofErr w:type="gramStart"/>
+      <w:r>
+        <w:rPr>
+          <w:sz w:val="24"/>
+          <w:szCs w:val="24"/>
+        </w:rPr>
+        <w:t>print(</w:t>
+      </w:r>
+      <w:proofErr w:type="gramEnd"/>
+      <w:r>
+        <w:rPr>
+          <w:sz w:val="24"/>
+          <w:szCs w:val="24"/>
+        </w:rPr>
+        <w:t>"""</w:t>
+      </w:r>
+    </w:p>
+    <w:p>
+      <w:pPr>
+        <w:rPr>
+          <w:sz w:val="24"/>
+          <w:szCs w:val="24"/>
+        </w:rPr>
+      </w:pPr>
+      <w:r>
+        <w:rPr>
+          <w:rFonts w:ascii="Segoe UI Emoji" w:hAnsi="Segoe UI Emoji" w:cs="Segoe UI Emoji"/>
+          <w:sz w:val="24"/>
+          <w:szCs w:val="24"/>
+        </w:rPr>
+        <w:t>💡</w:t>
+      </w:r>
+      <w:r>
+        <w:rPr>
+          <w:sz w:val="24"/>
+          <w:szCs w:val="24"/>
+        </w:rPr>
+        <w:t xml:space="preserve"> ¿Qué representa M^T en este contexto?</w:t>
+      </w:r>
+    </w:p>
+    <w:p>
+      <w:pPr>
+        <w:rPr>
+          <w:sz w:val="24"/>
+          <w:szCs w:val="24"/>
+        </w:rPr>
+      </w:pPr>
+      <w:r>
+        <w:rPr>
+          <w:sz w:val="24"/>
+          <w:szCs w:val="24"/>
+        </w:rPr>
+        <w:t xml:space="preserve">   En M original: filas = funciones, columnas = servidores.</w:t>
+      </w:r>
+    </w:p>
+    <w:p>
+      <w:pPr>
+        <w:rPr>
+          <w:sz w:val="24"/>
+          <w:szCs w:val="24"/>
+        </w:rPr>
+      </w:pPr>
+      <w:r>
+        <w:rPr>
+          <w:sz w:val="24"/>
+          <w:szCs w:val="24"/>
+        </w:rPr>
         <w:lastRenderedPageBreak/>
+        <w:t xml:space="preserve">   En M^T:        filas = servidores, columnas = funciones.</w:t>
+      </w:r>
+    </w:p>
+    <w:p>
+      <w:pPr>
+        <w:rPr>
+          <w:sz w:val="24"/>
+          <w:szCs w:val="24"/>
+        </w:rPr>
+      </w:pPr>
+      <w:r>
+        <w:rPr>
+          <w:sz w:val="24"/>
+          <w:szCs w:val="24"/>
+        </w:rPr>
+        <w:t xml:space="preserve">   Es decir, M^T nos permite analizar, para cada servidor,</w:t>
+      </w:r>
+    </w:p>
+    <w:p>
+      <w:pPr>
+        <w:rPr>
+          <w:sz w:val="24"/>
+          <w:szCs w:val="24"/>
+        </w:rPr>
+      </w:pPr>
+      <w:r>
+        <w:rPr>
+          <w:sz w:val="24"/>
+          <w:szCs w:val="24"/>
+        </w:rPr>
+        <w:t xml:space="preserve">   </w:t>
+      </w:r>
+      <w:proofErr w:type="spellStart"/>
+      <w:r>
+        <w:rPr>
+          <w:sz w:val="24"/>
+          <w:szCs w:val="24"/>
+        </w:rPr>
+        <w:t>cuánto</w:t>
+      </w:r>
+      <w:proofErr w:type="spellEnd"/>
+      <w:r>
+        <w:rPr>
+          <w:sz w:val="24"/>
+          <w:szCs w:val="24"/>
+        </w:rPr>
+        <w:t xml:space="preserve"> </w:t>
+      </w:r>
+      <w:proofErr w:type="spellStart"/>
+      <w:r>
+        <w:rPr>
+          <w:sz w:val="24"/>
+          <w:szCs w:val="24"/>
+        </w:rPr>
+        <w:t>tarda</w:t>
+      </w:r>
+      <w:proofErr w:type="spellEnd"/>
+      <w:r>
+        <w:rPr>
+          <w:sz w:val="24"/>
+          <w:szCs w:val="24"/>
+        </w:rPr>
+        <w:t xml:space="preserve"> en </w:t>
+      </w:r>
+      <w:proofErr w:type="spellStart"/>
+      <w:r>
+        <w:rPr>
+          <w:sz w:val="24"/>
+          <w:szCs w:val="24"/>
+        </w:rPr>
+        <w:t>ejecutar</w:t>
+      </w:r>
+      <w:proofErr w:type="spellEnd"/>
+      <w:r>
+        <w:rPr>
+          <w:sz w:val="24"/>
+          <w:szCs w:val="24"/>
+        </w:rPr>
+        <w:t xml:space="preserve"> cada función.</w:t>
+      </w:r>
+    </w:p>
+    <w:p>
+      <w:pPr>
+        <w:rPr>
+          <w:sz w:val="24"/>
+          <w:szCs w:val="24"/>
+        </w:rPr>
+      </w:pPr>
+      <w:r>
+        <w:rPr>
+          <w:sz w:val="24"/>
+          <w:szCs w:val="24"/>
+        </w:rPr>
+        <w:t>""")</w:t>
+      </w:r>
+    </w:p>
+    <w:p>
+      <w:pPr>
+        <w:rPr>
+          <w:sz w:val="24"/>
+          <w:szCs w:val="24"/>
+        </w:rPr>
+      </w:pPr>
+    </w:p>
+    <w:p>
+      <w:pPr>
+        <w:rPr>
+          <w:sz w:val="24"/>
+          <w:szCs w:val="24"/>
+        </w:rPr>
+      </w:pPr>
+      <w:r>
+        <w:rPr>
+          <w:sz w:val="24"/>
+          <w:szCs w:val="24"/>
+        </w:rPr>
         <w:t># ============================================================</w:t>
       </w:r>
     </w:p>
@@ -4964,7 +6596,7 @@
           <w:sz w:val="24"/>
           <w:szCs w:val="24"/>
         </w:rPr>
-        <w:t># PARTE B - Punto 4: Transpuesta de M</w:t>
+        <w:t># PARTE C - Punto 5: Producto T = M * C</w:t>
       </w:r>
     </w:p>
     <w:p>
@@ -4997,80 +6629,123 @@
           <w:szCs w:val="24"/>
         </w:rPr>
       </w:pPr>
-      <w:r>
-        <w:rPr>
-          <w:sz w:val="24"/>
-          <w:szCs w:val="24"/>
-        </w:rPr>
-        <w:t>print("\n" + "=" * 55)</w:t>
-      </w:r>
-    </w:p>
-    <w:p>
-      <w:pPr>
-        <w:rPr>
-          <w:sz w:val="24"/>
-          <w:szCs w:val="24"/>
-        </w:rPr>
-      </w:pPr>
-      <w:r>
-        <w:rPr>
-          <w:sz w:val="24"/>
-          <w:szCs w:val="24"/>
-        </w:rPr>
-        <w:t>print("  PARTE B — Transpuesta de M")</w:t>
-      </w:r>
-    </w:p>
-    <w:p>
-      <w:pPr>
-        <w:rPr>
-          <w:sz w:val="24"/>
-          <w:szCs w:val="24"/>
-        </w:rPr>
-      </w:pPr>
-      <w:r>
-        <w:rPr>
-          <w:sz w:val="24"/>
-          <w:szCs w:val="24"/>
-        </w:rPr>
-        <w:t>print("=" * 55)</w:t>
-      </w:r>
-    </w:p>
-    <w:p>
-      <w:pPr>
-        <w:rPr>
-          <w:sz w:val="24"/>
-          <w:szCs w:val="24"/>
-        </w:rPr>
-      </w:pPr>
-    </w:p>
-    <w:p>
-      <w:pPr>
-        <w:rPr>
-          <w:sz w:val="24"/>
-          <w:szCs w:val="24"/>
-        </w:rPr>
-      </w:pPr>
-      <w:r>
-        <w:rPr>
-          <w:sz w:val="24"/>
-          <w:szCs w:val="24"/>
-        </w:rPr>
-        <w:t>MT = []</w:t>
-      </w:r>
-    </w:p>
-    <w:p>
-      <w:pPr>
-        <w:rPr>
-          <w:sz w:val="24"/>
-          <w:szCs w:val="24"/>
-        </w:rPr>
-      </w:pPr>
-      <w:r>
-        <w:rPr>
-          <w:sz w:val="24"/>
-          <w:szCs w:val="24"/>
-        </w:rPr>
-        <w:t>for j in range(columnas):</w:t>
+      <w:proofErr w:type="gramStart"/>
+      <w:r>
+        <w:rPr>
+          <w:sz w:val="24"/>
+          <w:szCs w:val="24"/>
+        </w:rPr>
+        <w:t>print(</w:t>
+      </w:r>
+      <w:proofErr w:type="gramEnd"/>
+      <w:r>
+        <w:rPr>
+          <w:sz w:val="24"/>
+          <w:szCs w:val="24"/>
+        </w:rPr>
+        <w:t>"=" * 55)</w:t>
+      </w:r>
+    </w:p>
+    <w:p>
+      <w:pPr>
+        <w:rPr>
+          <w:sz w:val="24"/>
+          <w:szCs w:val="24"/>
+        </w:rPr>
+      </w:pPr>
+      <w:proofErr w:type="gramStart"/>
+      <w:r>
+        <w:rPr>
+          <w:sz w:val="24"/>
+          <w:szCs w:val="24"/>
+        </w:rPr>
+        <w:t>print("  PARTE</w:t>
+      </w:r>
+      <w:proofErr w:type="gramEnd"/>
+      <w:r>
+        <w:rPr>
+          <w:sz w:val="24"/>
+          <w:szCs w:val="24"/>
+        </w:rPr>
+        <w:t xml:space="preserve"> C — Producto matricial T = M * C")</w:t>
+      </w:r>
+    </w:p>
+    <w:p>
+      <w:pPr>
+        <w:rPr>
+          <w:sz w:val="24"/>
+          <w:szCs w:val="24"/>
+        </w:rPr>
+      </w:pPr>
+      <w:proofErr w:type="gramStart"/>
+      <w:r>
+        <w:rPr>
+          <w:sz w:val="24"/>
+          <w:szCs w:val="24"/>
+        </w:rPr>
+        <w:t>print(</w:t>
+      </w:r>
+      <w:proofErr w:type="gramEnd"/>
+      <w:r>
+        <w:rPr>
+          <w:sz w:val="24"/>
+          <w:szCs w:val="24"/>
+        </w:rPr>
+        <w:t>"=" * 55)</w:t>
+      </w:r>
+    </w:p>
+    <w:p>
+      <w:pPr>
+        <w:rPr>
+          <w:sz w:val="24"/>
+          <w:szCs w:val="24"/>
+        </w:rPr>
+      </w:pPr>
+    </w:p>
+    <w:p>
+      <w:pPr>
+        <w:rPr>
+          <w:sz w:val="24"/>
+          <w:szCs w:val="24"/>
+        </w:rPr>
+      </w:pPr>
+      <w:r>
+        <w:rPr>
+          <w:sz w:val="24"/>
+          <w:szCs w:val="24"/>
+        </w:rPr>
+        <w:t>T = []</w:t>
+      </w:r>
+    </w:p>
+    <w:p>
+      <w:pPr>
+        <w:rPr>
+          <w:sz w:val="24"/>
+          <w:szCs w:val="24"/>
+        </w:rPr>
+      </w:pPr>
+      <w:r>
+        <w:rPr>
+          <w:sz w:val="24"/>
+          <w:szCs w:val="24"/>
+        </w:rPr>
+        <w:t xml:space="preserve">for </w:t>
+      </w:r>
+      <w:proofErr w:type="spellStart"/>
+      <w:r>
+        <w:rPr>
+          <w:sz w:val="24"/>
+          <w:szCs w:val="24"/>
+        </w:rPr>
+        <w:t>i</w:t>
+      </w:r>
+      <w:proofErr w:type="spellEnd"/>
+      <w:r>
+        <w:rPr>
+          <w:sz w:val="24"/>
+          <w:szCs w:val="24"/>
+        </w:rPr>
+        <w:t xml:space="preserve"> in range(filas):</w:t>
       </w:r>
     </w:p>
     <w:p>
@@ -5100,7 +6775,37 @@
           <w:sz w:val="24"/>
           <w:szCs w:val="24"/>
         </w:rPr>
-        <w:t xml:space="preserve">    for </w:t>
+        <w:t xml:space="preserve">    for j in range(columnas):</w:t>
+      </w:r>
+    </w:p>
+    <w:p>
+      <w:pPr>
+        <w:rPr>
+          <w:sz w:val="24"/>
+          <w:szCs w:val="24"/>
+        </w:rPr>
+      </w:pPr>
+      <w:r>
+        <w:rPr>
+          <w:sz w:val="24"/>
+          <w:szCs w:val="24"/>
+        </w:rPr>
+        <w:t xml:space="preserve">        suma = 0</w:t>
+      </w:r>
+    </w:p>
+    <w:p>
+      <w:pPr>
+        <w:rPr>
+          <w:sz w:val="24"/>
+          <w:szCs w:val="24"/>
+        </w:rPr>
+      </w:pPr>
+      <w:r>
+        <w:rPr>
+          <w:sz w:val="24"/>
+          <w:szCs w:val="24"/>
+        </w:rPr>
+        <w:t xml:space="preserve">        </w:t>
       </w:r>
       <w:proofErr w:type="spellStart"/>
       <w:r>
@@ -5108,6 +6813,37 @@
           <w:sz w:val="24"/>
           <w:szCs w:val="24"/>
         </w:rPr>
+        <w:t>for k</w:t>
+      </w:r>
+      <w:proofErr w:type="spellEnd"/>
+      <w:r>
+        <w:rPr>
+          <w:sz w:val="24"/>
+          <w:szCs w:val="24"/>
+        </w:rPr>
+        <w:t xml:space="preserve"> in range(columnas):</w:t>
+      </w:r>
+    </w:p>
+    <w:p>
+      <w:pPr>
+        <w:rPr>
+          <w:sz w:val="24"/>
+          <w:szCs w:val="24"/>
+        </w:rPr>
+      </w:pPr>
+      <w:r>
+        <w:rPr>
+          <w:sz w:val="24"/>
+          <w:szCs w:val="24"/>
+        </w:rPr>
+        <w:t xml:space="preserve">            suma += M[</w:t>
+      </w:r>
+      <w:proofErr w:type="spellStart"/>
+      <w:r>
+        <w:rPr>
+          <w:sz w:val="24"/>
+          <w:szCs w:val="24"/>
+        </w:rPr>
         <w:t>i</w:t>
       </w:r>
       <w:proofErr w:type="spellEnd"/>
@@ -5116,7 +6852,7 @@
           <w:sz w:val="24"/>
           <w:szCs w:val="24"/>
         </w:rPr>
-        <w:t xml:space="preserve"> in range(filas):</w:t>
+        <w:t>][k] * C[k][j]</w:t>
       </w:r>
     </w:p>
     <w:p>
@@ -5134,6 +6870,7 @@
         <w:t xml:space="preserve">        </w:t>
       </w:r>
       <w:proofErr w:type="spellStart"/>
+      <w:proofErr w:type="gramStart"/>
       <w:r>
         <w:rPr>
           <w:sz w:val="24"/>
@@ -5142,14 +6879,212 @@
         <w:t>fila.append</w:t>
       </w:r>
       <w:proofErr w:type="spellEnd"/>
-      <w:r>
-        <w:rPr>
-          <w:sz w:val="24"/>
-          <w:szCs w:val="24"/>
-        </w:rPr>
-        <w:t>(M[</w:t>
+      <w:proofErr w:type="gramEnd"/>
+      <w:r>
+        <w:rPr>
+          <w:sz w:val="24"/>
+          <w:szCs w:val="24"/>
+        </w:rPr>
+        <w:t>(suma)</w:t>
+      </w:r>
+    </w:p>
+    <w:p>
+      <w:pPr>
+        <w:rPr>
+          <w:sz w:val="24"/>
+          <w:szCs w:val="24"/>
+        </w:rPr>
+      </w:pPr>
+      <w:r>
+        <w:rPr>
+          <w:sz w:val="24"/>
+          <w:szCs w:val="24"/>
+        </w:rPr>
+        <w:t xml:space="preserve">    </w:t>
       </w:r>
       <w:proofErr w:type="spellStart"/>
+      <w:proofErr w:type="gramStart"/>
+      <w:r>
+        <w:rPr>
+          <w:sz w:val="24"/>
+          <w:szCs w:val="24"/>
+        </w:rPr>
+        <w:t>T.append</w:t>
+      </w:r>
+      <w:proofErr w:type="spellEnd"/>
+      <w:proofErr w:type="gramEnd"/>
+      <w:r>
+        <w:rPr>
+          <w:sz w:val="24"/>
+          <w:szCs w:val="24"/>
+        </w:rPr>
+        <w:t>(fila)</w:t>
+      </w:r>
+    </w:p>
+    <w:p>
+      <w:pPr>
+        <w:rPr>
+          <w:sz w:val="24"/>
+          <w:szCs w:val="24"/>
+        </w:rPr>
+      </w:pPr>
+    </w:p>
+    <w:p>
+      <w:pPr>
+        <w:rPr>
+          <w:sz w:val="24"/>
+          <w:szCs w:val="24"/>
+        </w:rPr>
+      </w:pPr>
+      <w:proofErr w:type="gramStart"/>
+      <w:r>
+        <w:rPr>
+          <w:sz w:val="24"/>
+          <w:szCs w:val="24"/>
+        </w:rPr>
+        <w:t>print(</w:t>
+      </w:r>
+      <w:proofErr w:type="gramEnd"/>
+      <w:r>
+        <w:rPr>
+          <w:sz w:val="24"/>
+          <w:szCs w:val="24"/>
+        </w:rPr>
+        <w:t>"\n</w:t>
+      </w:r>
+      <w:r>
+        <w:rPr>
+          <w:rFonts w:ascii="Segoe UI Emoji" w:hAnsi="Segoe UI Emoji" w:cs="Segoe UI Emoji"/>
+          <w:sz w:val="24"/>
+          <w:szCs w:val="24"/>
+        </w:rPr>
+        <w:t>📌</w:t>
+      </w:r>
+      <w:r>
+        <w:rPr>
+          <w:sz w:val="24"/>
+          <w:szCs w:val="24"/>
+        </w:rPr>
+        <w:t xml:space="preserve"> Matriz T = M * C:")</w:t>
+      </w:r>
+    </w:p>
+    <w:p>
+      <w:pPr>
+        <w:rPr>
+          <w:sz w:val="24"/>
+          <w:szCs w:val="24"/>
+        </w:rPr>
+      </w:pPr>
+      <w:r>
+        <w:rPr>
+          <w:sz w:val="24"/>
+          <w:szCs w:val="24"/>
+        </w:rPr>
+        <w:t>for fila in T:</w:t>
+      </w:r>
+    </w:p>
+    <w:p>
+      <w:pPr>
+        <w:rPr>
+          <w:sz w:val="24"/>
+          <w:szCs w:val="24"/>
+        </w:rPr>
+      </w:pPr>
+      <w:r>
+        <w:rPr>
+          <w:sz w:val="24"/>
+          <w:szCs w:val="24"/>
+        </w:rPr>
+        <w:t xml:space="preserve">    </w:t>
+      </w:r>
+      <w:proofErr w:type="gramStart"/>
+      <w:r>
+        <w:rPr>
+          <w:sz w:val="24"/>
+          <w:szCs w:val="24"/>
+        </w:rPr>
+        <w:t>print(</w:t>
+      </w:r>
+      <w:proofErr w:type="gramEnd"/>
+      <w:r>
+        <w:rPr>
+          <w:sz w:val="24"/>
+          <w:szCs w:val="24"/>
+        </w:rPr>
+        <w:t>" ", fila)</w:t>
+      </w:r>
+    </w:p>
+    <w:p>
+      <w:pPr>
+        <w:rPr>
+          <w:sz w:val="24"/>
+          <w:szCs w:val="24"/>
+        </w:rPr>
+      </w:pPr>
+    </w:p>
+    <w:p>
+      <w:pPr>
+        <w:rPr>
+          <w:sz w:val="24"/>
+          <w:szCs w:val="24"/>
+        </w:rPr>
+      </w:pPr>
+      <w:proofErr w:type="gramStart"/>
+      <w:r>
+        <w:rPr>
+          <w:sz w:val="24"/>
+          <w:szCs w:val="24"/>
+        </w:rPr>
+        <w:lastRenderedPageBreak/>
+        <w:t>print(</w:t>
+      </w:r>
+      <w:proofErr w:type="gramEnd"/>
+      <w:r>
+        <w:rPr>
+          <w:sz w:val="24"/>
+          <w:szCs w:val="24"/>
+        </w:rPr>
+        <w:t>"""</w:t>
+      </w:r>
+    </w:p>
+    <w:p>
+      <w:pPr>
+        <w:rPr>
+          <w:sz w:val="24"/>
+          <w:szCs w:val="24"/>
+        </w:rPr>
+      </w:pPr>
+      <w:r>
+        <w:rPr>
+          <w:rFonts w:ascii="Segoe UI Emoji" w:hAnsi="Segoe UI Emoji" w:cs="Segoe UI Emoji"/>
+          <w:sz w:val="24"/>
+          <w:szCs w:val="24"/>
+        </w:rPr>
+        <w:t>💡</w:t>
+      </w:r>
+      <w:r>
+        <w:rPr>
+          <w:sz w:val="24"/>
+          <w:szCs w:val="24"/>
+        </w:rPr>
+        <w:t xml:space="preserve"> ¿Qué representa T?</w:t>
+      </w:r>
+    </w:p>
+    <w:p>
+      <w:pPr>
+        <w:rPr>
+          <w:sz w:val="24"/>
+          <w:szCs w:val="24"/>
+        </w:rPr>
+      </w:pPr>
+      <w:r>
+        <w:rPr>
+          <w:sz w:val="24"/>
+          <w:szCs w:val="24"/>
+        </w:rPr>
+        <w:t xml:space="preserve">   Cada valor T[</w:t>
+      </w:r>
+      <w:proofErr w:type="spellStart"/>
       <w:r>
         <w:rPr>
           <w:sz w:val="24"/>
@@ -5163,22 +7098,7 @@
           <w:sz w:val="24"/>
           <w:szCs w:val="24"/>
         </w:rPr>
-        <w:t>][j])</w:t>
-      </w:r>
-    </w:p>
-    <w:p>
-      <w:pPr>
-        <w:rPr>
-          <w:sz w:val="24"/>
-          <w:szCs w:val="24"/>
-        </w:rPr>
-      </w:pPr>
-      <w:r>
-        <w:rPr>
-          <w:sz w:val="24"/>
-          <w:szCs w:val="24"/>
-        </w:rPr>
-        <w:t xml:space="preserve">    </w:t>
+        <w:t xml:space="preserve">][j] es la suma </w:t>
       </w:r>
       <w:proofErr w:type="spellStart"/>
       <w:r>
@@ -5186,7 +7106,7 @@
           <w:sz w:val="24"/>
           <w:szCs w:val="24"/>
         </w:rPr>
-        <w:t>MT.append</w:t>
+        <w:t>ponderada</w:t>
       </w:r>
       <w:proofErr w:type="spellEnd"/>
       <w:r>
@@ -5194,166 +7114,38 @@
           <w:sz w:val="24"/>
           <w:szCs w:val="24"/>
         </w:rPr>
-        <w:t>(fila)</w:t>
-      </w:r>
-    </w:p>
-    <w:p>
-      <w:pPr>
-        <w:rPr>
-          <w:sz w:val="24"/>
-          <w:szCs w:val="24"/>
-        </w:rPr>
-      </w:pPr>
-    </w:p>
-    <w:p>
-      <w:pPr>
-        <w:rPr>
-          <w:sz w:val="24"/>
-          <w:szCs w:val="24"/>
-        </w:rPr>
-      </w:pPr>
-      <w:r>
-        <w:rPr>
-          <w:sz w:val="24"/>
-          <w:szCs w:val="24"/>
-        </w:rPr>
-        <w:t>print("\n</w:t>
-      </w:r>
-      <w:r>
-        <w:rPr>
-          <w:rFonts w:ascii="Segoe UI Emoji" w:hAnsi="Segoe UI Emoji" w:cs="Segoe UI Emoji"/>
-          <w:sz w:val="24"/>
-          <w:szCs w:val="24"/>
-        </w:rPr>
-        <w:t>📌</w:t>
-      </w:r>
-      <w:r>
-        <w:rPr>
-          <w:sz w:val="24"/>
-          <w:szCs w:val="24"/>
-        </w:rPr>
-        <w:t xml:space="preserve"> Matriz transpuesta M^T:")</w:t>
-      </w:r>
-    </w:p>
-    <w:p>
-      <w:pPr>
-        <w:rPr>
-          <w:sz w:val="24"/>
-          <w:szCs w:val="24"/>
-        </w:rPr>
-      </w:pPr>
-      <w:r>
-        <w:rPr>
-          <w:sz w:val="24"/>
-          <w:szCs w:val="24"/>
-        </w:rPr>
-        <w:t>for fila in MT:</w:t>
-      </w:r>
-    </w:p>
-    <w:p>
-      <w:pPr>
-        <w:rPr>
-          <w:sz w:val="24"/>
-          <w:szCs w:val="24"/>
-        </w:rPr>
-      </w:pPr>
-      <w:r>
-        <w:rPr>
-          <w:sz w:val="24"/>
-          <w:szCs w:val="24"/>
-        </w:rPr>
-        <w:t xml:space="preserve">    print(" ", fila)</w:t>
-      </w:r>
-    </w:p>
-    <w:p>
-      <w:pPr>
-        <w:rPr>
-          <w:sz w:val="24"/>
-          <w:szCs w:val="24"/>
-        </w:rPr>
-      </w:pPr>
-    </w:p>
-    <w:p>
-      <w:pPr>
-        <w:rPr>
-          <w:sz w:val="24"/>
-          <w:szCs w:val="24"/>
-        </w:rPr>
-      </w:pPr>
-      <w:r>
-        <w:rPr>
-          <w:sz w:val="24"/>
-          <w:szCs w:val="24"/>
-        </w:rPr>
-        <w:t>print("""</w:t>
-      </w:r>
-    </w:p>
-    <w:p>
-      <w:pPr>
-        <w:rPr>
-          <w:sz w:val="24"/>
-          <w:szCs w:val="24"/>
-        </w:rPr>
-      </w:pPr>
-      <w:r>
-        <w:rPr>
-          <w:rFonts w:ascii="Segoe UI Emoji" w:hAnsi="Segoe UI Emoji" w:cs="Segoe UI Emoji"/>
-          <w:sz w:val="24"/>
-          <w:szCs w:val="24"/>
-        </w:rPr>
-        <w:t>💡</w:t>
-      </w:r>
-      <w:r>
-        <w:rPr>
-          <w:sz w:val="24"/>
-          <w:szCs w:val="24"/>
-        </w:rPr>
-        <w:t xml:space="preserve"> ¿Qué representa M^T en este contexto?</w:t>
-      </w:r>
-    </w:p>
-    <w:p>
-      <w:pPr>
-        <w:rPr>
-          <w:sz w:val="24"/>
-          <w:szCs w:val="24"/>
-        </w:rPr>
-      </w:pPr>
-      <w:r>
-        <w:rPr>
-          <w:sz w:val="24"/>
-          <w:szCs w:val="24"/>
-        </w:rPr>
-        <w:t xml:space="preserve">   En M original: filas = funciones, columnas = servidores.</w:t>
-      </w:r>
-    </w:p>
-    <w:p>
-      <w:pPr>
-        <w:rPr>
-          <w:sz w:val="24"/>
-          <w:szCs w:val="24"/>
-        </w:rPr>
-      </w:pPr>
-      <w:r>
-        <w:rPr>
-          <w:sz w:val="24"/>
-          <w:szCs w:val="24"/>
-        </w:rPr>
-        <w:t xml:space="preserve">   En M^T:        filas = servidores, columnas = funciones.</w:t>
-      </w:r>
-    </w:p>
-    <w:p>
-      <w:pPr>
-        <w:rPr>
-          <w:sz w:val="24"/>
-          <w:szCs w:val="24"/>
-        </w:rPr>
-      </w:pPr>
-      <w:r>
-        <w:rPr>
-          <w:sz w:val="24"/>
-          <w:szCs w:val="24"/>
-        </w:rPr>
-        <w:t xml:space="preserve">   Es decir, M^T nos permite analizar, para cada servidor,</w:t>
+        <w:t xml:space="preserve"> del tiempo de</w:t>
+      </w:r>
+    </w:p>
+    <w:p>
+      <w:pPr>
+        <w:rPr>
+          <w:sz w:val="24"/>
+          <w:szCs w:val="24"/>
+        </w:rPr>
+      </w:pPr>
+      <w:r>
+        <w:rPr>
+          <w:sz w:val="24"/>
+          <w:szCs w:val="24"/>
+        </w:rPr>
+        <w:t xml:space="preserve">   ejecución de la función </w:t>
+      </w:r>
+      <w:proofErr w:type="spellStart"/>
+      <w:r>
+        <w:rPr>
+          <w:sz w:val="24"/>
+          <w:szCs w:val="24"/>
+        </w:rPr>
+        <w:t>i</w:t>
+      </w:r>
+      <w:proofErr w:type="spellEnd"/>
+      <w:r>
+        <w:rPr>
+          <w:sz w:val="24"/>
+          <w:szCs w:val="24"/>
+        </w:rPr>
+        <w:t xml:space="preserve"> en todos los servidores,</w:t>
       </w:r>
     </w:p>
     <w:p>
@@ -5376,7 +7168,7 @@
           <w:sz w:val="24"/>
           <w:szCs w:val="24"/>
         </w:rPr>
-        <w:t>cuánto</w:t>
+        <w:t>multiplicado</w:t>
       </w:r>
       <w:proofErr w:type="spellEnd"/>
       <w:r>
@@ -5384,7 +7176,7 @@
           <w:sz w:val="24"/>
           <w:szCs w:val="24"/>
         </w:rPr>
-        <w:t xml:space="preserve"> </w:t>
+        <w:t xml:space="preserve"> por la cantidad de </w:t>
       </w:r>
       <w:proofErr w:type="spellStart"/>
       <w:r>
@@ -5392,7 +7184,7 @@
           <w:sz w:val="24"/>
           <w:szCs w:val="24"/>
         </w:rPr>
-        <w:t>tarda</w:t>
+        <w:t>veces</w:t>
       </w:r>
       <w:proofErr w:type="spellEnd"/>
       <w:r>
@@ -5400,7 +7192,7 @@
           <w:sz w:val="24"/>
           <w:szCs w:val="24"/>
         </w:rPr>
-        <w:t xml:space="preserve"> en </w:t>
+        <w:t xml:space="preserve"> que se </w:t>
       </w:r>
       <w:proofErr w:type="spellStart"/>
       <w:r>
@@ -5408,623 +7200,22 @@
           <w:sz w:val="24"/>
           <w:szCs w:val="24"/>
         </w:rPr>
-        <w:t>ejecutar</w:t>
+        <w:t>ejecutó</w:t>
       </w:r>
       <w:proofErr w:type="spellEnd"/>
-      <w:r>
-        <w:rPr>
-          <w:sz w:val="24"/>
-          <w:szCs w:val="24"/>
-        </w:rPr>
-        <w:t xml:space="preserve"> cada función.</w:t>
-      </w:r>
-    </w:p>
-    <w:p>
-      <w:pPr>
-        <w:rPr>
-          <w:sz w:val="24"/>
-          <w:szCs w:val="24"/>
-        </w:rPr>
-      </w:pPr>
-      <w:r>
-        <w:rPr>
-          <w:sz w:val="24"/>
-          <w:szCs w:val="24"/>
-        </w:rPr>
-        <w:t>""")</w:t>
-      </w:r>
-    </w:p>
-    <w:p>
-      <w:pPr>
-        <w:rPr>
-          <w:sz w:val="24"/>
-          <w:szCs w:val="24"/>
-        </w:rPr>
-      </w:pPr>
-    </w:p>
-    <w:p>
-      <w:pPr>
-        <w:rPr>
-          <w:sz w:val="24"/>
-          <w:szCs w:val="24"/>
-        </w:rPr>
-      </w:pPr>
-      <w:r>
-        <w:rPr>
-          <w:sz w:val="24"/>
-          <w:szCs w:val="24"/>
-        </w:rPr>
-        <w:lastRenderedPageBreak/>
-        <w:t># ============================================================</w:t>
-      </w:r>
-    </w:p>
-    <w:p>
-      <w:pPr>
-        <w:rPr>
-          <w:sz w:val="24"/>
-          <w:szCs w:val="24"/>
-        </w:rPr>
-      </w:pPr>
-      <w:r>
-        <w:rPr>
-          <w:sz w:val="24"/>
-          <w:szCs w:val="24"/>
-        </w:rPr>
-        <w:t># PARTE C - Punto 5: Producto T = M * C</w:t>
-      </w:r>
-    </w:p>
-    <w:p>
-      <w:pPr>
-        <w:rPr>
-          <w:sz w:val="24"/>
-          <w:szCs w:val="24"/>
-        </w:rPr>
-      </w:pPr>
-      <w:r>
-        <w:rPr>
-          <w:sz w:val="24"/>
-          <w:szCs w:val="24"/>
-        </w:rPr>
-        <w:t># ============================================================</w:t>
-      </w:r>
-    </w:p>
-    <w:p>
-      <w:pPr>
-        <w:rPr>
-          <w:sz w:val="24"/>
-          <w:szCs w:val="24"/>
-        </w:rPr>
-      </w:pPr>
-    </w:p>
-    <w:p>
-      <w:pPr>
-        <w:rPr>
-          <w:sz w:val="24"/>
-          <w:szCs w:val="24"/>
-        </w:rPr>
-      </w:pPr>
-      <w:r>
-        <w:rPr>
-          <w:sz w:val="24"/>
-          <w:szCs w:val="24"/>
-        </w:rPr>
-        <w:t>print("=" * 55)</w:t>
-      </w:r>
-    </w:p>
-    <w:p>
-      <w:pPr>
-        <w:rPr>
-          <w:sz w:val="24"/>
-          <w:szCs w:val="24"/>
-        </w:rPr>
-      </w:pPr>
-      <w:r>
-        <w:rPr>
-          <w:sz w:val="24"/>
-          <w:szCs w:val="24"/>
-        </w:rPr>
-        <w:t>print("  PARTE C — Producto matricial T = M * C")</w:t>
-      </w:r>
-    </w:p>
-    <w:p>
-      <w:pPr>
-        <w:rPr>
-          <w:sz w:val="24"/>
-          <w:szCs w:val="24"/>
-        </w:rPr>
-      </w:pPr>
-      <w:r>
-        <w:rPr>
-          <w:sz w:val="24"/>
-          <w:szCs w:val="24"/>
-        </w:rPr>
-        <w:t>print("=" * 55)</w:t>
-      </w:r>
-    </w:p>
-    <w:p>
-      <w:pPr>
-        <w:rPr>
-          <w:sz w:val="24"/>
-          <w:szCs w:val="24"/>
-        </w:rPr>
-      </w:pPr>
-    </w:p>
-    <w:p>
-      <w:pPr>
-        <w:rPr>
-          <w:sz w:val="24"/>
-          <w:szCs w:val="24"/>
-        </w:rPr>
-      </w:pPr>
-      <w:r>
-        <w:rPr>
-          <w:sz w:val="24"/>
-          <w:szCs w:val="24"/>
-        </w:rPr>
-        <w:t>T = []</w:t>
-      </w:r>
-    </w:p>
-    <w:p>
-      <w:pPr>
-        <w:rPr>
-          <w:sz w:val="24"/>
-          <w:szCs w:val="24"/>
-        </w:rPr>
-      </w:pPr>
-      <w:r>
-        <w:rPr>
-          <w:sz w:val="24"/>
-          <w:szCs w:val="24"/>
-        </w:rPr>
-        <w:t xml:space="preserve">for </w:t>
-      </w:r>
-      <w:proofErr w:type="spellStart"/>
-      <w:r>
-        <w:rPr>
-          <w:sz w:val="24"/>
-          <w:szCs w:val="24"/>
-        </w:rPr>
-        <w:t>i</w:t>
-      </w:r>
-      <w:proofErr w:type="spellEnd"/>
-      <w:r>
-        <w:rPr>
-          <w:sz w:val="24"/>
-          <w:szCs w:val="24"/>
-        </w:rPr>
-        <w:t xml:space="preserve"> in range(filas):</w:t>
-      </w:r>
-    </w:p>
-    <w:p>
-      <w:pPr>
-        <w:rPr>
-          <w:sz w:val="24"/>
-          <w:szCs w:val="24"/>
-        </w:rPr>
-      </w:pPr>
-      <w:r>
-        <w:rPr>
-          <w:sz w:val="24"/>
-          <w:szCs w:val="24"/>
-        </w:rPr>
-        <w:t xml:space="preserve">    fila = []</w:t>
-      </w:r>
-    </w:p>
-    <w:p>
-      <w:pPr>
-        <w:rPr>
-          <w:sz w:val="24"/>
-          <w:szCs w:val="24"/>
-        </w:rPr>
-      </w:pPr>
-      <w:r>
-        <w:rPr>
-          <w:sz w:val="24"/>
-          <w:szCs w:val="24"/>
-        </w:rPr>
-        <w:t xml:space="preserve">    for j in range(columnas):</w:t>
-      </w:r>
-    </w:p>
-    <w:p>
-      <w:pPr>
-        <w:rPr>
-          <w:sz w:val="24"/>
-          <w:szCs w:val="24"/>
-        </w:rPr>
-      </w:pPr>
-      <w:r>
-        <w:rPr>
-          <w:sz w:val="24"/>
-          <w:szCs w:val="24"/>
-        </w:rPr>
-        <w:t xml:space="preserve">        suma = 0</w:t>
-      </w:r>
-    </w:p>
-    <w:p>
-      <w:pPr>
-        <w:rPr>
-          <w:sz w:val="24"/>
-          <w:szCs w:val="24"/>
-        </w:rPr>
-      </w:pPr>
-      <w:r>
-        <w:rPr>
-          <w:sz w:val="24"/>
-          <w:szCs w:val="24"/>
-        </w:rPr>
-        <w:t xml:space="preserve">        </w:t>
-      </w:r>
-      <w:proofErr w:type="spellStart"/>
-      <w:r>
-        <w:rPr>
-          <w:sz w:val="24"/>
-          <w:szCs w:val="24"/>
-        </w:rPr>
-        <w:t>for k</w:t>
-      </w:r>
-      <w:proofErr w:type="spellEnd"/>
-      <w:r>
-        <w:rPr>
-          <w:sz w:val="24"/>
-          <w:szCs w:val="24"/>
-        </w:rPr>
-        <w:t xml:space="preserve"> in range(columnas):</w:t>
-      </w:r>
-    </w:p>
-    <w:p>
-      <w:pPr>
-        <w:rPr>
-          <w:sz w:val="24"/>
-          <w:szCs w:val="24"/>
-        </w:rPr>
-      </w:pPr>
-      <w:r>
-        <w:rPr>
-          <w:sz w:val="24"/>
-          <w:szCs w:val="24"/>
-        </w:rPr>
-        <w:t xml:space="preserve">            suma += M[</w:t>
-      </w:r>
-      <w:proofErr w:type="spellStart"/>
-      <w:r>
-        <w:rPr>
-          <w:sz w:val="24"/>
-          <w:szCs w:val="24"/>
-        </w:rPr>
-        <w:t>i</w:t>
-      </w:r>
-      <w:proofErr w:type="spellEnd"/>
-      <w:r>
-        <w:rPr>
-          <w:sz w:val="24"/>
-          <w:szCs w:val="24"/>
-        </w:rPr>
-        <w:t>][k] * C[k][j]</w:t>
-      </w:r>
-    </w:p>
-    <w:p>
-      <w:pPr>
-        <w:rPr>
-          <w:sz w:val="24"/>
-          <w:szCs w:val="24"/>
-        </w:rPr>
-      </w:pPr>
-      <w:r>
-        <w:rPr>
-          <w:sz w:val="24"/>
-          <w:szCs w:val="24"/>
-        </w:rPr>
-        <w:t xml:space="preserve">        </w:t>
-      </w:r>
-      <w:proofErr w:type="spellStart"/>
-      <w:r>
-        <w:rPr>
-          <w:sz w:val="24"/>
-          <w:szCs w:val="24"/>
-        </w:rPr>
-        <w:t>fila.append</w:t>
-      </w:r>
-      <w:proofErr w:type="spellEnd"/>
-      <w:r>
-        <w:rPr>
-          <w:sz w:val="24"/>
-          <w:szCs w:val="24"/>
-        </w:rPr>
-        <w:t>(suma)</w:t>
-      </w:r>
-    </w:p>
-    <w:p>
-      <w:pPr>
-        <w:rPr>
-          <w:sz w:val="24"/>
-          <w:szCs w:val="24"/>
-        </w:rPr>
-      </w:pPr>
-      <w:r>
-        <w:rPr>
-          <w:sz w:val="24"/>
-          <w:szCs w:val="24"/>
-        </w:rPr>
-        <w:t xml:space="preserve">    </w:t>
-      </w:r>
-      <w:proofErr w:type="spellStart"/>
-      <w:r>
-        <w:rPr>
-          <w:sz w:val="24"/>
-          <w:szCs w:val="24"/>
-        </w:rPr>
-        <w:t>T.append</w:t>
-      </w:r>
-      <w:proofErr w:type="spellEnd"/>
-      <w:r>
-        <w:rPr>
-          <w:sz w:val="24"/>
-          <w:szCs w:val="24"/>
-        </w:rPr>
-        <w:t>(fila)</w:t>
-      </w:r>
-    </w:p>
-    <w:p>
-      <w:pPr>
-        <w:rPr>
-          <w:sz w:val="24"/>
-          <w:szCs w:val="24"/>
-        </w:rPr>
-      </w:pPr>
-    </w:p>
-    <w:p>
-      <w:pPr>
-        <w:rPr>
-          <w:sz w:val="24"/>
-          <w:szCs w:val="24"/>
-        </w:rPr>
-      </w:pPr>
-      <w:r>
-        <w:rPr>
-          <w:sz w:val="24"/>
-          <w:szCs w:val="24"/>
-        </w:rPr>
-        <w:t>print("\n</w:t>
-      </w:r>
-      <w:r>
-        <w:rPr>
-          <w:rFonts w:ascii="Segoe UI Emoji" w:hAnsi="Segoe UI Emoji" w:cs="Segoe UI Emoji"/>
-          <w:sz w:val="24"/>
-          <w:szCs w:val="24"/>
-        </w:rPr>
-        <w:t>📌</w:t>
-      </w:r>
-      <w:r>
-        <w:rPr>
-          <w:sz w:val="24"/>
-          <w:szCs w:val="24"/>
-        </w:rPr>
-        <w:t xml:space="preserve"> Matriz T = M * C:")</w:t>
-      </w:r>
-    </w:p>
-    <w:p>
-      <w:pPr>
-        <w:rPr>
-          <w:sz w:val="24"/>
-          <w:szCs w:val="24"/>
-        </w:rPr>
-      </w:pPr>
-      <w:r>
-        <w:rPr>
-          <w:sz w:val="24"/>
-          <w:szCs w:val="24"/>
-        </w:rPr>
-        <w:t>for fila in T:</w:t>
-      </w:r>
-    </w:p>
-    <w:p>
-      <w:pPr>
-        <w:rPr>
-          <w:sz w:val="24"/>
-          <w:szCs w:val="24"/>
-        </w:rPr>
-      </w:pPr>
-      <w:r>
-        <w:rPr>
-          <w:sz w:val="24"/>
-          <w:szCs w:val="24"/>
-        </w:rPr>
-        <w:t xml:space="preserve">    print(" ", fila)</w:t>
-      </w:r>
-    </w:p>
-    <w:p>
-      <w:pPr>
-        <w:rPr>
-          <w:sz w:val="24"/>
-          <w:szCs w:val="24"/>
-        </w:rPr>
-      </w:pPr>
-    </w:p>
-    <w:p>
-      <w:pPr>
-        <w:rPr>
-          <w:sz w:val="24"/>
-          <w:szCs w:val="24"/>
-        </w:rPr>
-      </w:pPr>
-      <w:r>
-        <w:rPr>
-          <w:sz w:val="24"/>
-          <w:szCs w:val="24"/>
-        </w:rPr>
-        <w:t>print("""</w:t>
-      </w:r>
-    </w:p>
-    <w:p>
-      <w:pPr>
-        <w:rPr>
-          <w:sz w:val="24"/>
-          <w:szCs w:val="24"/>
-        </w:rPr>
-      </w:pPr>
-      <w:r>
-        <w:rPr>
-          <w:rFonts w:ascii="Segoe UI Emoji" w:hAnsi="Segoe UI Emoji" w:cs="Segoe UI Emoji"/>
-          <w:sz w:val="24"/>
-          <w:szCs w:val="24"/>
-        </w:rPr>
-        <w:t>💡</w:t>
-      </w:r>
-      <w:r>
-        <w:rPr>
-          <w:sz w:val="24"/>
-          <w:szCs w:val="24"/>
-        </w:rPr>
-        <w:t xml:space="preserve"> ¿Qué representa T?</w:t>
-      </w:r>
-    </w:p>
-    <w:p>
-      <w:pPr>
-        <w:rPr>
-          <w:sz w:val="24"/>
-          <w:szCs w:val="24"/>
-        </w:rPr>
-      </w:pPr>
-      <w:r>
-        <w:rPr>
-          <w:sz w:val="24"/>
-          <w:szCs w:val="24"/>
-        </w:rPr>
-        <w:t xml:space="preserve">   Cada valor T[</w:t>
-      </w:r>
-      <w:proofErr w:type="spellStart"/>
-      <w:r>
-        <w:rPr>
-          <w:sz w:val="24"/>
-          <w:szCs w:val="24"/>
-        </w:rPr>
-        <w:t>i</w:t>
-      </w:r>
-      <w:proofErr w:type="spellEnd"/>
-      <w:r>
-        <w:rPr>
-          <w:sz w:val="24"/>
-          <w:szCs w:val="24"/>
-        </w:rPr>
-        <w:t xml:space="preserve">][j] es la suma </w:t>
-      </w:r>
-      <w:proofErr w:type="spellStart"/>
-      <w:r>
-        <w:rPr>
-          <w:sz w:val="24"/>
-          <w:szCs w:val="24"/>
-        </w:rPr>
-        <w:t>ponderada</w:t>
-      </w:r>
-      <w:proofErr w:type="spellEnd"/>
-      <w:r>
-        <w:rPr>
-          <w:sz w:val="24"/>
-          <w:szCs w:val="24"/>
-        </w:rPr>
-        <w:t xml:space="preserve"> del tiempo de</w:t>
-      </w:r>
-    </w:p>
-    <w:p>
-      <w:pPr>
-        <w:rPr>
-          <w:sz w:val="24"/>
-          <w:szCs w:val="24"/>
-        </w:rPr>
-      </w:pPr>
-      <w:r>
-        <w:rPr>
-          <w:sz w:val="24"/>
-          <w:szCs w:val="24"/>
-        </w:rPr>
-        <w:t xml:space="preserve">   ejecución de la función </w:t>
-      </w:r>
-      <w:proofErr w:type="spellStart"/>
-      <w:r>
-        <w:rPr>
-          <w:sz w:val="24"/>
-          <w:szCs w:val="24"/>
-        </w:rPr>
-        <w:t>i</w:t>
-      </w:r>
-      <w:proofErr w:type="spellEnd"/>
-      <w:r>
-        <w:rPr>
-          <w:sz w:val="24"/>
-          <w:szCs w:val="24"/>
-        </w:rPr>
-        <w:t xml:space="preserve"> en todos los servidores,</w:t>
-      </w:r>
-    </w:p>
-    <w:p>
-      <w:pPr>
-        <w:rPr>
-          <w:sz w:val="24"/>
-          <w:szCs w:val="24"/>
-        </w:rPr>
-      </w:pPr>
-      <w:r>
-        <w:rPr>
-          <w:sz w:val="24"/>
-          <w:szCs w:val="24"/>
-        </w:rPr>
-        <w:t xml:space="preserve">   </w:t>
-      </w:r>
-      <w:proofErr w:type="spellStart"/>
-      <w:r>
-        <w:rPr>
-          <w:sz w:val="24"/>
-          <w:szCs w:val="24"/>
-        </w:rPr>
-        <w:t>multiplicado</w:t>
-      </w:r>
-      <w:proofErr w:type="spellEnd"/>
-      <w:r>
-        <w:rPr>
-          <w:sz w:val="24"/>
-          <w:szCs w:val="24"/>
-        </w:rPr>
-        <w:t xml:space="preserve"> por la cantidad de </w:t>
-      </w:r>
-      <w:proofErr w:type="spellStart"/>
-      <w:r>
-        <w:rPr>
-          <w:sz w:val="24"/>
-          <w:szCs w:val="24"/>
-        </w:rPr>
-        <w:t>veces</w:t>
-      </w:r>
-      <w:proofErr w:type="spellEnd"/>
-      <w:r>
-        <w:rPr>
-          <w:sz w:val="24"/>
-          <w:szCs w:val="24"/>
-        </w:rPr>
-        <w:t xml:space="preserve"> que se </w:t>
-      </w:r>
-      <w:proofErr w:type="spellStart"/>
-      <w:r>
-        <w:rPr>
-          <w:sz w:val="24"/>
-          <w:szCs w:val="24"/>
-        </w:rPr>
-        <w:t>ejecutó</w:t>
-      </w:r>
-      <w:proofErr w:type="spellEnd"/>
-    </w:p>
-    <w:p>
-      <w:pPr>
-        <w:rPr>
-          <w:sz w:val="24"/>
-          <w:szCs w:val="24"/>
-        </w:rPr>
-      </w:pPr>
-      <w:r>
-        <w:rPr>
-          <w:sz w:val="24"/>
-          <w:szCs w:val="24"/>
-        </w:rPr>
-        <w:lastRenderedPageBreak/>
+    </w:p>
+    <w:p>
+      <w:pPr>
+        <w:rPr>
+          <w:sz w:val="24"/>
+          <w:szCs w:val="24"/>
+        </w:rPr>
+      </w:pPr>
+      <w:r>
+        <w:rPr>
+          <w:sz w:val="24"/>
+          <w:szCs w:val="24"/>
+        </w:rPr>
         <w:t xml:space="preserve">   en cada servidor.</w:t>
       </w:r>
     </w:p>

</xml_diff>

<commit_message>
Nuevas actualizaciones del word
</commit_message>
<xml_diff>
--- a/TP1 Matemáticas y Programacion.docx
+++ b/TP1 Matemáticas y Programacion.docx
@@ -4538,6 +4538,11 @@
     </w:p>
     <w:p>
       <w:pPr>
+        <w:pStyle w:val="Prrafodelista"/>
+        <w:numPr>
+          <w:ilvl w:val="0"/>
+          <w:numId w:val="1"/>
+        </w:numPr>
         <w:rPr>
           <w:rFonts w:ascii="Cambria Math" w:hAnsi="Cambria Math" w:cs="Cambria Math"/>
           <w:sz w:val="24"/>
@@ -4549,7 +4554,7 @@
           <w:sz w:val="24"/>
           <w:szCs w:val="24"/>
         </w:rPr>
-        <w:t xml:space="preserve">5. Calcular el producto </w:t>
+        <w:t xml:space="preserve">Calcular el producto </w:t>
       </w:r>
       <w:r>
         <w:rPr>
@@ -4608,15 +4613,43 @@
     <w:p>
       <w:pPr>
         <w:rPr>
-          <w:sz w:val="24"/>
-          <w:szCs w:val="24"/>
-        </w:rPr>
-      </w:pPr>
-      <w:r>
-        <w:rPr>
-          <w:sz w:val="24"/>
-          <w:szCs w:val="24"/>
-        </w:rPr>
+          <w:rFonts w:ascii="Cambria Math" w:hAnsi="Cambria Math" w:cs="Cambria Math"/>
+          <w:sz w:val="24"/>
+          <w:szCs w:val="24"/>
+        </w:rPr>
+      </w:pPr>
+    </w:p>
+    <w:p>
+      <w:pPr>
+        <w:rPr>
+          <w:rFonts w:ascii="Cambria Math" w:hAnsi="Cambria Math" w:cs="Cambria Math"/>
+          <w:sz w:val="24"/>
+          <w:szCs w:val="24"/>
+        </w:rPr>
+      </w:pPr>
+    </w:p>
+    <w:p>
+      <w:pPr>
+        <w:rPr>
+          <w:rFonts w:ascii="Cambria Math" w:hAnsi="Cambria Math" w:cs="Cambria Math"/>
+          <w:sz w:val="24"/>
+          <w:szCs w:val="24"/>
+        </w:rPr>
+      </w:pPr>
+    </w:p>
+    <w:p>
+      <w:pPr>
+        <w:rPr>
+          <w:sz w:val="24"/>
+          <w:szCs w:val="24"/>
+        </w:rPr>
+      </w:pPr>
+      <w:r>
+        <w:rPr>
+          <w:sz w:val="24"/>
+          <w:szCs w:val="24"/>
+        </w:rPr>
+        <w:lastRenderedPageBreak/>
         <w:t xml:space="preserve"> </w:t>
       </w:r>
       <w:r>
@@ -4663,39 +4696,264 @@
           <w:sz w:val="24"/>
           <w:szCs w:val="24"/>
         </w:rPr>
+        <w:t xml:space="preserve"> o ¿Qué podría representar cada valor de la matriz T? </w:t>
+      </w:r>
+    </w:p>
+    <w:p>
+      <w:r>
+        <w:t xml:space="preserve">Desde </w:t>
+      </w:r>
+      <w:r>
+        <w:t>la</w:t>
+      </w:r>
+      <w:r>
+        <w:t xml:space="preserve"> perspectiva </w:t>
+      </w:r>
+      <w:r>
+        <w:t>de la algebra,</w:t>
+      </w:r>
+      <w:r>
+        <w:t xml:space="preserve"> cada elemento </w:t>
+      </w:r>
+      <w:r>
+        <w:t>de T</w:t>
+      </w:r>
+      <w:r>
+        <w:t xml:space="preserve"> perteneciente a la matriz resultante </w:t>
+      </w:r>
+      <w:r>
+        <w:t>T=M*</w:t>
+      </w:r>
+      <w:proofErr w:type="gramStart"/>
+      <w:r>
+        <w:t>C .</w:t>
+      </w:r>
+      <w:proofErr w:type="gramEnd"/>
+      <w:r>
+        <w:t xml:space="preserve"> </w:t>
+      </w:r>
+      <w:r>
+        <w:t>R</w:t>
+      </w:r>
+      <w:r>
+        <w:t>epresenta una magnitud híbrida de tiempo total acumulado, expresada en milisegundos</w:t>
+      </w:r>
+      <w:r>
+        <w:t xml:space="preserve">. </w:t>
+      </w:r>
+      <w:r>
+        <w:t xml:space="preserve">Conceptualmente, este valor se define como la suma de los productos cruzados entre los tiempos promedio de ejecución de la función </w:t>
+      </w:r>
+      <w:proofErr w:type="spellStart"/>
+      <w:r>
+        <w:t>i</w:t>
+      </w:r>
+      <w:proofErr w:type="spellEnd"/>
+      <w:r>
+        <w:t xml:space="preserve"> en la totalidad de los servidores del sistema, y el volumen total de ejecuciones de todas las funciones dentro del servidor</w:t>
+      </w:r>
+      <w:r>
+        <w:t>.</w:t>
+      </w:r>
+    </w:p>
+    <w:p>
+      <w:pPr>
+        <w:rPr>
+          <w:sz w:val="24"/>
+          <w:szCs w:val="24"/>
+        </w:rPr>
+      </w:pPr>
+    </w:p>
+    <w:p>
+      <w:pPr>
+        <w:rPr>
+          <w:sz w:val="24"/>
+          <w:szCs w:val="24"/>
+        </w:rPr>
+      </w:pPr>
+      <w:r>
+        <w:rPr>
+          <w:sz w:val="24"/>
+          <w:szCs w:val="24"/>
+        </w:rPr>
+        <w:t xml:space="preserve">o ¿Tiene sentido físico o práctico esta operación en el contexto planteado? </w:t>
+      </w:r>
+    </w:p>
+    <w:p>
+      <w:r>
+        <w:t xml:space="preserve">Al analizar la utilidad de la matriz resultante </w:t>
+      </w:r>
+      <w:r>
+        <w:t>T</w:t>
+      </w:r>
+      <w:r>
+        <w:t xml:space="preserve"> nos enfrentamos a una contradicción evidente entre el rigor matemático y la lógica de </w:t>
+      </w:r>
+      <w:r>
+        <w:t>programacion</w:t>
+      </w:r>
+      <w:r>
+        <w:t xml:space="preserve">. Si bien la operación algebraica de multiplicación de matrices es perfectamente válida debido a que las dimensiones de </w:t>
+      </w:r>
+      <w:r>
+        <w:t>M y C</w:t>
+      </w:r>
+      <w:r>
+        <w:t xml:space="preserve"> son compatibles </w:t>
+      </w:r>
+      <w:r>
+        <w:t>(3x3</w:t>
+      </w:r>
+      <w:r>
+        <w:t>), en el contexto práctico del problema esta operación carece por completo de sentido físico o utilidad técnica.</w:t>
+      </w:r>
+    </w:p>
+    <w:p/>
+    <w:p>
+      <w:pPr>
+        <w:rPr>
+          <w:sz w:val="24"/>
+          <w:szCs w:val="24"/>
+        </w:rPr>
+      </w:pPr>
+    </w:p>
+    <w:p>
+      <w:pPr>
+        <w:rPr>
+          <w:sz w:val="24"/>
+          <w:szCs w:val="24"/>
+        </w:rPr>
+      </w:pPr>
+      <w:r>
+        <w:rPr>
+          <w:sz w:val="24"/>
+          <w:szCs w:val="24"/>
+        </w:rPr>
+        <w:t xml:space="preserve">7. En caso de considerar que el producto no representa correctamente una magnitud útil: </w:t>
+      </w:r>
+    </w:p>
+    <w:p>
+      <w:pPr>
+        <w:ind w:firstLine="720"/>
+        <w:rPr>
+          <w:sz w:val="24"/>
+          <w:szCs w:val="24"/>
+        </w:rPr>
+      </w:pPr>
+      <w:r>
+        <w:rPr>
+          <w:sz w:val="24"/>
+          <w:szCs w:val="24"/>
+        </w:rPr>
+        <w:t>o Explicar por qué</w:t>
+      </w:r>
+    </w:p>
+    <w:p>
+      <w:r>
+        <w:t xml:space="preserve">Al evaluar la viabilidad de la operación </w:t>
+      </w:r>
+      <w:r>
+        <w:t>T= M*C</w:t>
+      </w:r>
+      <w:r>
+        <w:t xml:space="preserve"> dentro del contexto de </w:t>
+      </w:r>
+      <w:r>
+        <w:t>este sistema</w:t>
+      </w:r>
+      <w:r>
+        <w:t xml:space="preserve">, nos encontramos con un claro </w:t>
+      </w:r>
+      <w:r>
+        <w:t>error</w:t>
+      </w:r>
+      <w:r>
+        <w:t xml:space="preserve"> entre la validez algebraica y la coherencia lógica de la</w:t>
+      </w:r>
+      <w:r>
+        <w:t xml:space="preserve"> programacion</w:t>
+      </w:r>
+      <w:r>
+        <w:t xml:space="preserve">. Si bien el producto es matemáticamente posible porque ambas matrices son cuadradas de orden 3, el resultado numérico obtenido no representa ninguna magnitud física real ni útil para el análisis de </w:t>
+      </w:r>
+      <w:r>
+        <w:t>rendimiento. El</w:t>
+      </w:r>
+      <w:r>
+        <w:t xml:space="preserve"> motivo fundamental de esta falta de utilidad radica en la mecánica del producto matricial clásico (fila por columna), que provoca un cruzamiento completamente erróneo de las variables del sistema. Cuando multiplicamos la fila </w:t>
+      </w:r>
+      <w:proofErr w:type="spellStart"/>
+      <w:r>
+        <w:t>i</w:t>
+      </w:r>
+      <w:proofErr w:type="spellEnd"/>
+      <w:r>
+        <w:t xml:space="preserve"> de la matriz M por la columna j de la matriz C, estamos combinando los tiempos de una función específica con el volumen de operaciones de un servidor en particular, pero perdiendo la relación directa entre qué tarea se ejecutó en qué máquina.</w:t>
+      </w:r>
+    </w:p>
+    <w:p>
+      <w:pPr>
+        <w:ind w:firstLine="720"/>
+        <w:rPr>
+          <w:sz w:val="24"/>
+          <w:szCs w:val="24"/>
+        </w:rPr>
+      </w:pPr>
+    </w:p>
+    <w:p>
+      <w:pPr>
+        <w:ind w:left="780"/>
+        <w:rPr>
+          <w:sz w:val="24"/>
+          <w:szCs w:val="24"/>
+        </w:rPr>
+      </w:pPr>
+      <w:r>
+        <w:rPr>
+          <w:sz w:val="24"/>
+          <w:szCs w:val="24"/>
+        </w:rPr>
+        <w:t xml:space="preserve">o Proponer una alternativa más adecuada para combinar la información de tiempo y cantidad de ejecuciones (por ejemplo: otra operación o enfoque) </w:t>
+      </w:r>
+    </w:p>
+    <w:p>
+      <w:r>
+        <w:t xml:space="preserve">Habiendo demostrado que el producto directo </w:t>
+      </w:r>
+      <w:r>
+        <w:t>M x C</w:t>
+      </w:r>
+      <w:r>
+        <w:t xml:space="preserve"> </w:t>
+      </w:r>
+      <w:r>
+        <w:t>da un resultado que no es útil desde la programación</w:t>
+      </w:r>
+      <w:r>
+        <w:t xml:space="preserve">, </w:t>
+      </w:r>
+      <w:r>
+        <w:t xml:space="preserve">buscamos otra solución para que </w:t>
+      </w:r>
+      <w:proofErr w:type="spellStart"/>
+      <w:r>
+        <w:t>nos</w:t>
+      </w:r>
+      <w:proofErr w:type="spellEnd"/>
+      <w:r>
+        <w:t xml:space="preserve"> diera un resultado útil</w:t>
+      </w:r>
+      <w:r>
+        <w:t>. Para lograrlo, identificamos dos enfoques válidos según el tipo de diagnóstico que se requiera realizar:</w:t>
+      </w:r>
+    </w:p>
+    <w:p>
+      <w:r>
         <w:lastRenderedPageBreak/>
-        <w:t xml:space="preserve"> o ¿Qué podría representar cada valor de la matriz T? o ¿Tiene sentido físico o práctico esta operación en el contexto planteado? </w:t>
-      </w:r>
-    </w:p>
-    <w:p>
-      <w:pPr>
-        <w:rPr>
-          <w:sz w:val="24"/>
-          <w:szCs w:val="24"/>
-        </w:rPr>
-      </w:pPr>
-      <w:r>
-        <w:rPr>
-          <w:sz w:val="24"/>
-          <w:szCs w:val="24"/>
-        </w:rPr>
-        <w:t xml:space="preserve">7. En caso de considerar que el producto no representa correctamente una magnitud útil: </w:t>
-      </w:r>
-    </w:p>
-    <w:p>
-      <w:pPr>
-        <w:ind w:firstLine="720"/>
-        <w:rPr>
-          <w:sz w:val="24"/>
-          <w:szCs w:val="24"/>
-        </w:rPr>
-      </w:pPr>
-      <w:r>
-        <w:rPr>
-          <w:sz w:val="24"/>
-          <w:szCs w:val="24"/>
-        </w:rPr>
-        <w:t>o Explicar por qué</w:t>
+        <w:t xml:space="preserve"> Si el objetivo del análisis exige la utilización estricta del producto matricial clásico (fila por columna), la solución técnica consiste en transponer la matriz de ejecuciones antes de realizar la operación. La matriz original C organiza las funciones en sus filas y los servidores en sus columnas. Al aplicar la transpuesta (C^T), invertimos estos ejes de coordenadas, transformando los servidores en filas y las funciones en columnas</w:t>
+      </w:r>
+      <w:r>
+        <w:t xml:space="preserve">. Permitiendo darnos un resultado que nos sirva de utilidad desde un punto de la programación. </w:t>
       </w:r>
     </w:p>
     <w:p>
@@ -4706,13 +4964,6 @@
           <w:szCs w:val="24"/>
         </w:rPr>
       </w:pPr>
-      <w:r>
-        <w:rPr>
-          <w:sz w:val="24"/>
-          <w:szCs w:val="24"/>
-        </w:rPr>
-        <w:t xml:space="preserve">o Proponer una alternativa más adecuada para combinar la información de tiempo y cantidad de ejecuciones (por ejemplo: otra operación o enfoque) </w:t>
-      </w:r>
     </w:p>
     <w:p>
       <w:pPr>
@@ -4749,6 +5000,61 @@
       </w:r>
     </w:p>
     <w:p>
+      <w:r>
+        <w:t xml:space="preserve">Para comprobar si la matriz de tiempos promedio M es simétrica, debemos verificar si se cumple la condición algebraica de que </w:t>
+      </w:r>
+      <w:proofErr w:type="spellStart"/>
+      <w:r>
+        <w:t>sea</w:t>
+      </w:r>
+      <w:proofErr w:type="spellEnd"/>
+      <w:r>
+        <w:t xml:space="preserve"> idéntica a su matriz transpuesta</w:t>
+      </w:r>
+      <w:r>
+        <w:t xml:space="preserve">. </w:t>
+      </w:r>
+      <w:r>
+        <w:t xml:space="preserve">En términos prácticos, esto significa que cada elemento ubicado en la posición fila </w:t>
+      </w:r>
+      <w:proofErr w:type="spellStart"/>
+      <w:r>
+        <w:t>i</w:t>
+      </w:r>
+      <w:proofErr w:type="spellEnd"/>
+      <w:r>
+        <w:t xml:space="preserve">, columna j tendría que reflejar exactamente el mismo valor que el elemento en la posición fila j, columna </w:t>
+      </w:r>
+      <w:proofErr w:type="spellStart"/>
+      <w:r>
+        <w:t>i</w:t>
+      </w:r>
+      <w:proofErr w:type="spellEnd"/>
+      <w:r>
+        <w:t xml:space="preserve">. </w:t>
+      </w:r>
+      <w:r>
+        <w:t xml:space="preserve">Al examinar la estructura de nuestra matriz </w:t>
+      </w:r>
+      <w:r>
+        <w:t>M</w:t>
+      </w:r>
+      <w:r>
+        <w:t xml:space="preserve">, </w:t>
+      </w:r>
+      <w:r>
+        <w:t>se ve de inmediato que esto no se cumple. Si decidimos tomar como referencia la función 2 del servidor 1, veremos que no es el mismo resultado que si tomamos la funcion1 del servidor 2.</w:t>
+      </w:r>
+    </w:p>
+    <w:p>
+      <w:pPr>
+        <w:rPr>
+          <w:sz w:val="24"/>
+          <w:szCs w:val="24"/>
+        </w:rPr>
+      </w:pPr>
+    </w:p>
+    <w:p>
       <w:pPr>
         <w:rPr>
           <w:sz w:val="24"/>
@@ -4764,17 +5070,182 @@
       </w:r>
     </w:p>
     <w:p>
-      <w:pPr>
-        <w:rPr>
-          <w:sz w:val="24"/>
-          <w:szCs w:val="24"/>
-        </w:rPr>
-      </w:pPr>
-      <w:r>
-        <w:rPr>
-          <w:sz w:val="24"/>
-          <w:szCs w:val="24"/>
-        </w:rPr>
+      <w:r>
+        <w:t>Para determinar si la matriz de tiempos promedio M admite una matriz inversa, el primer paso fundamental consiste en evaluar su determinante. Desde el punto de vista del álgebra lineal, una matriz cuadrada es invertible (o regular) si y solo si su determinante es un valor estrictamente distinto de cero</w:t>
+      </w:r>
+      <w:r>
+        <w:t xml:space="preserve">. </w:t>
+      </w:r>
+      <w:r>
+        <w:t>Si este resultado fuera igual a cero, estaríamos ante una matriz singular, lo que algebraicamente delataría una dependencia lineal entre sus componentes y la imposibilidad matemática de hallar su inversa.</w:t>
+      </w:r>
+      <w:r>
+        <w:t xml:space="preserve"> </w:t>
+      </w:r>
+      <w:r>
+        <w:t xml:space="preserve">Para efectuar este análisis, aplicamos la Regla de Sarrus sobre nuestra estructura de orden </w:t>
+      </w:r>
+      <w:r>
+        <w:t>3x3</w:t>
+      </w:r>
+      <w:r>
+        <w:t>, multiplicando los elementos de las diagonales principales y restándoles el producto de las diagonales secundarias. El desarrollo del cálculo se presenta a continuación:</w:t>
+      </w:r>
+    </w:p>
+    <w:p>
+      <w:r>
+        <w:t>Det(M) = (</w:t>
+      </w:r>
+      <w:proofErr w:type="gramStart"/>
+      <w:r>
+        <w:t>120 .</w:t>
+      </w:r>
+      <w:proofErr w:type="gramEnd"/>
+      <w:r>
+        <w:t xml:space="preserve"> </w:t>
+      </w:r>
+      <w:proofErr w:type="gramStart"/>
+      <w:r>
+        <w:t>180 .</w:t>
+      </w:r>
+      <w:proofErr w:type="gramEnd"/>
+      <w:r>
+        <w:t xml:space="preserve"> 95) + (</w:t>
+      </w:r>
+      <w:proofErr w:type="gramStart"/>
+      <w:r>
+        <w:t>150 .</w:t>
+      </w:r>
+      <w:proofErr w:type="gramEnd"/>
+      <w:r>
+        <w:t xml:space="preserve"> </w:t>
+      </w:r>
+      <w:proofErr w:type="gramStart"/>
+      <w:r>
+        <w:t>220 .</w:t>
+      </w:r>
+      <w:proofErr w:type="gramEnd"/>
+      <w:r>
+        <w:t xml:space="preserve"> 90) + (</w:t>
+      </w:r>
+      <w:proofErr w:type="gramStart"/>
+      <w:r>
+        <w:t>100 .</w:t>
+      </w:r>
+      <w:proofErr w:type="gramEnd"/>
+      <w:r>
+        <w:t xml:space="preserve"> </w:t>
+      </w:r>
+      <w:proofErr w:type="gramStart"/>
+      <w:r>
+        <w:t>200 .</w:t>
+      </w:r>
+      <w:proofErr w:type="gramEnd"/>
+      <w:r>
+        <w:t xml:space="preserve"> 110) - </w:t>
+      </w:r>
+      <w:r>
+        <w:t>[</w:t>
+      </w:r>
+      <w:r>
+        <w:t>(</w:t>
+      </w:r>
+      <w:proofErr w:type="gramStart"/>
+      <w:r>
+        <w:t>90 .</w:t>
+      </w:r>
+      <w:proofErr w:type="gramEnd"/>
+      <w:r>
+        <w:t xml:space="preserve"> </w:t>
+      </w:r>
+      <w:proofErr w:type="gramStart"/>
+      <w:r>
+        <w:t>180 .</w:t>
+      </w:r>
+      <w:proofErr w:type="gramEnd"/>
+      <w:r>
+        <w:t xml:space="preserve"> 100) + (</w:t>
+      </w:r>
+      <w:proofErr w:type="gramStart"/>
+      <w:r>
+        <w:t>110 .</w:t>
+      </w:r>
+      <w:proofErr w:type="gramEnd"/>
+      <w:r>
+        <w:t xml:space="preserve"> </w:t>
+      </w:r>
+      <w:proofErr w:type="gramStart"/>
+      <w:r>
+        <w:t>220 .</w:t>
+      </w:r>
+      <w:proofErr w:type="gramEnd"/>
+      <w:r>
+        <w:t xml:space="preserve"> 120) + (</w:t>
+      </w:r>
+      <w:proofErr w:type="gramStart"/>
+      <w:r>
+        <w:t>95 .</w:t>
+      </w:r>
+      <w:proofErr w:type="gramEnd"/>
+      <w:r>
+        <w:t xml:space="preserve"> </w:t>
+      </w:r>
+      <w:proofErr w:type="gramStart"/>
+      <w:r>
+        <w:t>200 .</w:t>
+      </w:r>
+      <w:proofErr w:type="gramEnd"/>
+      <w:r>
+        <w:t xml:space="preserve"> 150)</w:t>
+      </w:r>
+      <w:r>
+        <w:t>]</w:t>
+      </w:r>
+    </w:p>
+    <w:p>
+      <w:r>
+        <w:t>El resultado de las diagonales principales nos da un total de 7.222.00 y de las secundarias un resultado de 7.374.000 ahora al realizar la resta entre ambos componentes obetenemos el valor definitivo determinante.</w:t>
+      </w:r>
+    </w:p>
+    <w:p>
+      <w:r>
+        <w:t>Det(M) = 7.222.00 – 7.374.000 = -152.000</w:t>
+      </w:r>
+    </w:p>
+    <w:p>
+      <w:r>
+        <w:t>Con este resultado nos permite saber también que es posible calcular y obtener la matriz inversa.</w:t>
+      </w:r>
+    </w:p>
+    <w:p>
+      <w:pPr>
+        <w:rPr>
+          <w:sz w:val="24"/>
+          <w:szCs w:val="24"/>
+        </w:rPr>
+      </w:pPr>
+    </w:p>
+    <w:p>
+      <w:pPr>
+        <w:rPr>
+          <w:sz w:val="24"/>
+          <w:szCs w:val="24"/>
+        </w:rPr>
+      </w:pPr>
+    </w:p>
+    <w:p>
+      <w:pPr>
+        <w:rPr>
+          <w:sz w:val="24"/>
+          <w:szCs w:val="24"/>
+        </w:rPr>
+      </w:pPr>
+      <w:r>
+        <w:rPr>
+          <w:sz w:val="24"/>
+          <w:szCs w:val="24"/>
+        </w:rPr>
+        <w:lastRenderedPageBreak/>
         <w:t xml:space="preserve">10. Interpretar: </w:t>
       </w:r>
     </w:p>
@@ -4792,6 +5263,41 @@
         </w:rPr>
         <w:t>• ¿Qué implicaría que la matriz no sea invertible en términos de la información que representa?</w:t>
       </w:r>
+    </w:p>
+    <w:p>
+      <w:r>
+        <w:t xml:space="preserve">Si al realizar el análisis matemático hubiéramos obtenido un determinante igual a cero, la teoría del álgebra lineal nos indicaría que estamos ante una matriz singular y que, por lo tanto, sus filas o columnas son linealmente dependientes entre sí. Es decir que todo resultado seria redundante y predecible, todas las funciones </w:t>
+      </w:r>
+      <w:r>
+        <w:t>serían</w:t>
+      </w:r>
+      <w:r>
+        <w:t xml:space="preserve"> por ejemplo </w:t>
+      </w:r>
+      <w:proofErr w:type="gramStart"/>
+      <w:r>
+        <w:t>un  20</w:t>
+      </w:r>
+      <w:proofErr w:type="gramEnd"/>
+      <w:r>
+        <w:t xml:space="preserve">% mas lentas en un servidor a comparación del otro. Pero al ser una matriz invertible nos dice que cada función se comporta diferente en cada servidor haciendo que </w:t>
+      </w:r>
+      <w:proofErr w:type="spellStart"/>
+      <w:r>
+        <w:t>sea</w:t>
+      </w:r>
+      <w:proofErr w:type="spellEnd"/>
+      <w:r>
+        <w:t xml:space="preserve"> visible que no hay variables ni nada que afecte los servidores de manera diferente.</w:t>
+      </w:r>
+    </w:p>
+    <w:p>
+      <w:pPr>
+        <w:rPr>
+          <w:sz w:val="24"/>
+          <w:szCs w:val="24"/>
+        </w:rPr>
+      </w:pPr>
     </w:p>
     <w:p>
       <w:pPr>
@@ -4868,6 +5374,117 @@
         </w:rPr>
         <w:t xml:space="preserve">• Qué servidor resulta más eficiente </w:t>
       </w:r>
+    </w:p>
+    <w:p>
+      <w:r>
+        <w:t>Para extraer un diagnóstico claro sobre el rendimiento de la infraestructura y entender el comportamiento de nuestra red, realizamos un análisis estadístico calculando los promedios. Evaluamos las filas para analizar el impacto de cada función y las columnas para medir el rendimiento general de cada servidor.</w:t>
+      </w:r>
+      <w:r>
+        <w:t xml:space="preserve"> </w:t>
+      </w:r>
+      <w:r>
+        <w:t>Análisis del costo por función (Filas de la matriz M)</w:t>
+      </w:r>
+      <w:r>
+        <w:t xml:space="preserve"> </w:t>
+      </w:r>
+      <w:r>
+        <w:t xml:space="preserve">Al calcular el tiempo medio que demanda cada tarea a lo largo de los tres nodos, obtenemos </w:t>
+      </w:r>
+      <w:r>
+        <w:t xml:space="preserve">que la función 2 es la que mas demanda en los servidores con una media de 200ms </w:t>
+      </w:r>
+    </w:p>
+    <w:p/>
+    <w:p>
+      <w:r>
+        <w:t xml:space="preserve">Para identificar qué </w:t>
+      </w:r>
+      <w:r>
+        <w:t>servidor</w:t>
+      </w:r>
+      <w:r>
+        <w:t xml:space="preserve"> responde con mayor velocidad de procesamiento frente a las solicitudes, promediamos los tiempos de respuesta de cada máquina</w:t>
+      </w:r>
+      <w:r>
+        <w:t>.</w:t>
+      </w:r>
+    </w:p>
+    <w:p>
+      <w:r>
+        <w:t xml:space="preserve">Dándonos como resultado que el </w:t>
+      </w:r>
+      <w:r>
+        <w:t xml:space="preserve">Servidor 1 es el más eficiente de toda la infraestructura. Al registrar la media de respuesta más baja </w:t>
+      </w:r>
+      <w:r>
+        <w:t xml:space="preserve">(136,67 ms) </w:t>
+      </w:r>
+      <w:r>
+        <w:t>demuestra tener la mejor capacidad de respuesta integral ante la carga de trabajo simulada</w:t>
+      </w:r>
+      <w:r>
+        <w:t xml:space="preserve">. </w:t>
+      </w:r>
+    </w:p>
+    <w:p/>
+    <w:p>
+      <w:r>
+        <w:t>Como recomendaciones sugerimos e</w:t>
+      </w:r>
+      <w:r>
+        <w:t xml:space="preserve">n primer lugar, </w:t>
+      </w:r>
+      <w:r>
+        <w:t>r</w:t>
+      </w:r>
+      <w:r>
+        <w:t>ealizar una optimización a nivel de código de la Función 2 (Procesamiento de datos). Al haber quedado identificada como el cuello de botella principal de toda la red</w:t>
+      </w:r>
+      <w:r>
+        <w:t xml:space="preserve">, </w:t>
+      </w:r>
+      <w:r>
+        <w:t>resulta evidente que su algoritmo base no es eficiente. Proponemos una revisión estructural de esta función (por ejemplo, mejorando la gestión de memoria) para reducir de raíz su tiempo de ejecución estándar.</w:t>
+      </w:r>
+    </w:p>
+    <w:p/>
+    <w:p>
+      <w:r>
+        <w:lastRenderedPageBreak/>
+        <w:t>Otra</w:t>
+      </w:r>
+      <w:r>
+        <w:t xml:space="preserve"> recomendación técnica </w:t>
+      </w:r>
+      <w:r>
+        <w:t xml:space="preserve">que podemos realizar pero orientada a los servidores </w:t>
+      </w:r>
+      <w:r>
+        <w:t xml:space="preserve">es reconfigurar las reglas del balanceador para que desvíe un mayor porcentaje de las solicitudes de la Función 2 directamente hacia el Servidor 1. De esta manera, aprovechamos </w:t>
+      </w:r>
+      <w:r>
+        <w:t>el servidor</w:t>
+      </w:r>
+      <w:r>
+        <w:t xml:space="preserve"> más eficiente </w:t>
+      </w:r>
+      <w:proofErr w:type="gramStart"/>
+      <w:r>
+        <w:t>para absorber</w:t>
+      </w:r>
+      <w:proofErr w:type="gramEnd"/>
+      <w:r>
+        <w:t xml:space="preserve"> el trabajo pesado, aliviando el estrés informático de los servidores 2 y 3, lo que se traducirá en una caída notable en los tiempos de respuesta globales del sistema distribuido.</w:t>
+      </w:r>
+    </w:p>
+    <w:p>
+      <w:pPr>
+        <w:rPr>
+          <w:sz w:val="24"/>
+          <w:szCs w:val="24"/>
+        </w:rPr>
+      </w:pPr>
     </w:p>
     <w:p>
       <w:pPr>
@@ -4958,231 +5575,570 @@
           <w:sz w:val="24"/>
           <w:szCs w:val="24"/>
         </w:rPr>
+        <w:t xml:space="preserve">Uso de librerías externas: </w:t>
+      </w:r>
+    </w:p>
+    <w:p>
+      <w:pPr>
+        <w:rPr>
+          <w:sz w:val="24"/>
+          <w:szCs w:val="24"/>
+        </w:rPr>
+      </w:pPr>
+      <w:r>
+        <w:rPr>
+          <w:sz w:val="24"/>
+          <w:szCs w:val="24"/>
+        </w:rPr>
+        <w:t xml:space="preserve">Se permite, de manera opcional, la utilización de una librería para la generación de gráficos (no vista en la materia), en el marco de un proceso de investigación por parte del estudiante. </w:t>
+      </w:r>
+    </w:p>
+    <w:p>
+      <w:pPr>
+        <w:rPr>
+          <w:sz w:val="24"/>
+          <w:szCs w:val="24"/>
+        </w:rPr>
+      </w:pPr>
+      <w:r>
+        <w:rPr>
+          <w:sz w:val="24"/>
+          <w:szCs w:val="24"/>
+        </w:rPr>
+        <w:t xml:space="preserve">En caso de utilizarla, se deberá justificar: </w:t>
+      </w:r>
+    </w:p>
+    <w:p>
+      <w:pPr>
+        <w:ind w:firstLine="720"/>
+        <w:rPr>
+          <w:sz w:val="24"/>
+          <w:szCs w:val="24"/>
+        </w:rPr>
+      </w:pPr>
+      <w:r>
+        <w:rPr>
+          <w:sz w:val="24"/>
+          <w:szCs w:val="24"/>
+        </w:rPr>
+        <w:t xml:space="preserve">• Por qué se eligió dicha librería </w:t>
+      </w:r>
+    </w:p>
+    <w:p>
+      <w:pPr>
+        <w:ind w:firstLine="720"/>
+        <w:rPr>
+          <w:sz w:val="24"/>
+          <w:szCs w:val="24"/>
+        </w:rPr>
+      </w:pPr>
+      <w:r>
+        <w:rPr>
+          <w:sz w:val="24"/>
+          <w:szCs w:val="24"/>
+        </w:rPr>
+        <w:t xml:space="preserve">• Qué ventajas presenta </w:t>
+      </w:r>
+    </w:p>
+    <w:p>
+      <w:pPr>
+        <w:ind w:firstLine="720"/>
+        <w:rPr>
+          <w:sz w:val="24"/>
+          <w:szCs w:val="24"/>
+        </w:rPr>
+      </w:pPr>
+      <w:r>
+        <w:rPr>
+          <w:sz w:val="24"/>
+          <w:szCs w:val="24"/>
+        </w:rPr>
+        <w:t xml:space="preserve">• Qué desventajas tiene </w:t>
+      </w:r>
+    </w:p>
+    <w:p>
+      <w:pPr>
+        <w:ind w:firstLine="720"/>
+        <w:rPr>
+          <w:sz w:val="24"/>
+          <w:szCs w:val="24"/>
+        </w:rPr>
+      </w:pPr>
+      <w:r>
+        <w:rPr>
+          <w:sz w:val="24"/>
+          <w:szCs w:val="24"/>
+        </w:rPr>
+        <w:t>• Qué otras alternativas existen</w:t>
+      </w:r>
+    </w:p>
+    <w:p>
+      <w:pPr>
+        <w:rPr>
+          <w:sz w:val="24"/>
+          <w:szCs w:val="24"/>
+        </w:rPr>
+      </w:pPr>
+      <w:r>
+        <w:rPr>
+          <w:sz w:val="24"/>
+          <w:szCs w:val="24"/>
+        </w:rPr>
+        <w:t xml:space="preserve"> La implementación principal del trabajo deberá igualmente respetar el uso de estructuras básicas de programación, siendo la librería utilizada únicamente como complemento para la visualización</w:t>
+      </w:r>
+      <w:r>
+        <w:rPr>
+          <w:sz w:val="24"/>
+          <w:szCs w:val="24"/>
+        </w:rPr>
+        <w:t>.</w:t>
+      </w:r>
+    </w:p>
+    <w:p>
+      <w:pPr>
+        <w:rPr>
+          <w:sz w:val="24"/>
+          <w:szCs w:val="24"/>
+        </w:rPr>
+      </w:pPr>
+    </w:p>
+    <w:p>
+      <w:pPr>
+        <w:rPr>
+          <w:sz w:val="24"/>
+          <w:szCs w:val="24"/>
+        </w:rPr>
+      </w:pPr>
+    </w:p>
+    <w:p>
+      <w:pPr>
+        <w:rPr>
+          <w:sz w:val="24"/>
+          <w:szCs w:val="24"/>
+        </w:rPr>
+      </w:pPr>
+      <w:r>
+        <w:rPr>
+          <w:sz w:val="24"/>
+          <w:szCs w:val="24"/>
+        </w:rPr>
+        <w:t># --- Definición de las matrices ---</w:t>
+      </w:r>
+    </w:p>
+    <w:p>
+      <w:pPr>
+        <w:rPr>
+          <w:sz w:val="24"/>
+          <w:szCs w:val="24"/>
+        </w:rPr>
+      </w:pPr>
+    </w:p>
+    <w:p>
+      <w:pPr>
+        <w:rPr>
+          <w:sz w:val="24"/>
+          <w:szCs w:val="24"/>
+        </w:rPr>
+      </w:pPr>
+      <w:r>
+        <w:rPr>
+          <w:sz w:val="24"/>
+          <w:szCs w:val="24"/>
+        </w:rPr>
+        <w:t>M = [</w:t>
+      </w:r>
+    </w:p>
+    <w:p>
+      <w:pPr>
+        <w:rPr>
+          <w:sz w:val="24"/>
+          <w:szCs w:val="24"/>
+        </w:rPr>
+      </w:pPr>
+      <w:r>
+        <w:rPr>
+          <w:sz w:val="24"/>
+          <w:szCs w:val="24"/>
+        </w:rPr>
+        <w:t xml:space="preserve">    [120, 150, 100],</w:t>
+      </w:r>
+    </w:p>
+    <w:p>
+      <w:pPr>
+        <w:rPr>
+          <w:sz w:val="24"/>
+          <w:szCs w:val="24"/>
+        </w:rPr>
+      </w:pPr>
+      <w:r>
+        <w:rPr>
+          <w:sz w:val="24"/>
+          <w:szCs w:val="24"/>
+        </w:rPr>
+        <w:t xml:space="preserve">    [200, 180, 220],</w:t>
+      </w:r>
+    </w:p>
+    <w:p>
+      <w:pPr>
+        <w:rPr>
+          <w:sz w:val="24"/>
+          <w:szCs w:val="24"/>
+        </w:rPr>
+      </w:pPr>
+      <w:r>
+        <w:rPr>
+          <w:sz w:val="24"/>
+          <w:szCs w:val="24"/>
+        </w:rPr>
+        <w:t xml:space="preserve">    [ 90, </w:t>
+      </w:r>
+      <w:proofErr w:type="gramStart"/>
+      <w:r>
+        <w:rPr>
+          <w:sz w:val="24"/>
+          <w:szCs w:val="24"/>
+        </w:rPr>
+        <w:t>110,  95</w:t>
+      </w:r>
+      <w:proofErr w:type="gramEnd"/>
+      <w:r>
+        <w:rPr>
+          <w:sz w:val="24"/>
+          <w:szCs w:val="24"/>
+        </w:rPr>
+        <w:t>]</w:t>
+      </w:r>
+    </w:p>
+    <w:p>
+      <w:pPr>
+        <w:rPr>
+          <w:sz w:val="24"/>
+          <w:szCs w:val="24"/>
+        </w:rPr>
+      </w:pPr>
+      <w:r>
+        <w:rPr>
+          <w:sz w:val="24"/>
+          <w:szCs w:val="24"/>
+        </w:rPr>
+        <w:t>]</w:t>
+      </w:r>
+    </w:p>
+    <w:p>
+      <w:pPr>
+        <w:rPr>
+          <w:sz w:val="24"/>
+          <w:szCs w:val="24"/>
+        </w:rPr>
+      </w:pPr>
+    </w:p>
+    <w:p>
+      <w:pPr>
+        <w:rPr>
+          <w:sz w:val="24"/>
+          <w:szCs w:val="24"/>
+        </w:rPr>
+      </w:pPr>
+      <w:r>
+        <w:rPr>
+          <w:sz w:val="24"/>
+          <w:szCs w:val="24"/>
+        </w:rPr>
+        <w:t>C = [</w:t>
+      </w:r>
+    </w:p>
+    <w:p>
+      <w:pPr>
+        <w:rPr>
+          <w:sz w:val="24"/>
+          <w:szCs w:val="24"/>
+        </w:rPr>
+      </w:pPr>
+      <w:r>
+        <w:rPr>
+          <w:sz w:val="24"/>
+          <w:szCs w:val="24"/>
+        </w:rPr>
+        <w:t xml:space="preserve">    [30, 20, 10],</w:t>
+      </w:r>
+    </w:p>
+    <w:p>
+      <w:pPr>
+        <w:rPr>
+          <w:sz w:val="24"/>
+          <w:szCs w:val="24"/>
+        </w:rPr>
+      </w:pPr>
+      <w:r>
+        <w:rPr>
+          <w:sz w:val="24"/>
+          <w:szCs w:val="24"/>
+        </w:rPr>
+        <w:t xml:space="preserve">    [15, 25, 20],</w:t>
+      </w:r>
+    </w:p>
+    <w:p>
+      <w:pPr>
+        <w:rPr>
+          <w:sz w:val="24"/>
+          <w:szCs w:val="24"/>
+        </w:rPr>
+      </w:pPr>
+      <w:r>
+        <w:rPr>
+          <w:sz w:val="24"/>
+          <w:szCs w:val="24"/>
+        </w:rPr>
+        <w:t xml:space="preserve">    [40, 10, 30]</w:t>
+      </w:r>
+    </w:p>
+    <w:p>
+      <w:pPr>
+        <w:rPr>
+          <w:sz w:val="24"/>
+          <w:szCs w:val="24"/>
+        </w:rPr>
+      </w:pPr>
+      <w:r>
+        <w:rPr>
+          <w:sz w:val="24"/>
+          <w:szCs w:val="24"/>
+        </w:rPr>
+        <w:t>]</w:t>
+      </w:r>
+    </w:p>
+    <w:p>
+      <w:pPr>
+        <w:rPr>
+          <w:sz w:val="24"/>
+          <w:szCs w:val="24"/>
+        </w:rPr>
+      </w:pPr>
+    </w:p>
+    <w:p>
+      <w:pPr>
+        <w:rPr>
+          <w:sz w:val="24"/>
+          <w:szCs w:val="24"/>
+        </w:rPr>
+      </w:pPr>
+      <w:r>
+        <w:rPr>
+          <w:sz w:val="24"/>
+          <w:szCs w:val="24"/>
+        </w:rPr>
+        <w:t>filas    = 3</w:t>
+      </w:r>
+    </w:p>
+    <w:p>
+      <w:pPr>
+        <w:rPr>
+          <w:sz w:val="24"/>
+          <w:szCs w:val="24"/>
+        </w:rPr>
+      </w:pPr>
+      <w:r>
+        <w:rPr>
+          <w:sz w:val="24"/>
+          <w:szCs w:val="24"/>
+        </w:rPr>
+        <w:t>columnas = 3</w:t>
+      </w:r>
+    </w:p>
+    <w:p>
+      <w:pPr>
+        <w:rPr>
+          <w:sz w:val="24"/>
+          <w:szCs w:val="24"/>
+        </w:rPr>
+      </w:pPr>
+    </w:p>
+    <w:p>
+      <w:pPr>
+        <w:rPr>
+          <w:sz w:val="24"/>
+          <w:szCs w:val="24"/>
+        </w:rPr>
+      </w:pPr>
+      <w:r>
+        <w:rPr>
+          <w:sz w:val="24"/>
+          <w:szCs w:val="24"/>
+        </w:rPr>
+        <w:t># ============================================================</w:t>
+      </w:r>
+    </w:p>
+    <w:p>
+      <w:pPr>
+        <w:rPr>
+          <w:sz w:val="24"/>
+          <w:szCs w:val="24"/>
+        </w:rPr>
+      </w:pPr>
+      <w:r>
+        <w:rPr>
+          <w:sz w:val="24"/>
+          <w:szCs w:val="24"/>
+        </w:rPr>
+        <w:t># PARTE B - Punto 3: Tiempos promedio de ejecución</w:t>
+      </w:r>
+    </w:p>
+    <w:p>
+      <w:pPr>
+        <w:rPr>
+          <w:sz w:val="24"/>
+          <w:szCs w:val="24"/>
+        </w:rPr>
+      </w:pPr>
+      <w:r>
+        <w:rPr>
+          <w:sz w:val="24"/>
+          <w:szCs w:val="24"/>
+        </w:rPr>
+        <w:t># ============================================================</w:t>
+      </w:r>
+    </w:p>
+    <w:p>
+      <w:pPr>
+        <w:rPr>
+          <w:sz w:val="24"/>
+          <w:szCs w:val="24"/>
+        </w:rPr>
+      </w:pPr>
+    </w:p>
+    <w:p>
+      <w:pPr>
+        <w:rPr>
+          <w:sz w:val="24"/>
+          <w:szCs w:val="24"/>
+        </w:rPr>
+      </w:pPr>
+      <w:proofErr w:type="gramStart"/>
+      <w:r>
+        <w:rPr>
+          <w:sz w:val="24"/>
+          <w:szCs w:val="24"/>
+        </w:rPr>
+        <w:t>print(</w:t>
+      </w:r>
+      <w:proofErr w:type="gramEnd"/>
+      <w:r>
+        <w:rPr>
+          <w:sz w:val="24"/>
+          <w:szCs w:val="24"/>
+        </w:rPr>
+        <w:t>"=" * 55)</w:t>
+      </w:r>
+    </w:p>
+    <w:p>
+      <w:pPr>
+        <w:rPr>
+          <w:sz w:val="24"/>
+          <w:szCs w:val="24"/>
+        </w:rPr>
+      </w:pPr>
+      <w:proofErr w:type="gramStart"/>
+      <w:r>
+        <w:rPr>
+          <w:sz w:val="24"/>
+          <w:szCs w:val="24"/>
+        </w:rPr>
+        <w:t>print("  PARTE</w:t>
+      </w:r>
+      <w:proofErr w:type="gramEnd"/>
+      <w:r>
+        <w:rPr>
+          <w:sz w:val="24"/>
+          <w:szCs w:val="24"/>
+        </w:rPr>
+        <w:t xml:space="preserve"> B — Tiempos promedio de ejecución")</w:t>
+      </w:r>
+    </w:p>
+    <w:p>
+      <w:pPr>
+        <w:rPr>
+          <w:sz w:val="24"/>
+          <w:szCs w:val="24"/>
+        </w:rPr>
+      </w:pPr>
+      <w:proofErr w:type="gramStart"/>
+      <w:r>
+        <w:rPr>
+          <w:sz w:val="24"/>
+          <w:szCs w:val="24"/>
+        </w:rPr>
+        <w:t>print(</w:t>
+      </w:r>
+      <w:proofErr w:type="gramEnd"/>
+      <w:r>
+        <w:rPr>
+          <w:sz w:val="24"/>
+          <w:szCs w:val="24"/>
+        </w:rPr>
+        <w:t>"=" * 55)</w:t>
+      </w:r>
+    </w:p>
+    <w:p>
+      <w:pPr>
+        <w:rPr>
+          <w:sz w:val="24"/>
+          <w:szCs w:val="24"/>
+        </w:rPr>
+      </w:pPr>
+    </w:p>
+    <w:p>
+      <w:pPr>
+        <w:rPr>
+          <w:sz w:val="24"/>
+          <w:szCs w:val="24"/>
+        </w:rPr>
+      </w:pPr>
+      <w:r>
+        <w:rPr>
+          <w:sz w:val="24"/>
+          <w:szCs w:val="24"/>
+        </w:rPr>
+        <w:t># -- Tiempo promedio por FUNCIÓN (promedio de cada fila de M) --</w:t>
+      </w:r>
+    </w:p>
+    <w:p>
+      <w:pPr>
+        <w:rPr>
+          <w:sz w:val="24"/>
+          <w:szCs w:val="24"/>
+        </w:rPr>
+      </w:pPr>
+      <w:r>
+        <w:rPr>
+          <w:sz w:val="24"/>
+          <w:szCs w:val="24"/>
+        </w:rPr>
         <w:lastRenderedPageBreak/>
-        <w:t xml:space="preserve">Uso de librerías externas: </w:t>
-      </w:r>
-    </w:p>
-    <w:p>
-      <w:pPr>
-        <w:rPr>
-          <w:sz w:val="24"/>
-          <w:szCs w:val="24"/>
-        </w:rPr>
-      </w:pPr>
-      <w:r>
-        <w:rPr>
-          <w:sz w:val="24"/>
-          <w:szCs w:val="24"/>
-        </w:rPr>
-        <w:t xml:space="preserve">Se permite, de manera opcional, la utilización de una librería para la generación de gráficos (no vista en la materia), en el marco de un proceso de investigación por parte del estudiante. </w:t>
-      </w:r>
-    </w:p>
-    <w:p>
-      <w:pPr>
-        <w:rPr>
-          <w:sz w:val="24"/>
-          <w:szCs w:val="24"/>
-        </w:rPr>
-      </w:pPr>
-      <w:r>
-        <w:rPr>
-          <w:sz w:val="24"/>
-          <w:szCs w:val="24"/>
-        </w:rPr>
-        <w:t xml:space="preserve">En caso de utilizarla, se deberá justificar: </w:t>
-      </w:r>
-    </w:p>
-    <w:p>
-      <w:pPr>
-        <w:ind w:firstLine="720"/>
-        <w:rPr>
-          <w:sz w:val="24"/>
-          <w:szCs w:val="24"/>
-        </w:rPr>
-      </w:pPr>
-      <w:r>
-        <w:rPr>
-          <w:sz w:val="24"/>
-          <w:szCs w:val="24"/>
-        </w:rPr>
-        <w:t xml:space="preserve">• Por qué se eligió dicha librería </w:t>
-      </w:r>
-    </w:p>
-    <w:p>
-      <w:pPr>
-        <w:ind w:firstLine="720"/>
-        <w:rPr>
-          <w:sz w:val="24"/>
-          <w:szCs w:val="24"/>
-        </w:rPr>
-      </w:pPr>
-      <w:r>
-        <w:rPr>
-          <w:sz w:val="24"/>
-          <w:szCs w:val="24"/>
-        </w:rPr>
-        <w:t xml:space="preserve">• Qué ventajas presenta </w:t>
-      </w:r>
-    </w:p>
-    <w:p>
-      <w:pPr>
-        <w:ind w:firstLine="720"/>
-        <w:rPr>
-          <w:sz w:val="24"/>
-          <w:szCs w:val="24"/>
-        </w:rPr>
-      </w:pPr>
-      <w:r>
-        <w:rPr>
-          <w:sz w:val="24"/>
-          <w:szCs w:val="24"/>
-        </w:rPr>
-        <w:t xml:space="preserve">• Qué desventajas tiene </w:t>
-      </w:r>
-    </w:p>
-    <w:p>
-      <w:pPr>
-        <w:ind w:firstLine="720"/>
-        <w:rPr>
-          <w:sz w:val="24"/>
-          <w:szCs w:val="24"/>
-        </w:rPr>
-      </w:pPr>
-      <w:r>
-        <w:rPr>
-          <w:sz w:val="24"/>
-          <w:szCs w:val="24"/>
-        </w:rPr>
-        <w:t>• Qué otras alternativas existen</w:t>
-      </w:r>
-    </w:p>
-    <w:p>
-      <w:pPr>
-        <w:rPr>
-          <w:sz w:val="24"/>
-          <w:szCs w:val="24"/>
-        </w:rPr>
-      </w:pPr>
-      <w:r>
-        <w:rPr>
-          <w:sz w:val="24"/>
-          <w:szCs w:val="24"/>
-        </w:rPr>
-        <w:t xml:space="preserve"> La implementación principal del trabajo deberá igualmente respetar el uso de estructuras básicas de programación, siendo la librería utilizada únicamente como complemento para la visualización</w:t>
-      </w:r>
-      <w:r>
-        <w:rPr>
-          <w:sz w:val="24"/>
-          <w:szCs w:val="24"/>
-        </w:rPr>
-        <w:t>.</w:t>
-      </w:r>
-    </w:p>
-    <w:p>
-      <w:pPr>
-        <w:rPr>
-          <w:sz w:val="24"/>
-          <w:szCs w:val="24"/>
-        </w:rPr>
-      </w:pPr>
-    </w:p>
-    <w:p>
-      <w:pPr>
-        <w:rPr>
-          <w:sz w:val="24"/>
-          <w:szCs w:val="24"/>
-        </w:rPr>
-      </w:pPr>
-    </w:p>
-    <w:p>
-      <w:pPr>
-        <w:rPr>
-          <w:sz w:val="24"/>
-          <w:szCs w:val="24"/>
-        </w:rPr>
-      </w:pPr>
-      <w:r>
-        <w:rPr>
-          <w:sz w:val="24"/>
-          <w:szCs w:val="24"/>
-        </w:rPr>
-        <w:t># --- Definición de las matrices ---</w:t>
-      </w:r>
-    </w:p>
-    <w:p>
-      <w:pPr>
-        <w:rPr>
-          <w:sz w:val="24"/>
-          <w:szCs w:val="24"/>
-        </w:rPr>
-      </w:pPr>
-    </w:p>
-    <w:p>
-      <w:pPr>
-        <w:rPr>
-          <w:sz w:val="24"/>
-          <w:szCs w:val="24"/>
-        </w:rPr>
-      </w:pPr>
-      <w:r>
-        <w:rPr>
-          <w:sz w:val="24"/>
-          <w:szCs w:val="24"/>
-        </w:rPr>
-        <w:t>M = [</w:t>
-      </w:r>
-    </w:p>
-    <w:p>
-      <w:pPr>
-        <w:rPr>
-          <w:sz w:val="24"/>
-          <w:szCs w:val="24"/>
-        </w:rPr>
-      </w:pPr>
-      <w:r>
-        <w:rPr>
-          <w:sz w:val="24"/>
-          <w:szCs w:val="24"/>
-        </w:rPr>
-        <w:t xml:space="preserve">    [120, 150, 100],</w:t>
-      </w:r>
-    </w:p>
-    <w:p>
-      <w:pPr>
-        <w:rPr>
-          <w:sz w:val="24"/>
-          <w:szCs w:val="24"/>
-        </w:rPr>
-      </w:pPr>
-      <w:r>
-        <w:rPr>
-          <w:sz w:val="24"/>
-          <w:szCs w:val="24"/>
-        </w:rPr>
-        <w:t xml:space="preserve">    [200, 180, 220],</w:t>
-      </w:r>
-    </w:p>
-    <w:p>
-      <w:pPr>
-        <w:rPr>
-          <w:sz w:val="24"/>
-          <w:szCs w:val="24"/>
-        </w:rPr>
-      </w:pPr>
-      <w:r>
-        <w:rPr>
-          <w:sz w:val="24"/>
-          <w:szCs w:val="24"/>
-        </w:rPr>
-        <w:t xml:space="preserve">    [ 90, </w:t>
-      </w:r>
+        <w:t>funciones = ["Autenticación", "Procesamiento de datos", "Generación de reportes"]</w:t>
+      </w:r>
+    </w:p>
+    <w:p>
+      <w:pPr>
+        <w:rPr>
+          <w:sz w:val="24"/>
+          <w:szCs w:val="24"/>
+        </w:rPr>
+      </w:pPr>
+    </w:p>
+    <w:p>
+      <w:pPr>
+        <w:rPr>
+          <w:sz w:val="24"/>
+          <w:szCs w:val="24"/>
+        </w:rPr>
+      </w:pPr>
       <w:proofErr w:type="gramStart"/>
       <w:r>
         <w:rPr>
           <w:sz w:val="24"/>
           <w:szCs w:val="24"/>
         </w:rPr>
-        <w:t>110,  95</w:t>
+        <w:t>print(</w:t>
       </w:r>
       <w:proofErr w:type="gramEnd"/>
       <w:r>
@@ -5190,928 +6146,556 @@
           <w:sz w:val="24"/>
           <w:szCs w:val="24"/>
         </w:rPr>
-        <w:t>]</w:t>
-      </w:r>
-    </w:p>
-    <w:p>
-      <w:pPr>
-        <w:rPr>
-          <w:sz w:val="24"/>
-          <w:szCs w:val="24"/>
-        </w:rPr>
-      </w:pPr>
-      <w:r>
-        <w:rPr>
-          <w:sz w:val="24"/>
-          <w:szCs w:val="24"/>
-        </w:rPr>
-        <w:t>]</w:t>
-      </w:r>
-    </w:p>
-    <w:p>
-      <w:pPr>
-        <w:rPr>
-          <w:sz w:val="24"/>
-          <w:szCs w:val="24"/>
-        </w:rPr>
-      </w:pPr>
-    </w:p>
-    <w:p>
-      <w:pPr>
-        <w:rPr>
-          <w:sz w:val="24"/>
-          <w:szCs w:val="24"/>
-        </w:rPr>
-      </w:pPr>
-      <w:r>
-        <w:rPr>
-          <w:sz w:val="24"/>
-          <w:szCs w:val="24"/>
-        </w:rPr>
-        <w:t>C = [</w:t>
-      </w:r>
-    </w:p>
-    <w:p>
-      <w:pPr>
-        <w:rPr>
-          <w:sz w:val="24"/>
-          <w:szCs w:val="24"/>
-        </w:rPr>
-      </w:pPr>
-      <w:r>
-        <w:rPr>
-          <w:sz w:val="24"/>
-          <w:szCs w:val="24"/>
-        </w:rPr>
-        <w:t xml:space="preserve">    [30, 20, 10],</w:t>
-      </w:r>
-    </w:p>
-    <w:p>
-      <w:pPr>
-        <w:rPr>
-          <w:sz w:val="24"/>
-          <w:szCs w:val="24"/>
-        </w:rPr>
-      </w:pPr>
-      <w:r>
-        <w:rPr>
-          <w:sz w:val="24"/>
-          <w:szCs w:val="24"/>
-        </w:rPr>
-        <w:t xml:space="preserve">    [15, 25, 20],</w:t>
-      </w:r>
-    </w:p>
-    <w:p>
-      <w:pPr>
-        <w:rPr>
-          <w:sz w:val="24"/>
-          <w:szCs w:val="24"/>
-        </w:rPr>
-      </w:pPr>
-      <w:r>
-        <w:rPr>
-          <w:sz w:val="24"/>
-          <w:szCs w:val="24"/>
-        </w:rPr>
-        <w:t xml:space="preserve">    [40, 10, 30]</w:t>
-      </w:r>
-    </w:p>
-    <w:p>
-      <w:pPr>
-        <w:rPr>
-          <w:sz w:val="24"/>
-          <w:szCs w:val="24"/>
-        </w:rPr>
-      </w:pPr>
-      <w:r>
-        <w:rPr>
-          <w:sz w:val="24"/>
-          <w:szCs w:val="24"/>
-        </w:rPr>
-        <w:t>]</w:t>
-      </w:r>
-    </w:p>
-    <w:p>
-      <w:pPr>
-        <w:rPr>
-          <w:sz w:val="24"/>
-          <w:szCs w:val="24"/>
-        </w:rPr>
-      </w:pPr>
-    </w:p>
-    <w:p>
-      <w:pPr>
-        <w:rPr>
-          <w:sz w:val="24"/>
-          <w:szCs w:val="24"/>
-        </w:rPr>
-      </w:pPr>
-      <w:r>
-        <w:rPr>
-          <w:sz w:val="24"/>
-          <w:szCs w:val="24"/>
-        </w:rPr>
-        <w:t>filas    = 3</w:t>
-      </w:r>
-    </w:p>
-    <w:p>
-      <w:pPr>
-        <w:rPr>
-          <w:sz w:val="24"/>
-          <w:szCs w:val="24"/>
-        </w:rPr>
-      </w:pPr>
+        <w:t>"\n</w:t>
+      </w:r>
+      <w:r>
+        <w:rPr>
+          <w:rFonts w:ascii="Segoe UI Emoji" w:hAnsi="Segoe UI Emoji" w:cs="Segoe UI Emoji"/>
+          <w:sz w:val="24"/>
+          <w:szCs w:val="24"/>
+        </w:rPr>
+        <w:t>📌</w:t>
+      </w:r>
+      <w:r>
+        <w:rPr>
+          <w:sz w:val="24"/>
+          <w:szCs w:val="24"/>
+        </w:rPr>
+        <w:t xml:space="preserve"> Tiempo promedio de ejecución por función (fila de M):")</w:t>
+      </w:r>
+    </w:p>
+    <w:p>
+      <w:pPr>
+        <w:rPr>
+          <w:sz w:val="24"/>
+          <w:szCs w:val="24"/>
+        </w:rPr>
+      </w:pPr>
+      <w:r>
+        <w:rPr>
+          <w:sz w:val="24"/>
+          <w:szCs w:val="24"/>
+        </w:rPr>
+        <w:t xml:space="preserve">for </w:t>
+      </w:r>
+      <w:proofErr w:type="spellStart"/>
+      <w:r>
+        <w:rPr>
+          <w:sz w:val="24"/>
+          <w:szCs w:val="24"/>
+        </w:rPr>
+        <w:t>i</w:t>
+      </w:r>
+      <w:proofErr w:type="spellEnd"/>
+      <w:r>
+        <w:rPr>
+          <w:sz w:val="24"/>
+          <w:szCs w:val="24"/>
+        </w:rPr>
+        <w:t xml:space="preserve"> in range(filas):</w:t>
+      </w:r>
+    </w:p>
+    <w:p>
+      <w:pPr>
+        <w:rPr>
+          <w:sz w:val="24"/>
+          <w:szCs w:val="24"/>
+        </w:rPr>
+      </w:pPr>
+      <w:r>
+        <w:rPr>
+          <w:sz w:val="24"/>
+          <w:szCs w:val="24"/>
+        </w:rPr>
+        <w:t xml:space="preserve">    suma = 0</w:t>
+      </w:r>
+    </w:p>
+    <w:p>
+      <w:pPr>
+        <w:rPr>
+          <w:sz w:val="24"/>
+          <w:szCs w:val="24"/>
+        </w:rPr>
+      </w:pPr>
+      <w:r>
+        <w:rPr>
+          <w:sz w:val="24"/>
+          <w:szCs w:val="24"/>
+        </w:rPr>
+        <w:t xml:space="preserve">    for j in range(columnas):</w:t>
+      </w:r>
+    </w:p>
+    <w:p>
+      <w:pPr>
+        <w:rPr>
+          <w:sz w:val="24"/>
+          <w:szCs w:val="24"/>
+        </w:rPr>
+      </w:pPr>
+      <w:r>
+        <w:rPr>
+          <w:sz w:val="24"/>
+          <w:szCs w:val="24"/>
+        </w:rPr>
+        <w:t xml:space="preserve">        suma += M[</w:t>
+      </w:r>
+      <w:proofErr w:type="spellStart"/>
+      <w:r>
+        <w:rPr>
+          <w:sz w:val="24"/>
+          <w:szCs w:val="24"/>
+        </w:rPr>
+        <w:t>i</w:t>
+      </w:r>
+      <w:proofErr w:type="spellEnd"/>
+      <w:r>
+        <w:rPr>
+          <w:sz w:val="24"/>
+          <w:szCs w:val="24"/>
+        </w:rPr>
+        <w:t>][j]</w:t>
+      </w:r>
+    </w:p>
+    <w:p>
+      <w:pPr>
+        <w:rPr>
+          <w:sz w:val="24"/>
+          <w:szCs w:val="24"/>
+        </w:rPr>
+      </w:pPr>
+      <w:r>
+        <w:rPr>
+          <w:sz w:val="24"/>
+          <w:szCs w:val="24"/>
+        </w:rPr>
+        <w:t xml:space="preserve">    promedio = suma / columnas</w:t>
+      </w:r>
+    </w:p>
+    <w:p>
+      <w:pPr>
+        <w:rPr>
+          <w:sz w:val="24"/>
+          <w:szCs w:val="24"/>
+        </w:rPr>
+      </w:pPr>
+      <w:r>
+        <w:rPr>
+          <w:sz w:val="24"/>
+          <w:szCs w:val="24"/>
+        </w:rPr>
+        <w:t xml:space="preserve">    </w:t>
+      </w:r>
+      <w:proofErr w:type="gramStart"/>
+      <w:r>
+        <w:rPr>
+          <w:sz w:val="24"/>
+          <w:szCs w:val="24"/>
+        </w:rPr>
+        <w:t>print(</w:t>
+      </w:r>
+      <w:proofErr w:type="gramEnd"/>
+      <w:r>
+        <w:rPr>
+          <w:sz w:val="24"/>
+          <w:szCs w:val="24"/>
+        </w:rPr>
+        <w:t>f</w:t>
+      </w:r>
+      <w:proofErr w:type="gramStart"/>
+      <w:r>
+        <w:rPr>
+          <w:sz w:val="24"/>
+          <w:szCs w:val="24"/>
+        </w:rPr>
+        <w:t>"  {</w:t>
+      </w:r>
+      <w:proofErr w:type="gramEnd"/>
+      <w:r>
+        <w:rPr>
+          <w:sz w:val="24"/>
+          <w:szCs w:val="24"/>
+        </w:rPr>
+        <w:t>funciones[</w:t>
+      </w:r>
+      <w:proofErr w:type="spellStart"/>
+      <w:r>
+        <w:rPr>
+          <w:sz w:val="24"/>
+          <w:szCs w:val="24"/>
+        </w:rPr>
+        <w:t>i</w:t>
+      </w:r>
+      <w:proofErr w:type="spellEnd"/>
+      <w:r>
+        <w:rPr>
+          <w:sz w:val="24"/>
+          <w:szCs w:val="24"/>
+        </w:rPr>
+        <w:t>]}: {promedio:.2f} ms")</w:t>
+      </w:r>
+    </w:p>
+    <w:p>
+      <w:pPr>
+        <w:rPr>
+          <w:sz w:val="24"/>
+          <w:szCs w:val="24"/>
+        </w:rPr>
+      </w:pPr>
+    </w:p>
+    <w:p>
+      <w:pPr>
+        <w:rPr>
+          <w:sz w:val="24"/>
+          <w:szCs w:val="24"/>
+        </w:rPr>
+      </w:pPr>
+      <w:r>
+        <w:rPr>
+          <w:sz w:val="24"/>
+          <w:szCs w:val="24"/>
+        </w:rPr>
+        <w:t># -- Tiempo promedio por SERVIDOR (promedio de cada columna de M) --</w:t>
+      </w:r>
+    </w:p>
+    <w:p>
+      <w:pPr>
+        <w:rPr>
+          <w:sz w:val="24"/>
+          <w:szCs w:val="24"/>
+        </w:rPr>
+      </w:pPr>
+      <w:r>
+        <w:rPr>
+          <w:sz w:val="24"/>
+          <w:szCs w:val="24"/>
+        </w:rPr>
+        <w:t>servidores = ["Servidor 1", "Servidor 2", "Servidor 3"]</w:t>
+      </w:r>
+    </w:p>
+    <w:p>
+      <w:pPr>
+        <w:rPr>
+          <w:sz w:val="24"/>
+          <w:szCs w:val="24"/>
+        </w:rPr>
+      </w:pPr>
+    </w:p>
+    <w:p>
+      <w:pPr>
+        <w:rPr>
+          <w:sz w:val="24"/>
+          <w:szCs w:val="24"/>
+        </w:rPr>
+      </w:pPr>
+      <w:proofErr w:type="gramStart"/>
+      <w:r>
+        <w:rPr>
+          <w:sz w:val="24"/>
+          <w:szCs w:val="24"/>
+        </w:rPr>
+        <w:t>print(</w:t>
+      </w:r>
+      <w:proofErr w:type="gramEnd"/>
+      <w:r>
+        <w:rPr>
+          <w:sz w:val="24"/>
+          <w:szCs w:val="24"/>
+        </w:rPr>
+        <w:t>"\n</w:t>
+      </w:r>
+      <w:r>
+        <w:rPr>
+          <w:rFonts w:ascii="Segoe UI Emoji" w:hAnsi="Segoe UI Emoji" w:cs="Segoe UI Emoji"/>
+          <w:sz w:val="24"/>
+          <w:szCs w:val="24"/>
+        </w:rPr>
+        <w:t>📌</w:t>
+      </w:r>
+      <w:r>
+        <w:rPr>
+          <w:sz w:val="24"/>
+          <w:szCs w:val="24"/>
+        </w:rPr>
+        <w:t xml:space="preserve"> Tiempo promedio de ejecución por servidor (columna de M):")</w:t>
+      </w:r>
+    </w:p>
+    <w:p>
+      <w:pPr>
+        <w:rPr>
+          <w:sz w:val="24"/>
+          <w:szCs w:val="24"/>
+        </w:rPr>
+      </w:pPr>
+      <w:r>
+        <w:rPr>
+          <w:sz w:val="24"/>
+          <w:szCs w:val="24"/>
+        </w:rPr>
+        <w:t>for j in range(columnas):</w:t>
+      </w:r>
+    </w:p>
+    <w:p>
+      <w:pPr>
+        <w:rPr>
+          <w:sz w:val="24"/>
+          <w:szCs w:val="24"/>
+        </w:rPr>
+      </w:pPr>
+      <w:r>
+        <w:rPr>
+          <w:sz w:val="24"/>
+          <w:szCs w:val="24"/>
+        </w:rPr>
+        <w:t xml:space="preserve">    suma = 0</w:t>
+      </w:r>
+    </w:p>
+    <w:p>
+      <w:pPr>
+        <w:rPr>
+          <w:sz w:val="24"/>
+          <w:szCs w:val="24"/>
+        </w:rPr>
+      </w:pPr>
+      <w:r>
+        <w:rPr>
+          <w:sz w:val="24"/>
+          <w:szCs w:val="24"/>
+        </w:rPr>
+        <w:t xml:space="preserve">    for </w:t>
+      </w:r>
+      <w:proofErr w:type="spellStart"/>
+      <w:r>
+        <w:rPr>
+          <w:sz w:val="24"/>
+          <w:szCs w:val="24"/>
+        </w:rPr>
+        <w:t>i</w:t>
+      </w:r>
+      <w:proofErr w:type="spellEnd"/>
+      <w:r>
+        <w:rPr>
+          <w:sz w:val="24"/>
+          <w:szCs w:val="24"/>
+        </w:rPr>
+        <w:t xml:space="preserve"> in range(filas):</w:t>
+      </w:r>
+    </w:p>
+    <w:p>
+      <w:pPr>
+        <w:rPr>
+          <w:sz w:val="24"/>
+          <w:szCs w:val="24"/>
+        </w:rPr>
+      </w:pPr>
+      <w:r>
+        <w:rPr>
+          <w:sz w:val="24"/>
+          <w:szCs w:val="24"/>
+        </w:rPr>
+        <w:t xml:space="preserve">        suma += M[</w:t>
+      </w:r>
+      <w:proofErr w:type="spellStart"/>
+      <w:r>
+        <w:rPr>
+          <w:sz w:val="24"/>
+          <w:szCs w:val="24"/>
+        </w:rPr>
+        <w:t>i</w:t>
+      </w:r>
+      <w:proofErr w:type="spellEnd"/>
+      <w:r>
+        <w:rPr>
+          <w:sz w:val="24"/>
+          <w:szCs w:val="24"/>
+        </w:rPr>
+        <w:t>][j]</w:t>
+      </w:r>
+    </w:p>
+    <w:p>
+      <w:pPr>
+        <w:rPr>
+          <w:sz w:val="24"/>
+          <w:szCs w:val="24"/>
+        </w:rPr>
+      </w:pPr>
+      <w:r>
+        <w:rPr>
+          <w:sz w:val="24"/>
+          <w:szCs w:val="24"/>
+        </w:rPr>
+        <w:t xml:space="preserve">    promedio = suma / filas</w:t>
+      </w:r>
+    </w:p>
+    <w:p>
+      <w:pPr>
+        <w:rPr>
+          <w:sz w:val="24"/>
+          <w:szCs w:val="24"/>
+        </w:rPr>
+      </w:pPr>
+      <w:r>
+        <w:rPr>
+          <w:sz w:val="24"/>
+          <w:szCs w:val="24"/>
+        </w:rPr>
+        <w:t xml:space="preserve">    </w:t>
+      </w:r>
+      <w:proofErr w:type="gramStart"/>
+      <w:r>
+        <w:rPr>
+          <w:sz w:val="24"/>
+          <w:szCs w:val="24"/>
+        </w:rPr>
+        <w:t>print(</w:t>
+      </w:r>
+      <w:proofErr w:type="gramEnd"/>
+      <w:r>
+        <w:rPr>
+          <w:sz w:val="24"/>
+          <w:szCs w:val="24"/>
+        </w:rPr>
+        <w:t>f</w:t>
+      </w:r>
+      <w:proofErr w:type="gramStart"/>
+      <w:r>
+        <w:rPr>
+          <w:sz w:val="24"/>
+          <w:szCs w:val="24"/>
+        </w:rPr>
+        <w:t>"  {</w:t>
+      </w:r>
+      <w:proofErr w:type="gramEnd"/>
+      <w:r>
+        <w:rPr>
+          <w:sz w:val="24"/>
+          <w:szCs w:val="24"/>
+        </w:rPr>
+        <w:t>servidores[j]}: {promedio:.2f} ms")</w:t>
+      </w:r>
+    </w:p>
+    <w:p>
+      <w:pPr>
+        <w:rPr>
+          <w:sz w:val="24"/>
+          <w:szCs w:val="24"/>
+        </w:rPr>
+      </w:pPr>
+    </w:p>
+    <w:p>
+      <w:pPr>
+        <w:rPr>
+          <w:sz w:val="24"/>
+          <w:szCs w:val="24"/>
+        </w:rPr>
+      </w:pPr>
+      <w:r>
+        <w:rPr>
+          <w:sz w:val="24"/>
+          <w:szCs w:val="24"/>
+        </w:rPr>
+        <w:t># ============================================================</w:t>
+      </w:r>
+    </w:p>
+    <w:p>
+      <w:pPr>
+        <w:rPr>
+          <w:sz w:val="24"/>
+          <w:szCs w:val="24"/>
+        </w:rPr>
+      </w:pPr>
+      <w:r>
+        <w:rPr>
+          <w:sz w:val="24"/>
+          <w:szCs w:val="24"/>
+        </w:rPr>
+        <w:t># PARTE B - Punto 4: Transpuesta de M</w:t>
+      </w:r>
+    </w:p>
+    <w:p>
+      <w:pPr>
+        <w:rPr>
+          <w:sz w:val="24"/>
+          <w:szCs w:val="24"/>
+        </w:rPr>
+      </w:pPr>
+      <w:r>
+        <w:rPr>
+          <w:sz w:val="24"/>
+          <w:szCs w:val="24"/>
+        </w:rPr>
+        <w:t># ============================================================</w:t>
+      </w:r>
+    </w:p>
+    <w:p>
+      <w:pPr>
+        <w:rPr>
+          <w:sz w:val="24"/>
+          <w:szCs w:val="24"/>
+        </w:rPr>
+      </w:pPr>
+    </w:p>
+    <w:p>
+      <w:pPr>
+        <w:rPr>
+          <w:sz w:val="24"/>
+          <w:szCs w:val="24"/>
+        </w:rPr>
+      </w:pPr>
+      <w:proofErr w:type="gramStart"/>
+      <w:r>
+        <w:rPr>
+          <w:sz w:val="24"/>
+          <w:szCs w:val="24"/>
+        </w:rPr>
+        <w:t>print(</w:t>
+      </w:r>
+      <w:proofErr w:type="gramEnd"/>
+      <w:r>
+        <w:rPr>
+          <w:sz w:val="24"/>
+          <w:szCs w:val="24"/>
+        </w:rPr>
+        <w:t>"\n" + "=" * 55)</w:t>
+      </w:r>
+    </w:p>
+    <w:p>
+      <w:pPr>
+        <w:rPr>
+          <w:sz w:val="24"/>
+          <w:szCs w:val="24"/>
+        </w:rPr>
+      </w:pPr>
+      <w:proofErr w:type="gramStart"/>
+      <w:r>
+        <w:rPr>
+          <w:sz w:val="24"/>
+          <w:szCs w:val="24"/>
+        </w:rPr>
+        <w:t>print("  PARTE</w:t>
+      </w:r>
+      <w:proofErr w:type="gramEnd"/>
+      <w:r>
+        <w:rPr>
+          <w:sz w:val="24"/>
+          <w:szCs w:val="24"/>
+        </w:rPr>
+        <w:t xml:space="preserve"> B — Transpuesta de M")</w:t>
+      </w:r>
+    </w:p>
+    <w:p>
+      <w:pPr>
+        <w:rPr>
+          <w:sz w:val="24"/>
+          <w:szCs w:val="24"/>
+        </w:rPr>
+      </w:pPr>
+      <w:proofErr w:type="gramStart"/>
       <w:r>
         <w:rPr>
           <w:sz w:val="24"/>
           <w:szCs w:val="24"/>
         </w:rPr>
         <w:lastRenderedPageBreak/>
-        <w:t>columnas = 3</w:t>
-      </w:r>
-    </w:p>
-    <w:p>
-      <w:pPr>
-        <w:rPr>
-          <w:sz w:val="24"/>
-          <w:szCs w:val="24"/>
-        </w:rPr>
-      </w:pPr>
-    </w:p>
-    <w:p>
-      <w:pPr>
-        <w:rPr>
-          <w:sz w:val="24"/>
-          <w:szCs w:val="24"/>
-        </w:rPr>
-      </w:pPr>
-      <w:r>
-        <w:rPr>
-          <w:sz w:val="24"/>
-          <w:szCs w:val="24"/>
-        </w:rPr>
-        <w:t># ============================================================</w:t>
-      </w:r>
-    </w:p>
-    <w:p>
-      <w:pPr>
-        <w:rPr>
-          <w:sz w:val="24"/>
-          <w:szCs w:val="24"/>
-        </w:rPr>
-      </w:pPr>
-      <w:r>
-        <w:rPr>
-          <w:sz w:val="24"/>
-          <w:szCs w:val="24"/>
-        </w:rPr>
-        <w:t># PARTE B - Punto 3: Tiempos promedio de ejecución</w:t>
-      </w:r>
-    </w:p>
-    <w:p>
-      <w:pPr>
-        <w:rPr>
-          <w:sz w:val="24"/>
-          <w:szCs w:val="24"/>
-        </w:rPr>
-      </w:pPr>
-      <w:r>
-        <w:rPr>
-          <w:sz w:val="24"/>
-          <w:szCs w:val="24"/>
-        </w:rPr>
-        <w:t># ============================================================</w:t>
-      </w:r>
-    </w:p>
-    <w:p>
-      <w:pPr>
-        <w:rPr>
-          <w:sz w:val="24"/>
-          <w:szCs w:val="24"/>
-        </w:rPr>
-      </w:pPr>
-    </w:p>
-    <w:p>
-      <w:pPr>
-        <w:rPr>
-          <w:sz w:val="24"/>
-          <w:szCs w:val="24"/>
-        </w:rPr>
-      </w:pPr>
-      <w:proofErr w:type="gramStart"/>
-      <w:r>
-        <w:rPr>
-          <w:sz w:val="24"/>
-          <w:szCs w:val="24"/>
-        </w:rPr>
-        <w:t>print(</w:t>
-      </w:r>
-      <w:proofErr w:type="gramEnd"/>
-      <w:r>
-        <w:rPr>
-          <w:sz w:val="24"/>
-          <w:szCs w:val="24"/>
-        </w:rPr>
-        <w:t>"=" * 55)</w:t>
-      </w:r>
-    </w:p>
-    <w:p>
-      <w:pPr>
-        <w:rPr>
-          <w:sz w:val="24"/>
-          <w:szCs w:val="24"/>
-        </w:rPr>
-      </w:pPr>
-      <w:proofErr w:type="gramStart"/>
-      <w:r>
-        <w:rPr>
-          <w:sz w:val="24"/>
-          <w:szCs w:val="24"/>
-        </w:rPr>
-        <w:t>print("  PARTE</w:t>
-      </w:r>
-      <w:proofErr w:type="gramEnd"/>
-      <w:r>
-        <w:rPr>
-          <w:sz w:val="24"/>
-          <w:szCs w:val="24"/>
-        </w:rPr>
-        <w:t xml:space="preserve"> B — Tiempos promedio de ejecución")</w:t>
-      </w:r>
-    </w:p>
-    <w:p>
-      <w:pPr>
-        <w:rPr>
-          <w:sz w:val="24"/>
-          <w:szCs w:val="24"/>
-        </w:rPr>
-      </w:pPr>
-      <w:proofErr w:type="gramStart"/>
-      <w:r>
-        <w:rPr>
-          <w:sz w:val="24"/>
-          <w:szCs w:val="24"/>
-        </w:rPr>
-        <w:t>print(</w:t>
-      </w:r>
-      <w:proofErr w:type="gramEnd"/>
-      <w:r>
-        <w:rPr>
-          <w:sz w:val="24"/>
-          <w:szCs w:val="24"/>
-        </w:rPr>
-        <w:t>"=" * 55)</w:t>
-      </w:r>
-    </w:p>
-    <w:p>
-      <w:pPr>
-        <w:rPr>
-          <w:sz w:val="24"/>
-          <w:szCs w:val="24"/>
-        </w:rPr>
-      </w:pPr>
-    </w:p>
-    <w:p>
-      <w:pPr>
-        <w:rPr>
-          <w:sz w:val="24"/>
-          <w:szCs w:val="24"/>
-        </w:rPr>
-      </w:pPr>
-      <w:r>
-        <w:rPr>
-          <w:sz w:val="24"/>
-          <w:szCs w:val="24"/>
-        </w:rPr>
-        <w:t># -- Tiempo promedio por FUNCIÓN (promedio de cada fila de M) --</w:t>
-      </w:r>
-    </w:p>
-    <w:p>
-      <w:pPr>
-        <w:rPr>
-          <w:sz w:val="24"/>
-          <w:szCs w:val="24"/>
-        </w:rPr>
-      </w:pPr>
-      <w:r>
-        <w:rPr>
-          <w:sz w:val="24"/>
-          <w:szCs w:val="24"/>
-        </w:rPr>
-        <w:t>funciones = ["Autenticación", "Procesamiento de datos", "Generación de reportes"]</w:t>
-      </w:r>
-    </w:p>
-    <w:p>
-      <w:pPr>
-        <w:rPr>
-          <w:sz w:val="24"/>
-          <w:szCs w:val="24"/>
-        </w:rPr>
-      </w:pPr>
-    </w:p>
-    <w:p>
-      <w:pPr>
-        <w:rPr>
-          <w:sz w:val="24"/>
-          <w:szCs w:val="24"/>
-        </w:rPr>
-      </w:pPr>
-      <w:proofErr w:type="gramStart"/>
-      <w:r>
-        <w:rPr>
-          <w:sz w:val="24"/>
-          <w:szCs w:val="24"/>
-        </w:rPr>
-        <w:t>print(</w:t>
-      </w:r>
-      <w:proofErr w:type="gramEnd"/>
-      <w:r>
-        <w:rPr>
-          <w:sz w:val="24"/>
-          <w:szCs w:val="24"/>
-        </w:rPr>
-        <w:t>"\n</w:t>
-      </w:r>
-      <w:r>
-        <w:rPr>
-          <w:rFonts w:ascii="Segoe UI Emoji" w:hAnsi="Segoe UI Emoji" w:cs="Segoe UI Emoji"/>
-          <w:sz w:val="24"/>
-          <w:szCs w:val="24"/>
-        </w:rPr>
-        <w:t>📌</w:t>
-      </w:r>
-      <w:r>
-        <w:rPr>
-          <w:sz w:val="24"/>
-          <w:szCs w:val="24"/>
-        </w:rPr>
-        <w:t xml:space="preserve"> Tiempo promedio de ejecución por función (fila de M):")</w:t>
-      </w:r>
-    </w:p>
-    <w:p>
-      <w:pPr>
-        <w:rPr>
-          <w:sz w:val="24"/>
-          <w:szCs w:val="24"/>
-        </w:rPr>
-      </w:pPr>
-      <w:r>
-        <w:rPr>
-          <w:sz w:val="24"/>
-          <w:szCs w:val="24"/>
-        </w:rPr>
-        <w:t xml:space="preserve">for </w:t>
-      </w:r>
-      <w:proofErr w:type="spellStart"/>
-      <w:r>
-        <w:rPr>
-          <w:sz w:val="24"/>
-          <w:szCs w:val="24"/>
-        </w:rPr>
-        <w:t>i</w:t>
-      </w:r>
-      <w:proofErr w:type="spellEnd"/>
-      <w:r>
-        <w:rPr>
-          <w:sz w:val="24"/>
-          <w:szCs w:val="24"/>
-        </w:rPr>
-        <w:t xml:space="preserve"> in range(filas):</w:t>
-      </w:r>
-    </w:p>
-    <w:p>
-      <w:pPr>
-        <w:rPr>
-          <w:sz w:val="24"/>
-          <w:szCs w:val="24"/>
-        </w:rPr>
-      </w:pPr>
-      <w:r>
-        <w:rPr>
-          <w:sz w:val="24"/>
-          <w:szCs w:val="24"/>
-        </w:rPr>
-        <w:t xml:space="preserve">    suma = 0</w:t>
-      </w:r>
-    </w:p>
-    <w:p>
-      <w:pPr>
-        <w:rPr>
-          <w:sz w:val="24"/>
-          <w:szCs w:val="24"/>
-        </w:rPr>
-      </w:pPr>
-      <w:r>
-        <w:rPr>
-          <w:sz w:val="24"/>
-          <w:szCs w:val="24"/>
-        </w:rPr>
-        <w:t xml:space="preserve">    for j in range(columnas):</w:t>
-      </w:r>
-    </w:p>
-    <w:p>
-      <w:pPr>
-        <w:rPr>
-          <w:sz w:val="24"/>
-          <w:szCs w:val="24"/>
-        </w:rPr>
-      </w:pPr>
-      <w:r>
-        <w:rPr>
-          <w:sz w:val="24"/>
-          <w:szCs w:val="24"/>
-        </w:rPr>
-        <w:t xml:space="preserve">        suma += M[</w:t>
-      </w:r>
-      <w:proofErr w:type="spellStart"/>
-      <w:r>
-        <w:rPr>
-          <w:sz w:val="24"/>
-          <w:szCs w:val="24"/>
-        </w:rPr>
-        <w:t>i</w:t>
-      </w:r>
-      <w:proofErr w:type="spellEnd"/>
-      <w:r>
-        <w:rPr>
-          <w:sz w:val="24"/>
-          <w:szCs w:val="24"/>
-        </w:rPr>
-        <w:t>][j]</w:t>
-      </w:r>
-    </w:p>
-    <w:p>
-      <w:pPr>
-        <w:rPr>
-          <w:sz w:val="24"/>
-          <w:szCs w:val="24"/>
-        </w:rPr>
-      </w:pPr>
-      <w:r>
-        <w:rPr>
-          <w:sz w:val="24"/>
-          <w:szCs w:val="24"/>
-        </w:rPr>
-        <w:t xml:space="preserve">    promedio = suma / columnas</w:t>
-      </w:r>
-    </w:p>
-    <w:p>
-      <w:pPr>
-        <w:rPr>
-          <w:sz w:val="24"/>
-          <w:szCs w:val="24"/>
-        </w:rPr>
-      </w:pPr>
-      <w:r>
-        <w:rPr>
-          <w:sz w:val="24"/>
-          <w:szCs w:val="24"/>
-        </w:rPr>
-        <w:t xml:space="preserve">    </w:t>
-      </w:r>
-      <w:proofErr w:type="gramStart"/>
-      <w:r>
-        <w:rPr>
-          <w:sz w:val="24"/>
-          <w:szCs w:val="24"/>
-        </w:rPr>
-        <w:t>print(</w:t>
-      </w:r>
-      <w:proofErr w:type="gramEnd"/>
-      <w:r>
-        <w:rPr>
-          <w:sz w:val="24"/>
-          <w:szCs w:val="24"/>
-        </w:rPr>
-        <w:t>f</w:t>
-      </w:r>
-      <w:proofErr w:type="gramStart"/>
-      <w:r>
-        <w:rPr>
-          <w:sz w:val="24"/>
-          <w:szCs w:val="24"/>
-        </w:rPr>
-        <w:t>"  {</w:t>
-      </w:r>
-      <w:proofErr w:type="gramEnd"/>
-      <w:r>
-        <w:rPr>
-          <w:sz w:val="24"/>
-          <w:szCs w:val="24"/>
-        </w:rPr>
-        <w:t>funciones[</w:t>
-      </w:r>
-      <w:proofErr w:type="spellStart"/>
-      <w:r>
-        <w:rPr>
-          <w:sz w:val="24"/>
-          <w:szCs w:val="24"/>
-        </w:rPr>
-        <w:t>i</w:t>
-      </w:r>
-      <w:proofErr w:type="spellEnd"/>
-      <w:r>
-        <w:rPr>
-          <w:sz w:val="24"/>
-          <w:szCs w:val="24"/>
-        </w:rPr>
-        <w:t xml:space="preserve">]}: {promedio:.2f} </w:t>
-      </w:r>
-      <w:proofErr w:type="spellStart"/>
-      <w:r>
-        <w:rPr>
-          <w:sz w:val="24"/>
-          <w:szCs w:val="24"/>
-        </w:rPr>
-        <w:t>ms</w:t>
-      </w:r>
-      <w:proofErr w:type="spellEnd"/>
-      <w:r>
-        <w:rPr>
-          <w:sz w:val="24"/>
-          <w:szCs w:val="24"/>
-        </w:rPr>
-        <w:t>")</w:t>
-      </w:r>
-    </w:p>
-    <w:p>
-      <w:pPr>
-        <w:rPr>
-          <w:sz w:val="24"/>
-          <w:szCs w:val="24"/>
-        </w:rPr>
-      </w:pPr>
-    </w:p>
-    <w:p>
-      <w:pPr>
-        <w:rPr>
-          <w:sz w:val="24"/>
-          <w:szCs w:val="24"/>
-        </w:rPr>
-      </w:pPr>
-      <w:r>
-        <w:rPr>
-          <w:sz w:val="24"/>
-          <w:szCs w:val="24"/>
-        </w:rPr>
-        <w:t># -- Tiempo promedio por SERVIDOR (promedio de cada columna de M) --</w:t>
-      </w:r>
-    </w:p>
-    <w:p>
-      <w:pPr>
-        <w:rPr>
-          <w:sz w:val="24"/>
-          <w:szCs w:val="24"/>
-        </w:rPr>
-      </w:pPr>
-      <w:r>
-        <w:rPr>
-          <w:sz w:val="24"/>
-          <w:szCs w:val="24"/>
-        </w:rPr>
-        <w:t>servidores = ["Servidor 1", "Servidor 2", "Servidor 3"]</w:t>
-      </w:r>
-    </w:p>
-    <w:p>
-      <w:pPr>
-        <w:rPr>
-          <w:sz w:val="24"/>
-          <w:szCs w:val="24"/>
-        </w:rPr>
-      </w:pPr>
-    </w:p>
-    <w:p>
-      <w:pPr>
-        <w:rPr>
-          <w:sz w:val="24"/>
-          <w:szCs w:val="24"/>
-        </w:rPr>
-      </w:pPr>
-      <w:proofErr w:type="gramStart"/>
-      <w:r>
-        <w:rPr>
-          <w:sz w:val="24"/>
-          <w:szCs w:val="24"/>
-        </w:rPr>
-        <w:t>print(</w:t>
-      </w:r>
-      <w:proofErr w:type="gramEnd"/>
-      <w:r>
-        <w:rPr>
-          <w:sz w:val="24"/>
-          <w:szCs w:val="24"/>
-        </w:rPr>
-        <w:t>"\n</w:t>
-      </w:r>
-      <w:r>
-        <w:rPr>
-          <w:rFonts w:ascii="Segoe UI Emoji" w:hAnsi="Segoe UI Emoji" w:cs="Segoe UI Emoji"/>
-          <w:sz w:val="24"/>
-          <w:szCs w:val="24"/>
-        </w:rPr>
-        <w:t>📌</w:t>
-      </w:r>
-      <w:r>
-        <w:rPr>
-          <w:sz w:val="24"/>
-          <w:szCs w:val="24"/>
-        </w:rPr>
-        <w:t xml:space="preserve"> Tiempo promedio de ejecución por servidor (columna de M):")</w:t>
-      </w:r>
-    </w:p>
-    <w:p>
-      <w:pPr>
-        <w:rPr>
-          <w:sz w:val="24"/>
-          <w:szCs w:val="24"/>
-        </w:rPr>
-      </w:pPr>
-      <w:r>
-        <w:rPr>
-          <w:sz w:val="24"/>
-          <w:szCs w:val="24"/>
-        </w:rPr>
-        <w:t>for j in range(columnas):</w:t>
-      </w:r>
-    </w:p>
-    <w:p>
-      <w:pPr>
-        <w:rPr>
-          <w:sz w:val="24"/>
-          <w:szCs w:val="24"/>
-        </w:rPr>
-      </w:pPr>
-      <w:r>
-        <w:rPr>
-          <w:sz w:val="24"/>
-          <w:szCs w:val="24"/>
-        </w:rPr>
-        <w:t xml:space="preserve">    suma = 0</w:t>
-      </w:r>
-    </w:p>
-    <w:p>
-      <w:pPr>
-        <w:rPr>
-          <w:sz w:val="24"/>
-          <w:szCs w:val="24"/>
-        </w:rPr>
-      </w:pPr>
-      <w:r>
-        <w:rPr>
-          <w:sz w:val="24"/>
-          <w:szCs w:val="24"/>
-        </w:rPr>
-        <w:lastRenderedPageBreak/>
-        <w:t xml:space="preserve">    for </w:t>
-      </w:r>
-      <w:proofErr w:type="spellStart"/>
-      <w:r>
-        <w:rPr>
-          <w:sz w:val="24"/>
-          <w:szCs w:val="24"/>
-        </w:rPr>
-        <w:t>i</w:t>
-      </w:r>
-      <w:proofErr w:type="spellEnd"/>
-      <w:r>
-        <w:rPr>
-          <w:sz w:val="24"/>
-          <w:szCs w:val="24"/>
-        </w:rPr>
-        <w:t xml:space="preserve"> in range(filas):</w:t>
-      </w:r>
-    </w:p>
-    <w:p>
-      <w:pPr>
-        <w:rPr>
-          <w:sz w:val="24"/>
-          <w:szCs w:val="24"/>
-        </w:rPr>
-      </w:pPr>
-      <w:r>
-        <w:rPr>
-          <w:sz w:val="24"/>
-          <w:szCs w:val="24"/>
-        </w:rPr>
-        <w:t xml:space="preserve">        suma += M[</w:t>
-      </w:r>
-      <w:proofErr w:type="spellStart"/>
-      <w:r>
-        <w:rPr>
-          <w:sz w:val="24"/>
-          <w:szCs w:val="24"/>
-        </w:rPr>
-        <w:t>i</w:t>
-      </w:r>
-      <w:proofErr w:type="spellEnd"/>
-      <w:r>
-        <w:rPr>
-          <w:sz w:val="24"/>
-          <w:szCs w:val="24"/>
-        </w:rPr>
-        <w:t>][j]</w:t>
-      </w:r>
-    </w:p>
-    <w:p>
-      <w:pPr>
-        <w:rPr>
-          <w:sz w:val="24"/>
-          <w:szCs w:val="24"/>
-        </w:rPr>
-      </w:pPr>
-      <w:r>
-        <w:rPr>
-          <w:sz w:val="24"/>
-          <w:szCs w:val="24"/>
-        </w:rPr>
-        <w:t xml:space="preserve">    promedio = suma / filas</w:t>
-      </w:r>
-    </w:p>
-    <w:p>
-      <w:pPr>
-        <w:rPr>
-          <w:sz w:val="24"/>
-          <w:szCs w:val="24"/>
-        </w:rPr>
-      </w:pPr>
-      <w:r>
-        <w:rPr>
-          <w:sz w:val="24"/>
-          <w:szCs w:val="24"/>
-        </w:rPr>
-        <w:t xml:space="preserve">    </w:t>
-      </w:r>
-      <w:proofErr w:type="gramStart"/>
-      <w:r>
-        <w:rPr>
-          <w:sz w:val="24"/>
-          <w:szCs w:val="24"/>
-        </w:rPr>
-        <w:t>print(</w:t>
-      </w:r>
-      <w:proofErr w:type="gramEnd"/>
-      <w:r>
-        <w:rPr>
-          <w:sz w:val="24"/>
-          <w:szCs w:val="24"/>
-        </w:rPr>
-        <w:t>f</w:t>
-      </w:r>
-      <w:proofErr w:type="gramStart"/>
-      <w:r>
-        <w:rPr>
-          <w:sz w:val="24"/>
-          <w:szCs w:val="24"/>
-        </w:rPr>
-        <w:t>"  {</w:t>
-      </w:r>
-      <w:proofErr w:type="gramEnd"/>
-      <w:r>
-        <w:rPr>
-          <w:sz w:val="24"/>
-          <w:szCs w:val="24"/>
-        </w:rPr>
-        <w:t xml:space="preserve">servidores[j]}: {promedio:.2f} </w:t>
-      </w:r>
-      <w:proofErr w:type="spellStart"/>
-      <w:r>
-        <w:rPr>
-          <w:sz w:val="24"/>
-          <w:szCs w:val="24"/>
-        </w:rPr>
-        <w:t>ms</w:t>
-      </w:r>
-      <w:proofErr w:type="spellEnd"/>
-      <w:r>
-        <w:rPr>
-          <w:sz w:val="24"/>
-          <w:szCs w:val="24"/>
-        </w:rPr>
-        <w:t>")</w:t>
-      </w:r>
-    </w:p>
-    <w:p>
-      <w:pPr>
-        <w:rPr>
-          <w:sz w:val="24"/>
-          <w:szCs w:val="24"/>
-        </w:rPr>
-      </w:pPr>
-    </w:p>
-    <w:p>
-      <w:pPr>
-        <w:rPr>
-          <w:sz w:val="24"/>
-          <w:szCs w:val="24"/>
-        </w:rPr>
-      </w:pPr>
-      <w:r>
-        <w:rPr>
-          <w:sz w:val="24"/>
-          <w:szCs w:val="24"/>
-        </w:rPr>
-        <w:t># ============================================================</w:t>
-      </w:r>
-    </w:p>
-    <w:p>
-      <w:pPr>
-        <w:rPr>
-          <w:sz w:val="24"/>
-          <w:szCs w:val="24"/>
-        </w:rPr>
-      </w:pPr>
-      <w:r>
-        <w:rPr>
-          <w:sz w:val="24"/>
-          <w:szCs w:val="24"/>
-        </w:rPr>
-        <w:t># PARTE B - Punto 4: Transpuesta de M</w:t>
-      </w:r>
-    </w:p>
-    <w:p>
-      <w:pPr>
-        <w:rPr>
-          <w:sz w:val="24"/>
-          <w:szCs w:val="24"/>
-        </w:rPr>
-      </w:pPr>
-      <w:r>
-        <w:rPr>
-          <w:sz w:val="24"/>
-          <w:szCs w:val="24"/>
-        </w:rPr>
-        <w:t># ============================================================</w:t>
-      </w:r>
-    </w:p>
-    <w:p>
-      <w:pPr>
-        <w:rPr>
-          <w:sz w:val="24"/>
-          <w:szCs w:val="24"/>
-        </w:rPr>
-      </w:pPr>
-    </w:p>
-    <w:p>
-      <w:pPr>
-        <w:rPr>
-          <w:sz w:val="24"/>
-          <w:szCs w:val="24"/>
-        </w:rPr>
-      </w:pPr>
-      <w:proofErr w:type="gramStart"/>
-      <w:r>
-        <w:rPr>
-          <w:sz w:val="24"/>
-          <w:szCs w:val="24"/>
-        </w:rPr>
-        <w:t>print(</w:t>
-      </w:r>
-      <w:proofErr w:type="gramEnd"/>
-      <w:r>
-        <w:rPr>
-          <w:sz w:val="24"/>
-          <w:szCs w:val="24"/>
-        </w:rPr>
-        <w:t>"\n" + "=" * 55)</w:t>
-      </w:r>
-    </w:p>
-    <w:p>
-      <w:pPr>
-        <w:rPr>
-          <w:sz w:val="24"/>
-          <w:szCs w:val="24"/>
-        </w:rPr>
-      </w:pPr>
-      <w:proofErr w:type="gramStart"/>
-      <w:r>
-        <w:rPr>
-          <w:sz w:val="24"/>
-          <w:szCs w:val="24"/>
-        </w:rPr>
-        <w:t>print("  PARTE</w:t>
-      </w:r>
-      <w:proofErr w:type="gramEnd"/>
-      <w:r>
-        <w:rPr>
-          <w:sz w:val="24"/>
-          <w:szCs w:val="24"/>
-        </w:rPr>
-        <w:t xml:space="preserve"> B — Transpuesta de M")</w:t>
-      </w:r>
-    </w:p>
-    <w:p>
-      <w:pPr>
-        <w:rPr>
-          <w:sz w:val="24"/>
-          <w:szCs w:val="24"/>
-        </w:rPr>
-      </w:pPr>
-      <w:proofErr w:type="gramStart"/>
-      <w:r>
-        <w:rPr>
-          <w:sz w:val="24"/>
-          <w:szCs w:val="24"/>
-        </w:rPr>
         <w:t>print(</w:t>
       </w:r>
       <w:proofErr w:type="gramEnd"/>
@@ -6464,225 +7048,225 @@
           <w:sz w:val="24"/>
           <w:szCs w:val="24"/>
         </w:rPr>
+        <w:t xml:space="preserve">   En M^T:        filas = servidores, columnas = funciones.</w:t>
+      </w:r>
+    </w:p>
+    <w:p>
+      <w:pPr>
+        <w:rPr>
+          <w:sz w:val="24"/>
+          <w:szCs w:val="24"/>
+        </w:rPr>
+      </w:pPr>
+      <w:r>
+        <w:rPr>
+          <w:sz w:val="24"/>
+          <w:szCs w:val="24"/>
+        </w:rPr>
+        <w:t xml:space="preserve">   Es decir, M^T nos permite analizar, para cada servidor,</w:t>
+      </w:r>
+    </w:p>
+    <w:p>
+      <w:pPr>
+        <w:rPr>
+          <w:sz w:val="24"/>
+          <w:szCs w:val="24"/>
+        </w:rPr>
+      </w:pPr>
+      <w:r>
+        <w:rPr>
+          <w:sz w:val="24"/>
+          <w:szCs w:val="24"/>
+        </w:rPr>
+        <w:t xml:space="preserve">   </w:t>
+      </w:r>
+      <w:proofErr w:type="spellStart"/>
+      <w:r>
+        <w:rPr>
+          <w:sz w:val="24"/>
+          <w:szCs w:val="24"/>
+        </w:rPr>
+        <w:t>cuánto</w:t>
+      </w:r>
+      <w:proofErr w:type="spellEnd"/>
+      <w:r>
+        <w:rPr>
+          <w:sz w:val="24"/>
+          <w:szCs w:val="24"/>
+        </w:rPr>
+        <w:t xml:space="preserve"> </w:t>
+      </w:r>
+      <w:proofErr w:type="spellStart"/>
+      <w:r>
+        <w:rPr>
+          <w:sz w:val="24"/>
+          <w:szCs w:val="24"/>
+        </w:rPr>
+        <w:t>tarda</w:t>
+      </w:r>
+      <w:proofErr w:type="spellEnd"/>
+      <w:r>
+        <w:rPr>
+          <w:sz w:val="24"/>
+          <w:szCs w:val="24"/>
+        </w:rPr>
+        <w:t xml:space="preserve"> en </w:t>
+      </w:r>
+      <w:proofErr w:type="spellStart"/>
+      <w:r>
+        <w:rPr>
+          <w:sz w:val="24"/>
+          <w:szCs w:val="24"/>
+        </w:rPr>
+        <w:t>ejecutar</w:t>
+      </w:r>
+      <w:proofErr w:type="spellEnd"/>
+      <w:r>
+        <w:rPr>
+          <w:sz w:val="24"/>
+          <w:szCs w:val="24"/>
+        </w:rPr>
+        <w:t xml:space="preserve"> cada función.</w:t>
+      </w:r>
+    </w:p>
+    <w:p>
+      <w:pPr>
+        <w:rPr>
+          <w:sz w:val="24"/>
+          <w:szCs w:val="24"/>
+        </w:rPr>
+      </w:pPr>
+      <w:r>
+        <w:rPr>
+          <w:sz w:val="24"/>
+          <w:szCs w:val="24"/>
+        </w:rPr>
+        <w:t>""")</w:t>
+      </w:r>
+    </w:p>
+    <w:p>
+      <w:pPr>
+        <w:rPr>
+          <w:sz w:val="24"/>
+          <w:szCs w:val="24"/>
+        </w:rPr>
+      </w:pPr>
+    </w:p>
+    <w:p>
+      <w:pPr>
+        <w:rPr>
+          <w:sz w:val="24"/>
+          <w:szCs w:val="24"/>
+        </w:rPr>
+      </w:pPr>
+      <w:r>
+        <w:rPr>
+          <w:sz w:val="24"/>
+          <w:szCs w:val="24"/>
+        </w:rPr>
+        <w:t># ============================================================</w:t>
+      </w:r>
+    </w:p>
+    <w:p>
+      <w:pPr>
+        <w:rPr>
+          <w:sz w:val="24"/>
+          <w:szCs w:val="24"/>
+        </w:rPr>
+      </w:pPr>
+      <w:r>
+        <w:rPr>
+          <w:sz w:val="24"/>
+          <w:szCs w:val="24"/>
+        </w:rPr>
+        <w:t># PARTE C - Punto 5: Producto T = M * C</w:t>
+      </w:r>
+    </w:p>
+    <w:p>
+      <w:pPr>
+        <w:rPr>
+          <w:sz w:val="24"/>
+          <w:szCs w:val="24"/>
+        </w:rPr>
+      </w:pPr>
+      <w:r>
+        <w:rPr>
+          <w:sz w:val="24"/>
+          <w:szCs w:val="24"/>
+        </w:rPr>
+        <w:t># ============================================================</w:t>
+      </w:r>
+    </w:p>
+    <w:p>
+      <w:pPr>
+        <w:rPr>
+          <w:sz w:val="24"/>
+          <w:szCs w:val="24"/>
+        </w:rPr>
+      </w:pPr>
+    </w:p>
+    <w:p>
+      <w:pPr>
+        <w:rPr>
+          <w:sz w:val="24"/>
+          <w:szCs w:val="24"/>
+        </w:rPr>
+      </w:pPr>
+      <w:proofErr w:type="gramStart"/>
+      <w:r>
+        <w:rPr>
+          <w:sz w:val="24"/>
+          <w:szCs w:val="24"/>
+        </w:rPr>
+        <w:t>print(</w:t>
+      </w:r>
+      <w:proofErr w:type="gramEnd"/>
+      <w:r>
+        <w:rPr>
+          <w:sz w:val="24"/>
+          <w:szCs w:val="24"/>
+        </w:rPr>
+        <w:t>"=" * 55)</w:t>
+      </w:r>
+    </w:p>
+    <w:p>
+      <w:pPr>
+        <w:rPr>
+          <w:sz w:val="24"/>
+          <w:szCs w:val="24"/>
+        </w:rPr>
+      </w:pPr>
+      <w:proofErr w:type="gramStart"/>
+      <w:r>
+        <w:rPr>
+          <w:sz w:val="24"/>
+          <w:szCs w:val="24"/>
+        </w:rPr>
+        <w:t>print("  PARTE</w:t>
+      </w:r>
+      <w:proofErr w:type="gramEnd"/>
+      <w:r>
+        <w:rPr>
+          <w:sz w:val="24"/>
+          <w:szCs w:val="24"/>
+        </w:rPr>
+        <w:t xml:space="preserve"> C — Producto matricial T = M * C")</w:t>
+      </w:r>
+    </w:p>
+    <w:p>
+      <w:pPr>
+        <w:rPr>
+          <w:sz w:val="24"/>
+          <w:szCs w:val="24"/>
+        </w:rPr>
+      </w:pPr>
+      <w:proofErr w:type="gramStart"/>
+      <w:r>
+        <w:rPr>
+          <w:sz w:val="24"/>
+          <w:szCs w:val="24"/>
+        </w:rPr>
         <w:lastRenderedPageBreak/>
-        <w:t xml:space="preserve">   En M^T:        filas = servidores, columnas = funciones.</w:t>
-      </w:r>
-    </w:p>
-    <w:p>
-      <w:pPr>
-        <w:rPr>
-          <w:sz w:val="24"/>
-          <w:szCs w:val="24"/>
-        </w:rPr>
-      </w:pPr>
-      <w:r>
-        <w:rPr>
-          <w:sz w:val="24"/>
-          <w:szCs w:val="24"/>
-        </w:rPr>
-        <w:t xml:space="preserve">   Es decir, M^T nos permite analizar, para cada servidor,</w:t>
-      </w:r>
-    </w:p>
-    <w:p>
-      <w:pPr>
-        <w:rPr>
-          <w:sz w:val="24"/>
-          <w:szCs w:val="24"/>
-        </w:rPr>
-      </w:pPr>
-      <w:r>
-        <w:rPr>
-          <w:sz w:val="24"/>
-          <w:szCs w:val="24"/>
-        </w:rPr>
-        <w:t xml:space="preserve">   </w:t>
-      </w:r>
-      <w:proofErr w:type="spellStart"/>
-      <w:r>
-        <w:rPr>
-          <w:sz w:val="24"/>
-          <w:szCs w:val="24"/>
-        </w:rPr>
-        <w:t>cuánto</w:t>
-      </w:r>
-      <w:proofErr w:type="spellEnd"/>
-      <w:r>
-        <w:rPr>
-          <w:sz w:val="24"/>
-          <w:szCs w:val="24"/>
-        </w:rPr>
-        <w:t xml:space="preserve"> </w:t>
-      </w:r>
-      <w:proofErr w:type="spellStart"/>
-      <w:r>
-        <w:rPr>
-          <w:sz w:val="24"/>
-          <w:szCs w:val="24"/>
-        </w:rPr>
-        <w:t>tarda</w:t>
-      </w:r>
-      <w:proofErr w:type="spellEnd"/>
-      <w:r>
-        <w:rPr>
-          <w:sz w:val="24"/>
-          <w:szCs w:val="24"/>
-        </w:rPr>
-        <w:t xml:space="preserve"> en </w:t>
-      </w:r>
-      <w:proofErr w:type="spellStart"/>
-      <w:r>
-        <w:rPr>
-          <w:sz w:val="24"/>
-          <w:szCs w:val="24"/>
-        </w:rPr>
-        <w:t>ejecutar</w:t>
-      </w:r>
-      <w:proofErr w:type="spellEnd"/>
-      <w:r>
-        <w:rPr>
-          <w:sz w:val="24"/>
-          <w:szCs w:val="24"/>
-        </w:rPr>
-        <w:t xml:space="preserve"> cada función.</w:t>
-      </w:r>
-    </w:p>
-    <w:p>
-      <w:pPr>
-        <w:rPr>
-          <w:sz w:val="24"/>
-          <w:szCs w:val="24"/>
-        </w:rPr>
-      </w:pPr>
-      <w:r>
-        <w:rPr>
-          <w:sz w:val="24"/>
-          <w:szCs w:val="24"/>
-        </w:rPr>
-        <w:t>""")</w:t>
-      </w:r>
-    </w:p>
-    <w:p>
-      <w:pPr>
-        <w:rPr>
-          <w:sz w:val="24"/>
-          <w:szCs w:val="24"/>
-        </w:rPr>
-      </w:pPr>
-    </w:p>
-    <w:p>
-      <w:pPr>
-        <w:rPr>
-          <w:sz w:val="24"/>
-          <w:szCs w:val="24"/>
-        </w:rPr>
-      </w:pPr>
-      <w:r>
-        <w:rPr>
-          <w:sz w:val="24"/>
-          <w:szCs w:val="24"/>
-        </w:rPr>
-        <w:t># ============================================================</w:t>
-      </w:r>
-    </w:p>
-    <w:p>
-      <w:pPr>
-        <w:rPr>
-          <w:sz w:val="24"/>
-          <w:szCs w:val="24"/>
-        </w:rPr>
-      </w:pPr>
-      <w:r>
-        <w:rPr>
-          <w:sz w:val="24"/>
-          <w:szCs w:val="24"/>
-        </w:rPr>
-        <w:t># PARTE C - Punto 5: Producto T = M * C</w:t>
-      </w:r>
-    </w:p>
-    <w:p>
-      <w:pPr>
-        <w:rPr>
-          <w:sz w:val="24"/>
-          <w:szCs w:val="24"/>
-        </w:rPr>
-      </w:pPr>
-      <w:r>
-        <w:rPr>
-          <w:sz w:val="24"/>
-          <w:szCs w:val="24"/>
-        </w:rPr>
-        <w:t># ============================================================</w:t>
-      </w:r>
-    </w:p>
-    <w:p>
-      <w:pPr>
-        <w:rPr>
-          <w:sz w:val="24"/>
-          <w:szCs w:val="24"/>
-        </w:rPr>
-      </w:pPr>
-    </w:p>
-    <w:p>
-      <w:pPr>
-        <w:rPr>
-          <w:sz w:val="24"/>
-          <w:szCs w:val="24"/>
-        </w:rPr>
-      </w:pPr>
-      <w:proofErr w:type="gramStart"/>
-      <w:r>
-        <w:rPr>
-          <w:sz w:val="24"/>
-          <w:szCs w:val="24"/>
-        </w:rPr>
-        <w:t>print(</w:t>
-      </w:r>
-      <w:proofErr w:type="gramEnd"/>
-      <w:r>
-        <w:rPr>
-          <w:sz w:val="24"/>
-          <w:szCs w:val="24"/>
-        </w:rPr>
-        <w:t>"=" * 55)</w:t>
-      </w:r>
-    </w:p>
-    <w:p>
-      <w:pPr>
-        <w:rPr>
-          <w:sz w:val="24"/>
-          <w:szCs w:val="24"/>
-        </w:rPr>
-      </w:pPr>
-      <w:proofErr w:type="gramStart"/>
-      <w:r>
-        <w:rPr>
-          <w:sz w:val="24"/>
-          <w:szCs w:val="24"/>
-        </w:rPr>
-        <w:t>print("  PARTE</w:t>
-      </w:r>
-      <w:proofErr w:type="gramEnd"/>
-      <w:r>
-        <w:rPr>
-          <w:sz w:val="24"/>
-          <w:szCs w:val="24"/>
-        </w:rPr>
-        <w:t xml:space="preserve"> C — Producto matricial T = M * C")</w:t>
-      </w:r>
-    </w:p>
-    <w:p>
-      <w:pPr>
-        <w:rPr>
-          <w:sz w:val="24"/>
-          <w:szCs w:val="24"/>
-        </w:rPr>
-      </w:pPr>
-      <w:proofErr w:type="gramStart"/>
-      <w:r>
-        <w:rPr>
-          <w:sz w:val="24"/>
-          <w:szCs w:val="24"/>
-        </w:rPr>
         <w:t>print(</w:t>
       </w:r>
       <w:proofErr w:type="gramEnd"/>
@@ -7035,7 +7619,6 @@
           <w:sz w:val="24"/>
           <w:szCs w:val="24"/>
         </w:rPr>
-        <w:lastRenderedPageBreak/>
         <w:t>print(</w:t>
       </w:r>
       <w:proofErr w:type="gramEnd"/>
@@ -7192,17 +7775,8 @@
           <w:sz w:val="24"/>
           <w:szCs w:val="24"/>
         </w:rPr>
-        <w:t xml:space="preserve"> que se </w:t>
-      </w:r>
-      <w:proofErr w:type="spellStart"/>
-      <w:r>
-        <w:rPr>
-          <w:sz w:val="24"/>
-          <w:szCs w:val="24"/>
-        </w:rPr>
-        <w:t>ejecutó</w:t>
-      </w:r>
-      <w:proofErr w:type="spellEnd"/>
+        <w:t xml:space="preserve"> que se ejecutó</w:t>
+      </w:r>
     </w:p>
     <w:p>
       <w:pPr>

</xml_diff>